<commit_message>
add option "Don't expand character spaces on a line that ends with SHIFT-RETURN" agar justify nya stabil
</commit_message>
<xml_diff>
--- a/public/backup-templates/laporan_kegiatan.docx
+++ b/public/backup-templates/laporan_kegiatan.docx
@@ -173,7 +173,25 @@
           <w:b/>
           <w:sz w:val="32"/>
         </w:rPr>
-        <w:t>${activity_name_uppercase}</w:t>
+        <w:t>${</w:t>
+      </w:r>
+      <w:proofErr w:type="spellStart"/>
+      <w:r>
+        <w:rPr>
+          <w:rFonts w:ascii="Arial"/>
+          <w:b/>
+          <w:sz w:val="32"/>
+        </w:rPr>
+        <w:t>activity_name_uppercase</w:t>
+      </w:r>
+      <w:proofErr w:type="spellEnd"/>
+      <w:r>
+        <w:rPr>
+          <w:rFonts w:ascii="Arial"/>
+          <w:b/>
+          <w:sz w:val="32"/>
+        </w:rPr>
+        <w:t>}</w:t>
       </w:r>
     </w:p>
     <w:p>
@@ -427,8 +445,9 @@
           <w:sz w:val="28"/>
           <w:szCs w:val="28"/>
         </w:rPr>
-        <w:t>${d</w:t>
-      </w:r>
+        <w:t>${</w:t>
+      </w:r>
+      <w:proofErr w:type="spellStart"/>
       <w:r>
         <w:rPr>
           <w:rFonts w:asciiTheme="minorBidi" w:hAnsiTheme="minorBidi"/>
@@ -436,7 +455,26 @@
           <w:sz w:val="28"/>
           <w:szCs w:val="28"/>
         </w:rPr>
-        <w:t>epartment_name_uppercase}</w:t>
+        <w:t>d</w:t>
+      </w:r>
+      <w:r>
+        <w:rPr>
+          <w:rFonts w:asciiTheme="minorBidi" w:hAnsiTheme="minorBidi"/>
+          <w:b/>
+          <w:sz w:val="28"/>
+          <w:szCs w:val="28"/>
+        </w:rPr>
+        <w:t>epartment_name_uppercase</w:t>
+      </w:r>
+      <w:proofErr w:type="spellEnd"/>
+      <w:r>
+        <w:rPr>
+          <w:rFonts w:asciiTheme="minorBidi" w:hAnsiTheme="minorBidi"/>
+          <w:b/>
+          <w:sz w:val="28"/>
+          <w:szCs w:val="28"/>
+        </w:rPr>
+        <w:t>}</w:t>
       </w:r>
       <w:r>
         <w:rPr>
@@ -597,7 +635,27 @@
           <w:sz w:val="28"/>
           <w:szCs w:val="28"/>
         </w:rPr>
-        <w:t>${current_year}</w:t>
+        <w:t>${</w:t>
+      </w:r>
+      <w:proofErr w:type="spellStart"/>
+      <w:r>
+        <w:rPr>
+          <w:rFonts w:asciiTheme="minorBidi" w:hAnsiTheme="minorBidi"/>
+          <w:b/>
+          <w:sz w:val="28"/>
+          <w:szCs w:val="28"/>
+        </w:rPr>
+        <w:t>current_year</w:t>
+      </w:r>
+      <w:proofErr w:type="spellEnd"/>
+      <w:r>
+        <w:rPr>
+          <w:rFonts w:asciiTheme="minorBidi" w:hAnsiTheme="minorBidi"/>
+          <w:b/>
+          <w:sz w:val="28"/>
+          <w:szCs w:val="28"/>
+        </w:rPr>
+        <w:t>}</w:t>
       </w:r>
     </w:p>
     <w:p>
@@ -743,7 +801,21 @@
               <w:rPr>
                 <w:sz w:val="20"/>
               </w:rPr>
-              <w:t>${signed_barcode}</w:t>
+              <w:t>${</w:t>
+            </w:r>
+            <w:proofErr w:type="spellStart"/>
+            <w:r>
+              <w:rPr>
+                <w:sz w:val="20"/>
+              </w:rPr>
+              <w:t>signed_barcode</w:t>
+            </w:r>
+            <w:proofErr w:type="spellEnd"/>
+            <w:r>
+              <w:rPr>
+                <w:sz w:val="20"/>
+              </w:rPr>
+              <w:t>}</w:t>
             </w:r>
           </w:p>
         </w:tc>
@@ -765,7 +837,48 @@
                 <w:rFonts w:ascii="Arial MT" w:hAnsi="Arial MT"/>
                 <w:sz w:val="18"/>
               </w:rPr>
-              <w:t>${signed_location},${signed_date}</w:t>
+              <w:t>${</w:t>
+            </w:r>
+            <w:proofErr w:type="spellStart"/>
+            <w:r>
+              <w:rPr>
+                <w:rFonts w:ascii="Arial MT" w:hAnsi="Arial MT"/>
+                <w:sz w:val="18"/>
+              </w:rPr>
+              <w:t>signed_location</w:t>
+            </w:r>
+            <w:proofErr w:type="spellEnd"/>
+            <w:proofErr w:type="gramStart"/>
+            <w:r>
+              <w:rPr>
+                <w:rFonts w:ascii="Arial MT" w:hAnsi="Arial MT"/>
+                <w:sz w:val="18"/>
+              </w:rPr>
+              <w:t>},$</w:t>
+            </w:r>
+            <w:proofErr w:type="gramEnd"/>
+            <w:r>
+              <w:rPr>
+                <w:rFonts w:ascii="Arial MT" w:hAnsi="Arial MT"/>
+                <w:sz w:val="18"/>
+              </w:rPr>
+              <w:t>{</w:t>
+            </w:r>
+            <w:proofErr w:type="spellStart"/>
+            <w:r>
+              <w:rPr>
+                <w:rFonts w:ascii="Arial MT" w:hAnsi="Arial MT"/>
+                <w:sz w:val="18"/>
+              </w:rPr>
+              <w:t>signed_date</w:t>
+            </w:r>
+            <w:proofErr w:type="spellEnd"/>
+            <w:r>
+              <w:rPr>
+                <w:rFonts w:ascii="Arial MT" w:hAnsi="Arial MT"/>
+                <w:sz w:val="18"/>
+              </w:rPr>
+              <w:t>}</w:t>
             </w:r>
           </w:p>
         </w:tc>
@@ -806,7 +919,25 @@
                 <w:sz w:val="18"/>
                 <w:szCs w:val="18"/>
               </w:rPr>
-              <w:t>${signer_position}</w:t>
+              <w:t>${</w:t>
+            </w:r>
+            <w:proofErr w:type="spellStart"/>
+            <w:r>
+              <w:rPr>
+                <w:rFonts w:ascii="Arial MT" w:hAnsi="Arial MT"/>
+                <w:sz w:val="18"/>
+                <w:szCs w:val="18"/>
+              </w:rPr>
+              <w:t>signer_position</w:t>
+            </w:r>
+            <w:proofErr w:type="spellEnd"/>
+            <w:r>
+              <w:rPr>
+                <w:rFonts w:ascii="Arial MT" w:hAnsi="Arial MT"/>
+                <w:sz w:val="18"/>
+                <w:szCs w:val="18"/>
+              </w:rPr>
+              <w:t>}</w:t>
             </w:r>
           </w:p>
         </w:tc>
@@ -845,7 +976,23 @@
                 <w:rFonts w:ascii="Arial MT" w:hAnsi="Arial MT"/>
                 <w:sz w:val="18"/>
               </w:rPr>
-              <w:t>${signer_name}</w:t>
+              <w:t>${</w:t>
+            </w:r>
+            <w:proofErr w:type="spellStart"/>
+            <w:r>
+              <w:rPr>
+                <w:rFonts w:ascii="Arial MT" w:hAnsi="Arial MT"/>
+                <w:sz w:val="18"/>
+              </w:rPr>
+              <w:t>signer_name</w:t>
+            </w:r>
+            <w:proofErr w:type="spellEnd"/>
+            <w:r>
+              <w:rPr>
+                <w:rFonts w:ascii="Arial MT" w:hAnsi="Arial MT"/>
+                <w:sz w:val="18"/>
+              </w:rPr>
+              <w:t>}</w:t>
             </w:r>
           </w:p>
         </w:tc>
@@ -883,7 +1030,23 @@
                 <w:spacing w:val="-2"/>
                 <w:sz w:val="18"/>
               </w:rPr>
-              <w:t>${signed_status}</w:t>
+              <w:t>${</w:t>
+            </w:r>
+            <w:proofErr w:type="spellStart"/>
+            <w:r>
+              <w:rPr>
+                <w:spacing w:val="-2"/>
+                <w:sz w:val="18"/>
+              </w:rPr>
+              <w:t>signed_status</w:t>
+            </w:r>
+            <w:proofErr w:type="spellEnd"/>
+            <w:r>
+              <w:rPr>
+                <w:spacing w:val="-2"/>
+                <w:sz w:val="18"/>
+              </w:rPr>
+              <w:t>}</w:t>
             </w:r>
           </w:p>
         </w:tc>
@@ -1045,8 +1208,30 @@
               <w:rPr>
                 <w:rFonts w:asciiTheme="minorBidi" w:hAnsiTheme="minorBidi"/>
               </w:rPr>
-              <w:t>Halaman Judul ……………………………………………………………………………..</w:t>
-            </w:r>
+              <w:t xml:space="preserve">Halaman </w:t>
+            </w:r>
+            <w:proofErr w:type="spellStart"/>
+            <w:r>
+              <w:rPr>
+                <w:rFonts w:asciiTheme="minorBidi" w:hAnsiTheme="minorBidi"/>
+              </w:rPr>
+              <w:t>Judul</w:t>
+            </w:r>
+            <w:proofErr w:type="spellEnd"/>
+            <w:r>
+              <w:rPr>
+                <w:rFonts w:asciiTheme="minorBidi" w:hAnsiTheme="minorBidi"/>
+              </w:rPr>
+              <w:t xml:space="preserve"> …………………………………………………………………………</w:t>
+            </w:r>
+            <w:proofErr w:type="gramStart"/>
+            <w:r>
+              <w:rPr>
+                <w:rFonts w:asciiTheme="minorBidi" w:hAnsiTheme="minorBidi"/>
+              </w:rPr>
+              <w:t>…..</w:t>
+            </w:r>
+            <w:proofErr w:type="gramEnd"/>
           </w:p>
         </w:tc>
         <w:tc>
@@ -1095,7 +1280,21 @@
               <w:rPr>
                 <w:rFonts w:asciiTheme="minorBidi" w:hAnsiTheme="minorBidi"/>
               </w:rPr>
-              <w:t>Kata Pengantar …………………………………………………………………………….</w:t>
+              <w:t xml:space="preserve">Kata </w:t>
+            </w:r>
+            <w:proofErr w:type="spellStart"/>
+            <w:r>
+              <w:rPr>
+                <w:rFonts w:asciiTheme="minorBidi" w:hAnsiTheme="minorBidi"/>
+              </w:rPr>
+              <w:t>Pengantar</w:t>
+            </w:r>
+            <w:proofErr w:type="spellEnd"/>
+            <w:r>
+              <w:rPr>
+                <w:rFonts w:asciiTheme="minorBidi" w:hAnsiTheme="minorBidi"/>
+              </w:rPr>
+              <w:t xml:space="preserve"> …………………………………………………………………………….</w:t>
             </w:r>
           </w:p>
         </w:tc>
@@ -1244,6 +1443,7 @@
                 <w:rFonts w:asciiTheme="minorBidi" w:hAnsiTheme="minorBidi"/>
               </w:rPr>
             </w:pPr>
+            <w:proofErr w:type="spellStart"/>
             <w:r>
               <w:rPr>
                 <w:rFonts w:asciiTheme="minorBidi" w:hAnsiTheme="minorBidi"/>
@@ -1252,6 +1452,7 @@
               </w:rPr>
               <w:t>Pendahuluan</w:t>
             </w:r>
+            <w:proofErr w:type="spellEnd"/>
           </w:p>
         </w:tc>
         <w:tc>
@@ -1346,7 +1547,21 @@
               <w:rPr>
                 <w:rFonts w:asciiTheme="minorBidi" w:hAnsiTheme="minorBidi"/>
               </w:rPr>
-              <w:t>Latar Belakang ………………………………………………………….</w:t>
+              <w:t xml:space="preserve">Latar </w:t>
+            </w:r>
+            <w:proofErr w:type="spellStart"/>
+            <w:r>
+              <w:rPr>
+                <w:rFonts w:asciiTheme="minorBidi" w:hAnsiTheme="minorBidi"/>
+              </w:rPr>
+              <w:t>Belakang</w:t>
+            </w:r>
+            <w:proofErr w:type="spellEnd"/>
+            <w:r>
+              <w:rPr>
+                <w:rFonts w:asciiTheme="minorBidi" w:hAnsiTheme="minorBidi"/>
+              </w:rPr>
+              <w:t xml:space="preserve"> ………………………………………………………….</w:t>
             </w:r>
           </w:p>
         </w:tc>
@@ -1634,7 +1849,21 @@
               <w:rPr>
                 <w:rFonts w:asciiTheme="minorBidi" w:hAnsiTheme="minorBidi"/>
               </w:rPr>
-              <w:t>Ruang Lingkup ………………………………………………………….</w:t>
+              <w:t xml:space="preserve">Ruang </w:t>
+            </w:r>
+            <w:proofErr w:type="spellStart"/>
+            <w:r>
+              <w:rPr>
+                <w:rFonts w:asciiTheme="minorBidi" w:hAnsiTheme="minorBidi"/>
+              </w:rPr>
+              <w:t>Lingkup</w:t>
+            </w:r>
+            <w:proofErr w:type="spellEnd"/>
+            <w:r>
+              <w:rPr>
+                <w:rFonts w:asciiTheme="minorBidi" w:hAnsiTheme="minorBidi"/>
+              </w:rPr>
+              <w:t xml:space="preserve"> ………………………………………………………….</w:t>
             </w:r>
           </w:p>
         </w:tc>
@@ -1735,14 +1964,34 @@
                 <w:rFonts w:asciiTheme="minorBidi" w:hAnsiTheme="minorBidi"/>
               </w:rPr>
             </w:pPr>
+            <w:proofErr w:type="spellStart"/>
             <w:r>
               <w:rPr>
                 <w:rFonts w:asciiTheme="minorBidi" w:hAnsiTheme="minorBidi"/>
                 <w:b/>
                 <w:bCs/>
               </w:rPr>
-              <w:t>Pelaksanaan Kegiatan</w:t>
-            </w:r>
+              <w:t>Pelaksanaan</w:t>
+            </w:r>
+            <w:proofErr w:type="spellEnd"/>
+            <w:r>
+              <w:rPr>
+                <w:rFonts w:asciiTheme="minorBidi" w:hAnsiTheme="minorBidi"/>
+                <w:b/>
+                <w:bCs/>
+              </w:rPr>
+              <w:t xml:space="preserve"> </w:t>
+            </w:r>
+            <w:proofErr w:type="spellStart"/>
+            <w:r>
+              <w:rPr>
+                <w:rFonts w:asciiTheme="minorBidi" w:hAnsiTheme="minorBidi"/>
+                <w:b/>
+                <w:bCs/>
+              </w:rPr>
+              <w:t>Kegiatan</w:t>
+            </w:r>
+            <w:proofErr w:type="spellEnd"/>
           </w:p>
         </w:tc>
         <w:tc>
@@ -1833,11 +2082,19 @@
                 <w:rFonts w:asciiTheme="minorBidi" w:hAnsiTheme="minorBidi"/>
               </w:rPr>
             </w:pPr>
-            <w:r>
-              <w:rPr>
-                <w:rFonts w:asciiTheme="minorBidi" w:hAnsiTheme="minorBidi"/>
-              </w:rPr>
-              <w:t>Pelaksana ……………………………………………………………….</w:t>
+            <w:proofErr w:type="spellStart"/>
+            <w:r>
+              <w:rPr>
+                <w:rFonts w:asciiTheme="minorBidi" w:hAnsiTheme="minorBidi"/>
+              </w:rPr>
+              <w:t>Pelaksana</w:t>
+            </w:r>
+            <w:proofErr w:type="spellEnd"/>
+            <w:r>
+              <w:rPr>
+                <w:rFonts w:asciiTheme="minorBidi" w:hAnsiTheme="minorBidi"/>
+              </w:rPr>
+              <w:t xml:space="preserve"> ……………………………………………………………….</w:t>
             </w:r>
           </w:p>
         </w:tc>
@@ -1933,8 +2190,30 @@
               <w:rPr>
                 <w:rFonts w:asciiTheme="minorBidi" w:hAnsiTheme="minorBidi"/>
               </w:rPr>
-              <w:t>Waktu dan Tempat ……………………………………………………..</w:t>
-            </w:r>
+              <w:t xml:space="preserve">Waktu dan </w:t>
+            </w:r>
+            <w:proofErr w:type="spellStart"/>
+            <w:r>
+              <w:rPr>
+                <w:rFonts w:asciiTheme="minorBidi" w:hAnsiTheme="minorBidi"/>
+              </w:rPr>
+              <w:t>Tempat</w:t>
+            </w:r>
+            <w:proofErr w:type="spellEnd"/>
+            <w:r>
+              <w:rPr>
+                <w:rFonts w:asciiTheme="minorBidi" w:hAnsiTheme="minorBidi"/>
+              </w:rPr>
+              <w:t xml:space="preserve"> …………………………………………………</w:t>
+            </w:r>
+            <w:proofErr w:type="gramStart"/>
+            <w:r>
+              <w:rPr>
+                <w:rFonts w:asciiTheme="minorBidi" w:hAnsiTheme="minorBidi"/>
+              </w:rPr>
+              <w:t>…..</w:t>
+            </w:r>
+            <w:proofErr w:type="gramEnd"/>
           </w:p>
         </w:tc>
         <w:tc>
@@ -2121,12 +2400,28 @@
                 <w:rFonts w:asciiTheme="minorBidi" w:hAnsiTheme="minorBidi"/>
               </w:rPr>
             </w:pPr>
-            <w:r>
-              <w:rPr>
-                <w:rFonts w:asciiTheme="minorBidi" w:hAnsiTheme="minorBidi"/>
-              </w:rPr>
-              <w:t>Biaya ……………………………………………………………………..</w:t>
-            </w:r>
+            <w:proofErr w:type="spellStart"/>
+            <w:r>
+              <w:rPr>
+                <w:rFonts w:asciiTheme="minorBidi" w:hAnsiTheme="minorBidi"/>
+              </w:rPr>
+              <w:t>Biaya</w:t>
+            </w:r>
+            <w:proofErr w:type="spellEnd"/>
+            <w:r>
+              <w:rPr>
+                <w:rFonts w:asciiTheme="minorBidi" w:hAnsiTheme="minorBidi"/>
+              </w:rPr>
+              <w:t xml:space="preserve"> …………………………………………………………………</w:t>
+            </w:r>
+            <w:proofErr w:type="gramStart"/>
+            <w:r>
+              <w:rPr>
+                <w:rFonts w:asciiTheme="minorBidi" w:hAnsiTheme="minorBidi"/>
+              </w:rPr>
+              <w:t>…..</w:t>
+            </w:r>
+            <w:proofErr w:type="gramEnd"/>
           </w:p>
         </w:tc>
         <w:tc>
@@ -2230,8 +2525,18 @@
                 <w:b/>
                 <w:bCs/>
               </w:rPr>
-              <w:t>Hasil yang Dicapai</w:t>
-            </w:r>
+              <w:t xml:space="preserve">Hasil yang </w:t>
+            </w:r>
+            <w:proofErr w:type="spellStart"/>
+            <w:r>
+              <w:rPr>
+                <w:rFonts w:asciiTheme="minorBidi" w:hAnsiTheme="minorBidi"/>
+                <w:b/>
+                <w:bCs/>
+              </w:rPr>
+              <w:t>Dicapai</w:t>
+            </w:r>
+            <w:proofErr w:type="spellEnd"/>
           </w:p>
         </w:tc>
         <w:tc>
@@ -2326,11 +2631,33 @@
                 <w:bCs/>
               </w:rPr>
             </w:pPr>
-            <w:r>
-              <w:rPr>
-                <w:rFonts w:asciiTheme="minorBidi" w:hAnsiTheme="minorBidi"/>
-              </w:rPr>
-              <w:t>Uraian Kegiatan …………………………………………………………</w:t>
+            <w:proofErr w:type="spellStart"/>
+            <w:r>
+              <w:rPr>
+                <w:rFonts w:asciiTheme="minorBidi" w:hAnsiTheme="minorBidi"/>
+              </w:rPr>
+              <w:t>Uraian</w:t>
+            </w:r>
+            <w:proofErr w:type="spellEnd"/>
+            <w:r>
+              <w:rPr>
+                <w:rFonts w:asciiTheme="minorBidi" w:hAnsiTheme="minorBidi"/>
+              </w:rPr>
+              <w:t xml:space="preserve"> </w:t>
+            </w:r>
+            <w:proofErr w:type="spellStart"/>
+            <w:r>
+              <w:rPr>
+                <w:rFonts w:asciiTheme="minorBidi" w:hAnsiTheme="minorBidi"/>
+              </w:rPr>
+              <w:t>Kegiatan</w:t>
+            </w:r>
+            <w:proofErr w:type="spellEnd"/>
+            <w:r>
+              <w:rPr>
+                <w:rFonts w:asciiTheme="minorBidi" w:hAnsiTheme="minorBidi"/>
+              </w:rPr>
+              <w:t xml:space="preserve"> …………………………………………………………</w:t>
             </w:r>
           </w:p>
         </w:tc>
@@ -2531,6 +2858,7 @@
                 <w:bCs/>
               </w:rPr>
             </w:pPr>
+            <w:proofErr w:type="spellStart"/>
             <w:r>
               <w:rPr>
                 <w:rFonts w:asciiTheme="minorBidi" w:hAnsiTheme="minorBidi"/>
@@ -2539,6 +2867,7 @@
               </w:rPr>
               <w:t>Penutup</w:t>
             </w:r>
+            <w:proofErr w:type="spellEnd"/>
           </w:p>
         </w:tc>
         <w:tc>
@@ -2631,11 +2960,19 @@
                 <w:rFonts w:asciiTheme="minorBidi" w:hAnsiTheme="minorBidi"/>
               </w:rPr>
             </w:pPr>
-            <w:r>
-              <w:rPr>
-                <w:rFonts w:asciiTheme="minorBidi" w:hAnsiTheme="minorBidi"/>
-              </w:rPr>
-              <w:t>Simpulan …………………………………………………………………</w:t>
+            <w:proofErr w:type="spellStart"/>
+            <w:r>
+              <w:rPr>
+                <w:rFonts w:asciiTheme="minorBidi" w:hAnsiTheme="minorBidi"/>
+              </w:rPr>
+              <w:t>Simpulan</w:t>
+            </w:r>
+            <w:proofErr w:type="spellEnd"/>
+            <w:r>
+              <w:rPr>
+                <w:rFonts w:asciiTheme="minorBidi" w:hAnsiTheme="minorBidi"/>
+              </w:rPr>
+              <w:t xml:space="preserve"> …………………………………………………………………</w:t>
             </w:r>
           </w:p>
         </w:tc>
@@ -2787,8 +3124,18 @@
                 <w:b/>
                 <w:bCs/>
               </w:rPr>
-              <w:t>Lampiran-lampiran</w:t>
-            </w:r>
+              <w:t>Lampiran-</w:t>
+            </w:r>
+            <w:proofErr w:type="spellStart"/>
+            <w:r>
+              <w:rPr>
+                <w:rFonts w:asciiTheme="minorBidi" w:hAnsiTheme="minorBidi"/>
+                <w:b/>
+                <w:bCs/>
+              </w:rPr>
+              <w:t>lampiran</w:t>
+            </w:r>
+            <w:proofErr w:type="spellEnd"/>
           </w:p>
         </w:tc>
         <w:tc>
@@ -2855,7 +3202,25 @@
           <w:bCs/>
         </w:rPr>
         <w:lastRenderedPageBreak/>
-        <w:t>BAB I : PANDAHULUAN</w:t>
+        <w:t xml:space="preserve">BAB </w:t>
+      </w:r>
+      <w:proofErr w:type="gramStart"/>
+      <w:r>
+        <w:rPr>
+          <w:rFonts w:asciiTheme="minorBidi" w:hAnsiTheme="minorBidi"/>
+          <w:b/>
+          <w:bCs/>
+        </w:rPr>
+        <w:t>I :</w:t>
+      </w:r>
+      <w:proofErr w:type="gramEnd"/>
+      <w:r>
+        <w:rPr>
+          <w:rFonts w:asciiTheme="minorBidi" w:hAnsiTheme="minorBidi"/>
+          <w:b/>
+          <w:bCs/>
+        </w:rPr>
+        <w:t xml:space="preserve"> PANDAHULUAN</w:t>
       </w:r>
     </w:p>
     <w:p>
@@ -2892,8 +3257,18 @@
           <w:b/>
           <w:bCs/>
         </w:rPr>
-        <w:t>Latar Belakang</w:t>
-      </w:r>
+        <w:t xml:space="preserve">Latar </w:t>
+      </w:r>
+      <w:proofErr w:type="spellStart"/>
+      <w:r>
+        <w:rPr>
+          <w:rFonts w:asciiTheme="minorBidi" w:hAnsiTheme="minorBidi"/>
+          <w:b/>
+          <w:bCs/>
+        </w:rPr>
+        <w:t>Belakang</w:t>
+      </w:r>
+      <w:proofErr w:type="spellEnd"/>
     </w:p>
     <w:p>
       <w:pPr>
@@ -2966,11 +3341,75 @@
           <w:rFonts w:asciiTheme="minorBidi" w:hAnsiTheme="minorBidi"/>
         </w:rPr>
       </w:pPr>
-      <w:r>
-        <w:rPr>
-          <w:rFonts w:asciiTheme="minorBidi" w:hAnsiTheme="minorBidi"/>
-        </w:rPr>
-        <w:t>Undang-Undang Nomor 17 Tahun 2003 tentang Keuangan Negara;</w:t>
+      <w:proofErr w:type="spellStart"/>
+      <w:r>
+        <w:rPr>
+          <w:rFonts w:asciiTheme="minorBidi" w:hAnsiTheme="minorBidi"/>
+        </w:rPr>
+        <w:t>Undang-Undang</w:t>
+      </w:r>
+      <w:proofErr w:type="spellEnd"/>
+      <w:r>
+        <w:rPr>
+          <w:rFonts w:asciiTheme="minorBidi" w:hAnsiTheme="minorBidi"/>
+        </w:rPr>
+        <w:t xml:space="preserve"> </w:t>
+      </w:r>
+      <w:proofErr w:type="spellStart"/>
+      <w:r>
+        <w:rPr>
+          <w:rFonts w:asciiTheme="minorBidi" w:hAnsiTheme="minorBidi"/>
+        </w:rPr>
+        <w:t>Nomor</w:t>
+      </w:r>
+      <w:proofErr w:type="spellEnd"/>
+      <w:r>
+        <w:rPr>
+          <w:rFonts w:asciiTheme="minorBidi" w:hAnsiTheme="minorBidi"/>
+        </w:rPr>
+        <w:t xml:space="preserve"> 17 </w:t>
+      </w:r>
+      <w:proofErr w:type="spellStart"/>
+      <w:r>
+        <w:rPr>
+          <w:rFonts w:asciiTheme="minorBidi" w:hAnsiTheme="minorBidi"/>
+        </w:rPr>
+        <w:t>Tahun</w:t>
+      </w:r>
+      <w:proofErr w:type="spellEnd"/>
+      <w:r>
+        <w:rPr>
+          <w:rFonts w:asciiTheme="minorBidi" w:hAnsiTheme="minorBidi"/>
+        </w:rPr>
+        <w:t xml:space="preserve"> 2003 </w:t>
+      </w:r>
+      <w:proofErr w:type="spellStart"/>
+      <w:r>
+        <w:rPr>
+          <w:rFonts w:asciiTheme="minorBidi" w:hAnsiTheme="minorBidi"/>
+        </w:rPr>
+        <w:t>tentang</w:t>
+      </w:r>
+      <w:proofErr w:type="spellEnd"/>
+      <w:r>
+        <w:rPr>
+          <w:rFonts w:asciiTheme="minorBidi" w:hAnsiTheme="minorBidi"/>
+        </w:rPr>
+        <w:t xml:space="preserve"> </w:t>
+      </w:r>
+      <w:proofErr w:type="spellStart"/>
+      <w:r>
+        <w:rPr>
+          <w:rFonts w:asciiTheme="minorBidi" w:hAnsiTheme="minorBidi"/>
+        </w:rPr>
+        <w:t>Keuangan</w:t>
+      </w:r>
+      <w:proofErr w:type="spellEnd"/>
+      <w:r>
+        <w:rPr>
+          <w:rFonts w:asciiTheme="minorBidi" w:hAnsiTheme="minorBidi"/>
+        </w:rPr>
+        <w:t xml:space="preserve"> Negara;</w:t>
       </w:r>
     </w:p>
     <w:p>
@@ -2988,11 +3427,75 @@
           <w:rFonts w:asciiTheme="minorBidi" w:hAnsiTheme="minorBidi"/>
         </w:rPr>
       </w:pPr>
-      <w:r>
-        <w:rPr>
-          <w:rFonts w:asciiTheme="minorBidi" w:hAnsiTheme="minorBidi"/>
-        </w:rPr>
-        <w:t>Undang-Undang Nomor 20 Tahun 2003 tentang Sistem Pendidikan Nasional;</w:t>
+      <w:proofErr w:type="spellStart"/>
+      <w:r>
+        <w:rPr>
+          <w:rFonts w:asciiTheme="minorBidi" w:hAnsiTheme="minorBidi"/>
+        </w:rPr>
+        <w:t>Undang-Undang</w:t>
+      </w:r>
+      <w:proofErr w:type="spellEnd"/>
+      <w:r>
+        <w:rPr>
+          <w:rFonts w:asciiTheme="minorBidi" w:hAnsiTheme="minorBidi"/>
+        </w:rPr>
+        <w:t xml:space="preserve"> </w:t>
+      </w:r>
+      <w:proofErr w:type="spellStart"/>
+      <w:r>
+        <w:rPr>
+          <w:rFonts w:asciiTheme="minorBidi" w:hAnsiTheme="minorBidi"/>
+        </w:rPr>
+        <w:t>Nomor</w:t>
+      </w:r>
+      <w:proofErr w:type="spellEnd"/>
+      <w:r>
+        <w:rPr>
+          <w:rFonts w:asciiTheme="minorBidi" w:hAnsiTheme="minorBidi"/>
+        </w:rPr>
+        <w:t xml:space="preserve"> 20 </w:t>
+      </w:r>
+      <w:proofErr w:type="spellStart"/>
+      <w:r>
+        <w:rPr>
+          <w:rFonts w:asciiTheme="minorBidi" w:hAnsiTheme="minorBidi"/>
+        </w:rPr>
+        <w:t>Tahun</w:t>
+      </w:r>
+      <w:proofErr w:type="spellEnd"/>
+      <w:r>
+        <w:rPr>
+          <w:rFonts w:asciiTheme="minorBidi" w:hAnsiTheme="minorBidi"/>
+        </w:rPr>
+        <w:t xml:space="preserve"> 2003 </w:t>
+      </w:r>
+      <w:proofErr w:type="spellStart"/>
+      <w:r>
+        <w:rPr>
+          <w:rFonts w:asciiTheme="minorBidi" w:hAnsiTheme="minorBidi"/>
+        </w:rPr>
+        <w:t>tentang</w:t>
+      </w:r>
+      <w:proofErr w:type="spellEnd"/>
+      <w:r>
+        <w:rPr>
+          <w:rFonts w:asciiTheme="minorBidi" w:hAnsiTheme="minorBidi"/>
+        </w:rPr>
+        <w:t xml:space="preserve"> </w:t>
+      </w:r>
+      <w:proofErr w:type="spellStart"/>
+      <w:r>
+        <w:rPr>
+          <w:rFonts w:asciiTheme="minorBidi" w:hAnsiTheme="minorBidi"/>
+        </w:rPr>
+        <w:t>Sistem</w:t>
+      </w:r>
+      <w:proofErr w:type="spellEnd"/>
+      <w:r>
+        <w:rPr>
+          <w:rFonts w:asciiTheme="minorBidi" w:hAnsiTheme="minorBidi"/>
+        </w:rPr>
+        <w:t xml:space="preserve"> Pendidikan Nasional;</w:t>
       </w:r>
     </w:p>
     <w:p>
@@ -3010,11 +3513,75 @@
           <w:rFonts w:asciiTheme="minorBidi" w:hAnsiTheme="minorBidi"/>
         </w:rPr>
       </w:pPr>
-      <w:r>
-        <w:rPr>
-          <w:rFonts w:asciiTheme="minorBidi" w:hAnsiTheme="minorBidi"/>
-        </w:rPr>
-        <w:t>Undang-Undang Nomor 1 Tahun 2004 tentang Perbendaharan Negara;</w:t>
+      <w:proofErr w:type="spellStart"/>
+      <w:r>
+        <w:rPr>
+          <w:rFonts w:asciiTheme="minorBidi" w:hAnsiTheme="minorBidi"/>
+        </w:rPr>
+        <w:t>Undang-Undang</w:t>
+      </w:r>
+      <w:proofErr w:type="spellEnd"/>
+      <w:r>
+        <w:rPr>
+          <w:rFonts w:asciiTheme="minorBidi" w:hAnsiTheme="minorBidi"/>
+        </w:rPr>
+        <w:t xml:space="preserve"> </w:t>
+      </w:r>
+      <w:proofErr w:type="spellStart"/>
+      <w:r>
+        <w:rPr>
+          <w:rFonts w:asciiTheme="minorBidi" w:hAnsiTheme="minorBidi"/>
+        </w:rPr>
+        <w:t>Nomor</w:t>
+      </w:r>
+      <w:proofErr w:type="spellEnd"/>
+      <w:r>
+        <w:rPr>
+          <w:rFonts w:asciiTheme="minorBidi" w:hAnsiTheme="minorBidi"/>
+        </w:rPr>
+        <w:t xml:space="preserve"> 1 </w:t>
+      </w:r>
+      <w:proofErr w:type="spellStart"/>
+      <w:r>
+        <w:rPr>
+          <w:rFonts w:asciiTheme="minorBidi" w:hAnsiTheme="minorBidi"/>
+        </w:rPr>
+        <w:t>Tahun</w:t>
+      </w:r>
+      <w:proofErr w:type="spellEnd"/>
+      <w:r>
+        <w:rPr>
+          <w:rFonts w:asciiTheme="minorBidi" w:hAnsiTheme="minorBidi"/>
+        </w:rPr>
+        <w:t xml:space="preserve"> 2004 </w:t>
+      </w:r>
+      <w:proofErr w:type="spellStart"/>
+      <w:r>
+        <w:rPr>
+          <w:rFonts w:asciiTheme="minorBidi" w:hAnsiTheme="minorBidi"/>
+        </w:rPr>
+        <w:t>tentang</w:t>
+      </w:r>
+      <w:proofErr w:type="spellEnd"/>
+      <w:r>
+        <w:rPr>
+          <w:rFonts w:asciiTheme="minorBidi" w:hAnsiTheme="minorBidi"/>
+        </w:rPr>
+        <w:t xml:space="preserve"> </w:t>
+      </w:r>
+      <w:proofErr w:type="spellStart"/>
+      <w:r>
+        <w:rPr>
+          <w:rFonts w:asciiTheme="minorBidi" w:hAnsiTheme="minorBidi"/>
+        </w:rPr>
+        <w:t>Perbendaharan</w:t>
+      </w:r>
+      <w:proofErr w:type="spellEnd"/>
+      <w:r>
+        <w:rPr>
+          <w:rFonts w:asciiTheme="minorBidi" w:hAnsiTheme="minorBidi"/>
+        </w:rPr>
+        <w:t xml:space="preserve"> Negara;</w:t>
       </w:r>
     </w:p>
     <w:p>
@@ -3032,11 +3599,117 @@
           <w:rFonts w:asciiTheme="minorBidi" w:hAnsiTheme="minorBidi"/>
         </w:rPr>
       </w:pPr>
-      <w:r>
-        <w:rPr>
-          <w:rFonts w:asciiTheme="minorBidi" w:hAnsiTheme="minorBidi"/>
-        </w:rPr>
-        <w:t>Undang-Undang Nomor 15 Tahun 2004 tentang Pemeriksaan Pengelolaan dan Tanggungjawab Keuangan Negara;</w:t>
+      <w:proofErr w:type="spellStart"/>
+      <w:r>
+        <w:rPr>
+          <w:rFonts w:asciiTheme="minorBidi" w:hAnsiTheme="minorBidi"/>
+        </w:rPr>
+        <w:t>Undang-Undang</w:t>
+      </w:r>
+      <w:proofErr w:type="spellEnd"/>
+      <w:r>
+        <w:rPr>
+          <w:rFonts w:asciiTheme="minorBidi" w:hAnsiTheme="minorBidi"/>
+        </w:rPr>
+        <w:t xml:space="preserve"> </w:t>
+      </w:r>
+      <w:proofErr w:type="spellStart"/>
+      <w:r>
+        <w:rPr>
+          <w:rFonts w:asciiTheme="minorBidi" w:hAnsiTheme="minorBidi"/>
+        </w:rPr>
+        <w:t>Nomor</w:t>
+      </w:r>
+      <w:proofErr w:type="spellEnd"/>
+      <w:r>
+        <w:rPr>
+          <w:rFonts w:asciiTheme="minorBidi" w:hAnsiTheme="minorBidi"/>
+        </w:rPr>
+        <w:t xml:space="preserve"> 15 </w:t>
+      </w:r>
+      <w:proofErr w:type="spellStart"/>
+      <w:r>
+        <w:rPr>
+          <w:rFonts w:asciiTheme="minorBidi" w:hAnsiTheme="minorBidi"/>
+        </w:rPr>
+        <w:t>Tahun</w:t>
+      </w:r>
+      <w:proofErr w:type="spellEnd"/>
+      <w:r>
+        <w:rPr>
+          <w:rFonts w:asciiTheme="minorBidi" w:hAnsiTheme="minorBidi"/>
+        </w:rPr>
+        <w:t xml:space="preserve"> 2004 </w:t>
+      </w:r>
+      <w:proofErr w:type="spellStart"/>
+      <w:r>
+        <w:rPr>
+          <w:rFonts w:asciiTheme="minorBidi" w:hAnsiTheme="minorBidi"/>
+        </w:rPr>
+        <w:t>tentang</w:t>
+      </w:r>
+      <w:proofErr w:type="spellEnd"/>
+      <w:r>
+        <w:rPr>
+          <w:rFonts w:asciiTheme="minorBidi" w:hAnsiTheme="minorBidi"/>
+        </w:rPr>
+        <w:t xml:space="preserve"> </w:t>
+      </w:r>
+      <w:proofErr w:type="spellStart"/>
+      <w:r>
+        <w:rPr>
+          <w:rFonts w:asciiTheme="minorBidi" w:hAnsiTheme="minorBidi"/>
+        </w:rPr>
+        <w:t>Pemeriksaan</w:t>
+      </w:r>
+      <w:proofErr w:type="spellEnd"/>
+      <w:r>
+        <w:rPr>
+          <w:rFonts w:asciiTheme="minorBidi" w:hAnsiTheme="minorBidi"/>
+        </w:rPr>
+        <w:t xml:space="preserve"> </w:t>
+      </w:r>
+      <w:proofErr w:type="spellStart"/>
+      <w:r>
+        <w:rPr>
+          <w:rFonts w:asciiTheme="minorBidi" w:hAnsiTheme="minorBidi"/>
+        </w:rPr>
+        <w:t>Pengelolaan</w:t>
+      </w:r>
+      <w:proofErr w:type="spellEnd"/>
+      <w:r>
+        <w:rPr>
+          <w:rFonts w:asciiTheme="minorBidi" w:hAnsiTheme="minorBidi"/>
+        </w:rPr>
+        <w:t xml:space="preserve"> dan </w:t>
+      </w:r>
+      <w:proofErr w:type="spellStart"/>
+      <w:r>
+        <w:rPr>
+          <w:rFonts w:asciiTheme="minorBidi" w:hAnsiTheme="minorBidi"/>
+        </w:rPr>
+        <w:t>Tanggungjawab</w:t>
+      </w:r>
+      <w:proofErr w:type="spellEnd"/>
+      <w:r>
+        <w:rPr>
+          <w:rFonts w:asciiTheme="minorBidi" w:hAnsiTheme="minorBidi"/>
+        </w:rPr>
+        <w:t xml:space="preserve"> </w:t>
+      </w:r>
+      <w:proofErr w:type="spellStart"/>
+      <w:r>
+        <w:rPr>
+          <w:rFonts w:asciiTheme="minorBidi" w:hAnsiTheme="minorBidi"/>
+        </w:rPr>
+        <w:t>Keuangan</w:t>
+      </w:r>
+      <w:proofErr w:type="spellEnd"/>
+      <w:r>
+        <w:rPr>
+          <w:rFonts w:asciiTheme="minorBidi" w:hAnsiTheme="minorBidi"/>
+        </w:rPr>
+        <w:t xml:space="preserve"> Negara;</w:t>
       </w:r>
     </w:p>
     <w:p>
@@ -3051,11 +3724,215 @@
           <w:rFonts w:asciiTheme="minorBidi" w:hAnsiTheme="minorBidi"/>
         </w:rPr>
       </w:pPr>
-      <w:r>
-        <w:rPr>
-          <w:rFonts w:asciiTheme="minorBidi" w:hAnsiTheme="minorBidi"/>
-        </w:rPr>
-        <w:t>Peraturan Pemerintah Nomor 50 Tahun 2018 tentang Perubahan Atas Peraturan Pemerintah Nomor 45 Tahun 2013 tentang Tata Cara Pelaksanaan Anggaran Pendapatan dan Belanja Negara;</w:t>
+      <w:proofErr w:type="spellStart"/>
+      <w:r>
+        <w:rPr>
+          <w:rFonts w:asciiTheme="minorBidi" w:hAnsiTheme="minorBidi"/>
+        </w:rPr>
+        <w:t>Peraturan</w:t>
+      </w:r>
+      <w:proofErr w:type="spellEnd"/>
+      <w:r>
+        <w:rPr>
+          <w:rFonts w:asciiTheme="minorBidi" w:hAnsiTheme="minorBidi"/>
+        </w:rPr>
+        <w:t xml:space="preserve"> </w:t>
+      </w:r>
+      <w:proofErr w:type="spellStart"/>
+      <w:r>
+        <w:rPr>
+          <w:rFonts w:asciiTheme="minorBidi" w:hAnsiTheme="minorBidi"/>
+        </w:rPr>
+        <w:t>Pemerintah</w:t>
+      </w:r>
+      <w:proofErr w:type="spellEnd"/>
+      <w:r>
+        <w:rPr>
+          <w:rFonts w:asciiTheme="minorBidi" w:hAnsiTheme="minorBidi"/>
+        </w:rPr>
+        <w:t xml:space="preserve"> </w:t>
+      </w:r>
+      <w:proofErr w:type="spellStart"/>
+      <w:r>
+        <w:rPr>
+          <w:rFonts w:asciiTheme="minorBidi" w:hAnsiTheme="minorBidi"/>
+        </w:rPr>
+        <w:t>Nomor</w:t>
+      </w:r>
+      <w:proofErr w:type="spellEnd"/>
+      <w:r>
+        <w:rPr>
+          <w:rFonts w:asciiTheme="minorBidi" w:hAnsiTheme="minorBidi"/>
+        </w:rPr>
+        <w:t xml:space="preserve"> 50 </w:t>
+      </w:r>
+      <w:proofErr w:type="spellStart"/>
+      <w:r>
+        <w:rPr>
+          <w:rFonts w:asciiTheme="minorBidi" w:hAnsiTheme="minorBidi"/>
+        </w:rPr>
+        <w:t>Tahun</w:t>
+      </w:r>
+      <w:proofErr w:type="spellEnd"/>
+      <w:r>
+        <w:rPr>
+          <w:rFonts w:asciiTheme="minorBidi" w:hAnsiTheme="minorBidi"/>
+        </w:rPr>
+        <w:t xml:space="preserve"> 2018 </w:t>
+      </w:r>
+      <w:proofErr w:type="spellStart"/>
+      <w:r>
+        <w:rPr>
+          <w:rFonts w:asciiTheme="minorBidi" w:hAnsiTheme="minorBidi"/>
+        </w:rPr>
+        <w:t>tentang</w:t>
+      </w:r>
+      <w:proofErr w:type="spellEnd"/>
+      <w:r>
+        <w:rPr>
+          <w:rFonts w:asciiTheme="minorBidi" w:hAnsiTheme="minorBidi"/>
+        </w:rPr>
+        <w:t xml:space="preserve"> </w:t>
+      </w:r>
+      <w:proofErr w:type="spellStart"/>
+      <w:r>
+        <w:rPr>
+          <w:rFonts w:asciiTheme="minorBidi" w:hAnsiTheme="minorBidi"/>
+        </w:rPr>
+        <w:t>Perubahan</w:t>
+      </w:r>
+      <w:proofErr w:type="spellEnd"/>
+      <w:r>
+        <w:rPr>
+          <w:rFonts w:asciiTheme="minorBidi" w:hAnsiTheme="minorBidi"/>
+        </w:rPr>
+        <w:t xml:space="preserve"> Atas </w:t>
+      </w:r>
+      <w:proofErr w:type="spellStart"/>
+      <w:r>
+        <w:rPr>
+          <w:rFonts w:asciiTheme="minorBidi" w:hAnsiTheme="minorBidi"/>
+        </w:rPr>
+        <w:t>Peraturan</w:t>
+      </w:r>
+      <w:proofErr w:type="spellEnd"/>
+      <w:r>
+        <w:rPr>
+          <w:rFonts w:asciiTheme="minorBidi" w:hAnsiTheme="minorBidi"/>
+        </w:rPr>
+        <w:t xml:space="preserve"> </w:t>
+      </w:r>
+      <w:proofErr w:type="spellStart"/>
+      <w:r>
+        <w:rPr>
+          <w:rFonts w:asciiTheme="minorBidi" w:hAnsiTheme="minorBidi"/>
+        </w:rPr>
+        <w:t>Pemerintah</w:t>
+      </w:r>
+      <w:proofErr w:type="spellEnd"/>
+      <w:r>
+        <w:rPr>
+          <w:rFonts w:asciiTheme="minorBidi" w:hAnsiTheme="minorBidi"/>
+        </w:rPr>
+        <w:t xml:space="preserve"> </w:t>
+      </w:r>
+      <w:proofErr w:type="spellStart"/>
+      <w:r>
+        <w:rPr>
+          <w:rFonts w:asciiTheme="minorBidi" w:hAnsiTheme="minorBidi"/>
+        </w:rPr>
+        <w:t>Nomor</w:t>
+      </w:r>
+      <w:proofErr w:type="spellEnd"/>
+      <w:r>
+        <w:rPr>
+          <w:rFonts w:asciiTheme="minorBidi" w:hAnsiTheme="minorBidi"/>
+        </w:rPr>
+        <w:t xml:space="preserve"> 45 </w:t>
+      </w:r>
+      <w:proofErr w:type="spellStart"/>
+      <w:r>
+        <w:rPr>
+          <w:rFonts w:asciiTheme="minorBidi" w:hAnsiTheme="minorBidi"/>
+        </w:rPr>
+        <w:t>Tahun</w:t>
+      </w:r>
+      <w:proofErr w:type="spellEnd"/>
+      <w:r>
+        <w:rPr>
+          <w:rFonts w:asciiTheme="minorBidi" w:hAnsiTheme="minorBidi"/>
+        </w:rPr>
+        <w:t xml:space="preserve"> 2013 </w:t>
+      </w:r>
+      <w:proofErr w:type="spellStart"/>
+      <w:r>
+        <w:rPr>
+          <w:rFonts w:asciiTheme="minorBidi" w:hAnsiTheme="minorBidi"/>
+        </w:rPr>
+        <w:t>tentang</w:t>
+      </w:r>
+      <w:proofErr w:type="spellEnd"/>
+      <w:r>
+        <w:rPr>
+          <w:rFonts w:asciiTheme="minorBidi" w:hAnsiTheme="minorBidi"/>
+        </w:rPr>
+        <w:t xml:space="preserve"> Tata Cara </w:t>
+      </w:r>
+      <w:proofErr w:type="spellStart"/>
+      <w:r>
+        <w:rPr>
+          <w:rFonts w:asciiTheme="minorBidi" w:hAnsiTheme="minorBidi"/>
+        </w:rPr>
+        <w:t>Pelaksanaan</w:t>
+      </w:r>
+      <w:proofErr w:type="spellEnd"/>
+      <w:r>
+        <w:rPr>
+          <w:rFonts w:asciiTheme="minorBidi" w:hAnsiTheme="minorBidi"/>
+        </w:rPr>
+        <w:t xml:space="preserve"> </w:t>
+      </w:r>
+      <w:proofErr w:type="spellStart"/>
+      <w:r>
+        <w:rPr>
+          <w:rFonts w:asciiTheme="minorBidi" w:hAnsiTheme="minorBidi"/>
+        </w:rPr>
+        <w:t>Anggaran</w:t>
+      </w:r>
+      <w:proofErr w:type="spellEnd"/>
+      <w:r>
+        <w:rPr>
+          <w:rFonts w:asciiTheme="minorBidi" w:hAnsiTheme="minorBidi"/>
+        </w:rPr>
+        <w:t xml:space="preserve"> </w:t>
+      </w:r>
+      <w:proofErr w:type="spellStart"/>
+      <w:r>
+        <w:rPr>
+          <w:rFonts w:asciiTheme="minorBidi" w:hAnsiTheme="minorBidi"/>
+        </w:rPr>
+        <w:t>Pendapatan</w:t>
+      </w:r>
+      <w:proofErr w:type="spellEnd"/>
+      <w:r>
+        <w:rPr>
+          <w:rFonts w:asciiTheme="minorBidi" w:hAnsiTheme="minorBidi"/>
+        </w:rPr>
+        <w:t xml:space="preserve"> dan </w:t>
+      </w:r>
+      <w:proofErr w:type="spellStart"/>
+      <w:r>
+        <w:rPr>
+          <w:rFonts w:asciiTheme="minorBidi" w:hAnsiTheme="minorBidi"/>
+        </w:rPr>
+        <w:t>Belanja</w:t>
+      </w:r>
+      <w:proofErr w:type="spellEnd"/>
+      <w:r>
+        <w:rPr>
+          <w:rFonts w:asciiTheme="minorBidi" w:hAnsiTheme="minorBidi"/>
+        </w:rPr>
+        <w:t xml:space="preserve"> Negara;</w:t>
       </w:r>
     </w:p>
     <w:p>
@@ -3073,11 +3950,131 @@
           <w:rFonts w:asciiTheme="minorBidi" w:hAnsiTheme="minorBidi"/>
         </w:rPr>
       </w:pPr>
-      <w:r>
-        <w:rPr>
-          <w:rFonts w:asciiTheme="minorBidi" w:hAnsiTheme="minorBidi"/>
-        </w:rPr>
-        <w:t>Peraturan Pemerintah Nomor 4 Tahun 2014 tentang Penyelenggaraan Perguruan Tinggi dan Pengelolaan Perguruan Tinggi;</w:t>
+      <w:proofErr w:type="spellStart"/>
+      <w:r>
+        <w:rPr>
+          <w:rFonts w:asciiTheme="minorBidi" w:hAnsiTheme="minorBidi"/>
+        </w:rPr>
+        <w:t>Peraturan</w:t>
+      </w:r>
+      <w:proofErr w:type="spellEnd"/>
+      <w:r>
+        <w:rPr>
+          <w:rFonts w:asciiTheme="minorBidi" w:hAnsiTheme="minorBidi"/>
+        </w:rPr>
+        <w:t xml:space="preserve"> </w:t>
+      </w:r>
+      <w:proofErr w:type="spellStart"/>
+      <w:r>
+        <w:rPr>
+          <w:rFonts w:asciiTheme="minorBidi" w:hAnsiTheme="minorBidi"/>
+        </w:rPr>
+        <w:t>Pemerintah</w:t>
+      </w:r>
+      <w:proofErr w:type="spellEnd"/>
+      <w:r>
+        <w:rPr>
+          <w:rFonts w:asciiTheme="minorBidi" w:hAnsiTheme="minorBidi"/>
+        </w:rPr>
+        <w:t xml:space="preserve"> </w:t>
+      </w:r>
+      <w:proofErr w:type="spellStart"/>
+      <w:r>
+        <w:rPr>
+          <w:rFonts w:asciiTheme="minorBidi" w:hAnsiTheme="minorBidi"/>
+        </w:rPr>
+        <w:t>Nomor</w:t>
+      </w:r>
+      <w:proofErr w:type="spellEnd"/>
+      <w:r>
+        <w:rPr>
+          <w:rFonts w:asciiTheme="minorBidi" w:hAnsiTheme="minorBidi"/>
+        </w:rPr>
+        <w:t xml:space="preserve"> 4 </w:t>
+      </w:r>
+      <w:proofErr w:type="spellStart"/>
+      <w:r>
+        <w:rPr>
+          <w:rFonts w:asciiTheme="minorBidi" w:hAnsiTheme="minorBidi"/>
+        </w:rPr>
+        <w:t>Tahun</w:t>
+      </w:r>
+      <w:proofErr w:type="spellEnd"/>
+      <w:r>
+        <w:rPr>
+          <w:rFonts w:asciiTheme="minorBidi" w:hAnsiTheme="minorBidi"/>
+        </w:rPr>
+        <w:t xml:space="preserve"> 2014 </w:t>
+      </w:r>
+      <w:proofErr w:type="spellStart"/>
+      <w:r>
+        <w:rPr>
+          <w:rFonts w:asciiTheme="minorBidi" w:hAnsiTheme="minorBidi"/>
+        </w:rPr>
+        <w:t>tentang</w:t>
+      </w:r>
+      <w:proofErr w:type="spellEnd"/>
+      <w:r>
+        <w:rPr>
+          <w:rFonts w:asciiTheme="minorBidi" w:hAnsiTheme="minorBidi"/>
+        </w:rPr>
+        <w:t xml:space="preserve"> </w:t>
+      </w:r>
+      <w:proofErr w:type="spellStart"/>
+      <w:r>
+        <w:rPr>
+          <w:rFonts w:asciiTheme="minorBidi" w:hAnsiTheme="minorBidi"/>
+        </w:rPr>
+        <w:t>Penyelenggaraan</w:t>
+      </w:r>
+      <w:proofErr w:type="spellEnd"/>
+      <w:r>
+        <w:rPr>
+          <w:rFonts w:asciiTheme="minorBidi" w:hAnsiTheme="minorBidi"/>
+        </w:rPr>
+        <w:t xml:space="preserve"> </w:t>
+      </w:r>
+      <w:proofErr w:type="spellStart"/>
+      <w:r>
+        <w:rPr>
+          <w:rFonts w:asciiTheme="minorBidi" w:hAnsiTheme="minorBidi"/>
+        </w:rPr>
+        <w:t>Perguruan</w:t>
+      </w:r>
+      <w:proofErr w:type="spellEnd"/>
+      <w:r>
+        <w:rPr>
+          <w:rFonts w:asciiTheme="minorBidi" w:hAnsiTheme="minorBidi"/>
+        </w:rPr>
+        <w:t xml:space="preserve"> Tinggi dan </w:t>
+      </w:r>
+      <w:proofErr w:type="spellStart"/>
+      <w:r>
+        <w:rPr>
+          <w:rFonts w:asciiTheme="minorBidi" w:hAnsiTheme="minorBidi"/>
+        </w:rPr>
+        <w:t>Pengelolaan</w:t>
+      </w:r>
+      <w:proofErr w:type="spellEnd"/>
+      <w:r>
+        <w:rPr>
+          <w:rFonts w:asciiTheme="minorBidi" w:hAnsiTheme="minorBidi"/>
+        </w:rPr>
+        <w:t xml:space="preserve"> </w:t>
+      </w:r>
+      <w:proofErr w:type="spellStart"/>
+      <w:r>
+        <w:rPr>
+          <w:rFonts w:asciiTheme="minorBidi" w:hAnsiTheme="minorBidi"/>
+        </w:rPr>
+        <w:t>Perguruan</w:t>
+      </w:r>
+      <w:proofErr w:type="spellEnd"/>
+      <w:r>
+        <w:rPr>
+          <w:rFonts w:asciiTheme="minorBidi" w:hAnsiTheme="minorBidi"/>
+        </w:rPr>
+        <w:t xml:space="preserve"> Tinggi;</w:t>
       </w:r>
     </w:p>
     <w:p>
@@ -3096,35 +4093,239 @@
           <w:rFonts w:asciiTheme="minorBidi" w:hAnsiTheme="minorBidi"/>
         </w:rPr>
       </w:pPr>
+      <w:proofErr w:type="spellStart"/>
       <w:r>
         <w:rPr>
           <w:rFonts w:asciiTheme="minorBidi" w:hAnsiTheme="minorBidi"/>
           <w:bCs/>
           <w:shd w:val="clear" w:color="auto" w:fill="FFFFFF"/>
         </w:rPr>
-        <w:t>Peraturan Presiden Nomor 12 Tahun 2021</w:t>
-      </w:r>
-      <w:r>
-        <w:rPr>
-          <w:rFonts w:asciiTheme="minorBidi" w:hAnsiTheme="minorBidi"/>
+        <w:t>Peraturan</w:t>
+      </w:r>
+      <w:proofErr w:type="spellEnd"/>
+      <w:r>
+        <w:rPr>
+          <w:rFonts w:asciiTheme="minorBidi" w:hAnsiTheme="minorBidi"/>
+          <w:bCs/>
           <w:shd w:val="clear" w:color="auto" w:fill="FFFFFF"/>
         </w:rPr>
-        <w:t> tentang Perubahan atas </w:t>
-      </w:r>
+        <w:t xml:space="preserve"> </w:t>
+      </w:r>
+      <w:proofErr w:type="spellStart"/>
       <w:r>
         <w:rPr>
           <w:rFonts w:asciiTheme="minorBidi" w:hAnsiTheme="minorBidi"/>
           <w:bCs/>
           <w:shd w:val="clear" w:color="auto" w:fill="FFFFFF"/>
         </w:rPr>
-        <w:t>Peraturan Presiden Nomor</w:t>
-      </w:r>
-      <w:r>
-        <w:rPr>
-          <w:rFonts w:asciiTheme="minorBidi" w:hAnsiTheme="minorBidi"/>
+        <w:t>Presiden</w:t>
+      </w:r>
+      <w:proofErr w:type="spellEnd"/>
+      <w:r>
+        <w:rPr>
+          <w:rFonts w:asciiTheme="minorBidi" w:hAnsiTheme="minorBidi"/>
+          <w:bCs/>
           <w:shd w:val="clear" w:color="auto" w:fill="FFFFFF"/>
         </w:rPr>
-        <w:t> 16 Tahun 2018 tentang Pengadaan Barang/Jasa Pemerintah;</w:t>
+        <w:t xml:space="preserve"> </w:t>
+      </w:r>
+      <w:proofErr w:type="spellStart"/>
+      <w:r>
+        <w:rPr>
+          <w:rFonts w:asciiTheme="minorBidi" w:hAnsiTheme="minorBidi"/>
+          <w:bCs/>
+          <w:shd w:val="clear" w:color="auto" w:fill="FFFFFF"/>
+        </w:rPr>
+        <w:t>Nomor</w:t>
+      </w:r>
+      <w:proofErr w:type="spellEnd"/>
+      <w:r>
+        <w:rPr>
+          <w:rFonts w:asciiTheme="minorBidi" w:hAnsiTheme="minorBidi"/>
+          <w:bCs/>
+          <w:shd w:val="clear" w:color="auto" w:fill="FFFFFF"/>
+        </w:rPr>
+        <w:t xml:space="preserve"> 12 </w:t>
+      </w:r>
+      <w:proofErr w:type="spellStart"/>
+      <w:r>
+        <w:rPr>
+          <w:rFonts w:asciiTheme="minorBidi" w:hAnsiTheme="minorBidi"/>
+          <w:bCs/>
+          <w:shd w:val="clear" w:color="auto" w:fill="FFFFFF"/>
+        </w:rPr>
+        <w:t>Tahun</w:t>
+      </w:r>
+      <w:proofErr w:type="spellEnd"/>
+      <w:r>
+        <w:rPr>
+          <w:rFonts w:asciiTheme="minorBidi" w:hAnsiTheme="minorBidi"/>
+          <w:bCs/>
+          <w:shd w:val="clear" w:color="auto" w:fill="FFFFFF"/>
+        </w:rPr>
+        <w:t xml:space="preserve"> 2021</w:t>
+      </w:r>
+      <w:r>
+        <w:rPr>
+          <w:rFonts w:asciiTheme="minorBidi" w:hAnsiTheme="minorBidi"/>
+          <w:shd w:val="clear" w:color="auto" w:fill="FFFFFF"/>
+        </w:rPr>
+        <w:t> </w:t>
+      </w:r>
+      <w:proofErr w:type="spellStart"/>
+      <w:r>
+        <w:rPr>
+          <w:rFonts w:asciiTheme="minorBidi" w:hAnsiTheme="minorBidi"/>
+          <w:shd w:val="clear" w:color="auto" w:fill="FFFFFF"/>
+        </w:rPr>
+        <w:t>tentang</w:t>
+      </w:r>
+      <w:proofErr w:type="spellEnd"/>
+      <w:r>
+        <w:rPr>
+          <w:rFonts w:asciiTheme="minorBidi" w:hAnsiTheme="minorBidi"/>
+          <w:shd w:val="clear" w:color="auto" w:fill="FFFFFF"/>
+        </w:rPr>
+        <w:t xml:space="preserve"> </w:t>
+      </w:r>
+      <w:proofErr w:type="spellStart"/>
+      <w:r>
+        <w:rPr>
+          <w:rFonts w:asciiTheme="minorBidi" w:hAnsiTheme="minorBidi"/>
+          <w:shd w:val="clear" w:color="auto" w:fill="FFFFFF"/>
+        </w:rPr>
+        <w:t>Perubahan</w:t>
+      </w:r>
+      <w:proofErr w:type="spellEnd"/>
+      <w:r>
+        <w:rPr>
+          <w:rFonts w:asciiTheme="minorBidi" w:hAnsiTheme="minorBidi"/>
+          <w:shd w:val="clear" w:color="auto" w:fill="FFFFFF"/>
+        </w:rPr>
+        <w:t xml:space="preserve"> </w:t>
+      </w:r>
+      <w:proofErr w:type="spellStart"/>
+      <w:r>
+        <w:rPr>
+          <w:rFonts w:asciiTheme="minorBidi" w:hAnsiTheme="minorBidi"/>
+          <w:shd w:val="clear" w:color="auto" w:fill="FFFFFF"/>
+        </w:rPr>
+        <w:t>atas</w:t>
+      </w:r>
+      <w:proofErr w:type="spellEnd"/>
+      <w:r>
+        <w:rPr>
+          <w:rFonts w:asciiTheme="minorBidi" w:hAnsiTheme="minorBidi"/>
+          <w:shd w:val="clear" w:color="auto" w:fill="FFFFFF"/>
+        </w:rPr>
+        <w:t> </w:t>
+      </w:r>
+      <w:proofErr w:type="spellStart"/>
+      <w:r>
+        <w:rPr>
+          <w:rFonts w:asciiTheme="minorBidi" w:hAnsiTheme="minorBidi"/>
+          <w:bCs/>
+          <w:shd w:val="clear" w:color="auto" w:fill="FFFFFF"/>
+        </w:rPr>
+        <w:t>Peraturan</w:t>
+      </w:r>
+      <w:proofErr w:type="spellEnd"/>
+      <w:r>
+        <w:rPr>
+          <w:rFonts w:asciiTheme="minorBidi" w:hAnsiTheme="minorBidi"/>
+          <w:bCs/>
+          <w:shd w:val="clear" w:color="auto" w:fill="FFFFFF"/>
+        </w:rPr>
+        <w:t xml:space="preserve"> </w:t>
+      </w:r>
+      <w:proofErr w:type="spellStart"/>
+      <w:r>
+        <w:rPr>
+          <w:rFonts w:asciiTheme="minorBidi" w:hAnsiTheme="minorBidi"/>
+          <w:bCs/>
+          <w:shd w:val="clear" w:color="auto" w:fill="FFFFFF"/>
+        </w:rPr>
+        <w:t>Presiden</w:t>
+      </w:r>
+      <w:proofErr w:type="spellEnd"/>
+      <w:r>
+        <w:rPr>
+          <w:rFonts w:asciiTheme="minorBidi" w:hAnsiTheme="minorBidi"/>
+          <w:bCs/>
+          <w:shd w:val="clear" w:color="auto" w:fill="FFFFFF"/>
+        </w:rPr>
+        <w:t xml:space="preserve"> Nomor</w:t>
+      </w:r>
+      <w:r>
+        <w:rPr>
+          <w:rFonts w:asciiTheme="minorBidi" w:hAnsiTheme="minorBidi"/>
+          <w:shd w:val="clear" w:color="auto" w:fill="FFFFFF"/>
+        </w:rPr>
+        <w:t xml:space="preserve"> 16 </w:t>
+      </w:r>
+      <w:proofErr w:type="spellStart"/>
+      <w:r>
+        <w:rPr>
+          <w:rFonts w:asciiTheme="minorBidi" w:hAnsiTheme="minorBidi"/>
+          <w:shd w:val="clear" w:color="auto" w:fill="FFFFFF"/>
+        </w:rPr>
+        <w:t>Tahun</w:t>
+      </w:r>
+      <w:proofErr w:type="spellEnd"/>
+      <w:r>
+        <w:rPr>
+          <w:rFonts w:asciiTheme="minorBidi" w:hAnsiTheme="minorBidi"/>
+          <w:shd w:val="clear" w:color="auto" w:fill="FFFFFF"/>
+        </w:rPr>
+        <w:t xml:space="preserve"> 2018 </w:t>
+      </w:r>
+      <w:proofErr w:type="spellStart"/>
+      <w:r>
+        <w:rPr>
+          <w:rFonts w:asciiTheme="minorBidi" w:hAnsiTheme="minorBidi"/>
+          <w:shd w:val="clear" w:color="auto" w:fill="FFFFFF"/>
+        </w:rPr>
+        <w:t>tentang</w:t>
+      </w:r>
+      <w:proofErr w:type="spellEnd"/>
+      <w:r>
+        <w:rPr>
+          <w:rFonts w:asciiTheme="minorBidi" w:hAnsiTheme="minorBidi"/>
+          <w:shd w:val="clear" w:color="auto" w:fill="FFFFFF"/>
+        </w:rPr>
+        <w:t xml:space="preserve"> </w:t>
+      </w:r>
+      <w:proofErr w:type="spellStart"/>
+      <w:r>
+        <w:rPr>
+          <w:rFonts w:asciiTheme="minorBidi" w:hAnsiTheme="minorBidi"/>
+          <w:shd w:val="clear" w:color="auto" w:fill="FFFFFF"/>
+        </w:rPr>
+        <w:t>Pengadaan</w:t>
+      </w:r>
+      <w:proofErr w:type="spellEnd"/>
+      <w:r>
+        <w:rPr>
+          <w:rFonts w:asciiTheme="minorBidi" w:hAnsiTheme="minorBidi"/>
+          <w:shd w:val="clear" w:color="auto" w:fill="FFFFFF"/>
+        </w:rPr>
+        <w:t xml:space="preserve"> Barang/Jasa </w:t>
+      </w:r>
+      <w:proofErr w:type="spellStart"/>
+      <w:r>
+        <w:rPr>
+          <w:rFonts w:asciiTheme="minorBidi" w:hAnsiTheme="minorBidi"/>
+          <w:shd w:val="clear" w:color="auto" w:fill="FFFFFF"/>
+        </w:rPr>
+        <w:t>Pemerintah</w:t>
+      </w:r>
+      <w:proofErr w:type="spellEnd"/>
+      <w:r>
+        <w:rPr>
+          <w:rFonts w:asciiTheme="minorBidi" w:hAnsiTheme="minorBidi"/>
+          <w:shd w:val="clear" w:color="auto" w:fill="FFFFFF"/>
+        </w:rPr>
+        <w:t>;</w:t>
       </w:r>
     </w:p>
     <w:p>
@@ -3139,11 +4340,243 @@
           <w:rFonts w:asciiTheme="minorBidi" w:hAnsiTheme="minorBidi"/>
         </w:rPr>
       </w:pPr>
-      <w:r>
-        <w:rPr>
-          <w:rFonts w:asciiTheme="minorBidi" w:hAnsiTheme="minorBidi"/>
-        </w:rPr>
-        <w:t>Peraturan Presiden Nomor 53 Tahun 2010 tentang Perubahan Kedua Atas Keputusan Presiden RI Nomor 42 Tahun 2002 tentang Pelaksanaan Anggaran Pendapatan dan Belanja Negara jo KEPPRES Nomor 72 Tahun 2004;</w:t>
+      <w:proofErr w:type="spellStart"/>
+      <w:r>
+        <w:rPr>
+          <w:rFonts w:asciiTheme="minorBidi" w:hAnsiTheme="minorBidi"/>
+        </w:rPr>
+        <w:t>Peraturan</w:t>
+      </w:r>
+      <w:proofErr w:type="spellEnd"/>
+      <w:r>
+        <w:rPr>
+          <w:rFonts w:asciiTheme="minorBidi" w:hAnsiTheme="minorBidi"/>
+        </w:rPr>
+        <w:t xml:space="preserve"> </w:t>
+      </w:r>
+      <w:proofErr w:type="spellStart"/>
+      <w:r>
+        <w:rPr>
+          <w:rFonts w:asciiTheme="minorBidi" w:hAnsiTheme="minorBidi"/>
+        </w:rPr>
+        <w:t>Presiden</w:t>
+      </w:r>
+      <w:proofErr w:type="spellEnd"/>
+      <w:r>
+        <w:rPr>
+          <w:rFonts w:asciiTheme="minorBidi" w:hAnsiTheme="minorBidi"/>
+        </w:rPr>
+        <w:t xml:space="preserve"> </w:t>
+      </w:r>
+      <w:proofErr w:type="spellStart"/>
+      <w:r>
+        <w:rPr>
+          <w:rFonts w:asciiTheme="minorBidi" w:hAnsiTheme="minorBidi"/>
+        </w:rPr>
+        <w:t>Nomor</w:t>
+      </w:r>
+      <w:proofErr w:type="spellEnd"/>
+      <w:r>
+        <w:rPr>
+          <w:rFonts w:asciiTheme="minorBidi" w:hAnsiTheme="minorBidi"/>
+        </w:rPr>
+        <w:t xml:space="preserve"> 53 </w:t>
+      </w:r>
+      <w:proofErr w:type="spellStart"/>
+      <w:r>
+        <w:rPr>
+          <w:rFonts w:asciiTheme="minorBidi" w:hAnsiTheme="minorBidi"/>
+        </w:rPr>
+        <w:t>Tahun</w:t>
+      </w:r>
+      <w:proofErr w:type="spellEnd"/>
+      <w:r>
+        <w:rPr>
+          <w:rFonts w:asciiTheme="minorBidi" w:hAnsiTheme="minorBidi"/>
+        </w:rPr>
+        <w:t xml:space="preserve"> 2010 </w:t>
+      </w:r>
+      <w:proofErr w:type="spellStart"/>
+      <w:r>
+        <w:rPr>
+          <w:rFonts w:asciiTheme="minorBidi" w:hAnsiTheme="minorBidi"/>
+        </w:rPr>
+        <w:t>tentang</w:t>
+      </w:r>
+      <w:proofErr w:type="spellEnd"/>
+      <w:r>
+        <w:rPr>
+          <w:rFonts w:asciiTheme="minorBidi" w:hAnsiTheme="minorBidi"/>
+        </w:rPr>
+        <w:t xml:space="preserve"> </w:t>
+      </w:r>
+      <w:proofErr w:type="spellStart"/>
+      <w:r>
+        <w:rPr>
+          <w:rFonts w:asciiTheme="minorBidi" w:hAnsiTheme="minorBidi"/>
+        </w:rPr>
+        <w:t>Perubahan</w:t>
+      </w:r>
+      <w:proofErr w:type="spellEnd"/>
+      <w:r>
+        <w:rPr>
+          <w:rFonts w:asciiTheme="minorBidi" w:hAnsiTheme="minorBidi"/>
+        </w:rPr>
+        <w:t xml:space="preserve"> </w:t>
+      </w:r>
+      <w:proofErr w:type="spellStart"/>
+      <w:r>
+        <w:rPr>
+          <w:rFonts w:asciiTheme="minorBidi" w:hAnsiTheme="minorBidi"/>
+        </w:rPr>
+        <w:t>Kedua</w:t>
+      </w:r>
+      <w:proofErr w:type="spellEnd"/>
+      <w:r>
+        <w:rPr>
+          <w:rFonts w:asciiTheme="minorBidi" w:hAnsiTheme="minorBidi"/>
+        </w:rPr>
+        <w:t xml:space="preserve"> Atas Keputusan </w:t>
+      </w:r>
+      <w:proofErr w:type="spellStart"/>
+      <w:r>
+        <w:rPr>
+          <w:rFonts w:asciiTheme="minorBidi" w:hAnsiTheme="minorBidi"/>
+        </w:rPr>
+        <w:t>Presiden</w:t>
+      </w:r>
+      <w:proofErr w:type="spellEnd"/>
+      <w:r>
+        <w:rPr>
+          <w:rFonts w:asciiTheme="minorBidi" w:hAnsiTheme="minorBidi"/>
+        </w:rPr>
+        <w:t xml:space="preserve"> RI </w:t>
+      </w:r>
+      <w:proofErr w:type="spellStart"/>
+      <w:r>
+        <w:rPr>
+          <w:rFonts w:asciiTheme="minorBidi" w:hAnsiTheme="minorBidi"/>
+        </w:rPr>
+        <w:t>Nomor</w:t>
+      </w:r>
+      <w:proofErr w:type="spellEnd"/>
+      <w:r>
+        <w:rPr>
+          <w:rFonts w:asciiTheme="minorBidi" w:hAnsiTheme="minorBidi"/>
+        </w:rPr>
+        <w:t xml:space="preserve"> 42 </w:t>
+      </w:r>
+      <w:proofErr w:type="spellStart"/>
+      <w:r>
+        <w:rPr>
+          <w:rFonts w:asciiTheme="minorBidi" w:hAnsiTheme="minorBidi"/>
+        </w:rPr>
+        <w:t>Tahun</w:t>
+      </w:r>
+      <w:proofErr w:type="spellEnd"/>
+      <w:r>
+        <w:rPr>
+          <w:rFonts w:asciiTheme="minorBidi" w:hAnsiTheme="minorBidi"/>
+        </w:rPr>
+        <w:t xml:space="preserve"> 2002 </w:t>
+      </w:r>
+      <w:proofErr w:type="spellStart"/>
+      <w:r>
+        <w:rPr>
+          <w:rFonts w:asciiTheme="minorBidi" w:hAnsiTheme="minorBidi"/>
+        </w:rPr>
+        <w:t>tentang</w:t>
+      </w:r>
+      <w:proofErr w:type="spellEnd"/>
+      <w:r>
+        <w:rPr>
+          <w:rFonts w:asciiTheme="minorBidi" w:hAnsiTheme="minorBidi"/>
+        </w:rPr>
+        <w:t xml:space="preserve"> </w:t>
+      </w:r>
+      <w:proofErr w:type="spellStart"/>
+      <w:r>
+        <w:rPr>
+          <w:rFonts w:asciiTheme="minorBidi" w:hAnsiTheme="minorBidi"/>
+        </w:rPr>
+        <w:t>Pelaksanaan</w:t>
+      </w:r>
+      <w:proofErr w:type="spellEnd"/>
+      <w:r>
+        <w:rPr>
+          <w:rFonts w:asciiTheme="minorBidi" w:hAnsiTheme="minorBidi"/>
+        </w:rPr>
+        <w:t xml:space="preserve"> </w:t>
+      </w:r>
+      <w:proofErr w:type="spellStart"/>
+      <w:r>
+        <w:rPr>
+          <w:rFonts w:asciiTheme="minorBidi" w:hAnsiTheme="minorBidi"/>
+        </w:rPr>
+        <w:t>Anggaran</w:t>
+      </w:r>
+      <w:proofErr w:type="spellEnd"/>
+      <w:r>
+        <w:rPr>
+          <w:rFonts w:asciiTheme="minorBidi" w:hAnsiTheme="minorBidi"/>
+        </w:rPr>
+        <w:t xml:space="preserve"> </w:t>
+      </w:r>
+      <w:proofErr w:type="spellStart"/>
+      <w:r>
+        <w:rPr>
+          <w:rFonts w:asciiTheme="minorBidi" w:hAnsiTheme="minorBidi"/>
+        </w:rPr>
+        <w:t>Pendapatan</w:t>
+      </w:r>
+      <w:proofErr w:type="spellEnd"/>
+      <w:r>
+        <w:rPr>
+          <w:rFonts w:asciiTheme="minorBidi" w:hAnsiTheme="minorBidi"/>
+        </w:rPr>
+        <w:t xml:space="preserve"> dan </w:t>
+      </w:r>
+      <w:proofErr w:type="spellStart"/>
+      <w:r>
+        <w:rPr>
+          <w:rFonts w:asciiTheme="minorBidi" w:hAnsiTheme="minorBidi"/>
+        </w:rPr>
+        <w:t>Belanja</w:t>
+      </w:r>
+      <w:proofErr w:type="spellEnd"/>
+      <w:r>
+        <w:rPr>
+          <w:rFonts w:asciiTheme="minorBidi" w:hAnsiTheme="minorBidi"/>
+        </w:rPr>
+        <w:t xml:space="preserve"> Negara jo KEPPRES </w:t>
+      </w:r>
+      <w:proofErr w:type="spellStart"/>
+      <w:r>
+        <w:rPr>
+          <w:rFonts w:asciiTheme="minorBidi" w:hAnsiTheme="minorBidi"/>
+        </w:rPr>
+        <w:t>Nomor</w:t>
+      </w:r>
+      <w:proofErr w:type="spellEnd"/>
+      <w:r>
+        <w:rPr>
+          <w:rFonts w:asciiTheme="minorBidi" w:hAnsiTheme="minorBidi"/>
+        </w:rPr>
+        <w:t xml:space="preserve"> 72 </w:t>
+      </w:r>
+      <w:proofErr w:type="spellStart"/>
+      <w:r>
+        <w:rPr>
+          <w:rFonts w:asciiTheme="minorBidi" w:hAnsiTheme="minorBidi"/>
+        </w:rPr>
+        <w:t>Tahun</w:t>
+      </w:r>
+      <w:proofErr w:type="spellEnd"/>
+      <w:r>
+        <w:rPr>
+          <w:rFonts w:asciiTheme="minorBidi" w:hAnsiTheme="minorBidi"/>
+        </w:rPr>
+        <w:t xml:space="preserve"> 2004;</w:t>
       </w:r>
     </w:p>
     <w:p>
@@ -3162,7 +4595,119 @@
         <w:rPr>
           <w:rFonts w:asciiTheme="minorBidi" w:hAnsiTheme="minorBidi"/>
         </w:rPr>
-        <w:t>Keputusan Presiden RI Nomor 50 Tahun 2004 tentang Perubahan IAIN Sunan Kalijaga menjadi UIN Sunan Kalijaga Yogyakarta;</w:t>
+        <w:t xml:space="preserve">Keputusan </w:t>
+      </w:r>
+      <w:proofErr w:type="spellStart"/>
+      <w:r>
+        <w:rPr>
+          <w:rFonts w:asciiTheme="minorBidi" w:hAnsiTheme="minorBidi"/>
+        </w:rPr>
+        <w:t>Presiden</w:t>
+      </w:r>
+      <w:proofErr w:type="spellEnd"/>
+      <w:r>
+        <w:rPr>
+          <w:rFonts w:asciiTheme="minorBidi" w:hAnsiTheme="minorBidi"/>
+        </w:rPr>
+        <w:t xml:space="preserve"> RI </w:t>
+      </w:r>
+      <w:proofErr w:type="spellStart"/>
+      <w:r>
+        <w:rPr>
+          <w:rFonts w:asciiTheme="minorBidi" w:hAnsiTheme="minorBidi"/>
+        </w:rPr>
+        <w:t>Nomor</w:t>
+      </w:r>
+      <w:proofErr w:type="spellEnd"/>
+      <w:r>
+        <w:rPr>
+          <w:rFonts w:asciiTheme="minorBidi" w:hAnsiTheme="minorBidi"/>
+        </w:rPr>
+        <w:t xml:space="preserve"> 50 </w:t>
+      </w:r>
+      <w:proofErr w:type="spellStart"/>
+      <w:r>
+        <w:rPr>
+          <w:rFonts w:asciiTheme="minorBidi" w:hAnsiTheme="minorBidi"/>
+        </w:rPr>
+        <w:t>Tahun</w:t>
+      </w:r>
+      <w:proofErr w:type="spellEnd"/>
+      <w:r>
+        <w:rPr>
+          <w:rFonts w:asciiTheme="minorBidi" w:hAnsiTheme="minorBidi"/>
+        </w:rPr>
+        <w:t xml:space="preserve"> 2004 </w:t>
+      </w:r>
+      <w:proofErr w:type="spellStart"/>
+      <w:r>
+        <w:rPr>
+          <w:rFonts w:asciiTheme="minorBidi" w:hAnsiTheme="minorBidi"/>
+        </w:rPr>
+        <w:t>tentang</w:t>
+      </w:r>
+      <w:proofErr w:type="spellEnd"/>
+      <w:r>
+        <w:rPr>
+          <w:rFonts w:asciiTheme="minorBidi" w:hAnsiTheme="minorBidi"/>
+        </w:rPr>
+        <w:t xml:space="preserve"> </w:t>
+      </w:r>
+      <w:proofErr w:type="spellStart"/>
+      <w:r>
+        <w:rPr>
+          <w:rFonts w:asciiTheme="minorBidi" w:hAnsiTheme="minorBidi"/>
+        </w:rPr>
+        <w:t>Perubahan</w:t>
+      </w:r>
+      <w:proofErr w:type="spellEnd"/>
+      <w:r>
+        <w:rPr>
+          <w:rFonts w:asciiTheme="minorBidi" w:hAnsiTheme="minorBidi"/>
+        </w:rPr>
+        <w:t xml:space="preserve"> IAIN Sunan </w:t>
+      </w:r>
+      <w:proofErr w:type="spellStart"/>
+      <w:r>
+        <w:rPr>
+          <w:rFonts w:asciiTheme="minorBidi" w:hAnsiTheme="minorBidi"/>
+        </w:rPr>
+        <w:t>Kalijaga</w:t>
+      </w:r>
+      <w:proofErr w:type="spellEnd"/>
+      <w:r>
+        <w:rPr>
+          <w:rFonts w:asciiTheme="minorBidi" w:hAnsiTheme="minorBidi"/>
+        </w:rPr>
+        <w:t xml:space="preserve"> </w:t>
+      </w:r>
+      <w:proofErr w:type="spellStart"/>
+      <w:r>
+        <w:rPr>
+          <w:rFonts w:asciiTheme="minorBidi" w:hAnsiTheme="minorBidi"/>
+        </w:rPr>
+        <w:t>menjadi</w:t>
+      </w:r>
+      <w:proofErr w:type="spellEnd"/>
+      <w:r>
+        <w:rPr>
+          <w:rFonts w:asciiTheme="minorBidi" w:hAnsiTheme="minorBidi"/>
+        </w:rPr>
+        <w:t xml:space="preserve"> UIN Sunan </w:t>
+      </w:r>
+      <w:proofErr w:type="spellStart"/>
+      <w:r>
+        <w:rPr>
+          <w:rFonts w:asciiTheme="minorBidi" w:hAnsiTheme="minorBidi"/>
+        </w:rPr>
+        <w:t>Kalijaga</w:t>
+      </w:r>
+      <w:proofErr w:type="spellEnd"/>
+      <w:r>
+        <w:rPr>
+          <w:rFonts w:asciiTheme="minorBidi" w:hAnsiTheme="minorBidi"/>
+        </w:rPr>
+        <w:t xml:space="preserve"> Yogyakarta;</w:t>
       </w:r>
     </w:p>
     <w:p>
@@ -3177,11 +4722,201 @@
           <w:rFonts w:asciiTheme="minorBidi" w:hAnsiTheme="minorBidi"/>
         </w:rPr>
       </w:pPr>
-      <w:r>
-        <w:rPr>
-          <w:rFonts w:asciiTheme="minorBidi" w:hAnsiTheme="minorBidi"/>
-        </w:rPr>
-        <w:t>Peraturan Menteri Keuangan RI Nomor 162/PMK.05/2013 Tahun 2013 tentang Kedudukan dan Tanggungjawab Bendahara pada Satuan Kerja Pengelola Anggaran Pendapatan dan Belanja Negara;</w:t>
+      <w:proofErr w:type="spellStart"/>
+      <w:r>
+        <w:rPr>
+          <w:rFonts w:asciiTheme="minorBidi" w:hAnsiTheme="minorBidi"/>
+        </w:rPr>
+        <w:t>Peraturan</w:t>
+      </w:r>
+      <w:proofErr w:type="spellEnd"/>
+      <w:r>
+        <w:rPr>
+          <w:rFonts w:asciiTheme="minorBidi" w:hAnsiTheme="minorBidi"/>
+        </w:rPr>
+        <w:t xml:space="preserve"> Menteri </w:t>
+      </w:r>
+      <w:proofErr w:type="spellStart"/>
+      <w:r>
+        <w:rPr>
+          <w:rFonts w:asciiTheme="minorBidi" w:hAnsiTheme="minorBidi"/>
+        </w:rPr>
+        <w:t>Keuangan</w:t>
+      </w:r>
+      <w:proofErr w:type="spellEnd"/>
+      <w:r>
+        <w:rPr>
+          <w:rFonts w:asciiTheme="minorBidi" w:hAnsiTheme="minorBidi"/>
+        </w:rPr>
+        <w:t xml:space="preserve"> RI </w:t>
+      </w:r>
+      <w:proofErr w:type="spellStart"/>
+      <w:r>
+        <w:rPr>
+          <w:rFonts w:asciiTheme="minorBidi" w:hAnsiTheme="minorBidi"/>
+        </w:rPr>
+        <w:t>Nomor</w:t>
+      </w:r>
+      <w:proofErr w:type="spellEnd"/>
+      <w:r>
+        <w:rPr>
+          <w:rFonts w:asciiTheme="minorBidi" w:hAnsiTheme="minorBidi"/>
+        </w:rPr>
+        <w:t xml:space="preserve"> 162/PMK.05/2013 </w:t>
+      </w:r>
+      <w:proofErr w:type="spellStart"/>
+      <w:r>
+        <w:rPr>
+          <w:rFonts w:asciiTheme="minorBidi" w:hAnsiTheme="minorBidi"/>
+        </w:rPr>
+        <w:t>Tahun</w:t>
+      </w:r>
+      <w:proofErr w:type="spellEnd"/>
+      <w:r>
+        <w:rPr>
+          <w:rFonts w:asciiTheme="minorBidi" w:hAnsiTheme="minorBidi"/>
+        </w:rPr>
+        <w:t xml:space="preserve"> 2013 </w:t>
+      </w:r>
+      <w:proofErr w:type="spellStart"/>
+      <w:r>
+        <w:rPr>
+          <w:rFonts w:asciiTheme="minorBidi" w:hAnsiTheme="minorBidi"/>
+        </w:rPr>
+        <w:t>tentang</w:t>
+      </w:r>
+      <w:proofErr w:type="spellEnd"/>
+      <w:r>
+        <w:rPr>
+          <w:rFonts w:asciiTheme="minorBidi" w:hAnsiTheme="minorBidi"/>
+        </w:rPr>
+        <w:t xml:space="preserve"> </w:t>
+      </w:r>
+      <w:proofErr w:type="spellStart"/>
+      <w:r>
+        <w:rPr>
+          <w:rFonts w:asciiTheme="minorBidi" w:hAnsiTheme="minorBidi"/>
+        </w:rPr>
+        <w:t>Kedudukan</w:t>
+      </w:r>
+      <w:proofErr w:type="spellEnd"/>
+      <w:r>
+        <w:rPr>
+          <w:rFonts w:asciiTheme="minorBidi" w:hAnsiTheme="minorBidi"/>
+        </w:rPr>
+        <w:t xml:space="preserve"> dan </w:t>
+      </w:r>
+      <w:proofErr w:type="spellStart"/>
+      <w:r>
+        <w:rPr>
+          <w:rFonts w:asciiTheme="minorBidi" w:hAnsiTheme="minorBidi"/>
+        </w:rPr>
+        <w:t>Tanggungjawab</w:t>
+      </w:r>
+      <w:proofErr w:type="spellEnd"/>
+      <w:r>
+        <w:rPr>
+          <w:rFonts w:asciiTheme="minorBidi" w:hAnsiTheme="minorBidi"/>
+        </w:rPr>
+        <w:t xml:space="preserve"> </w:t>
+      </w:r>
+      <w:proofErr w:type="spellStart"/>
+      <w:r>
+        <w:rPr>
+          <w:rFonts w:asciiTheme="minorBidi" w:hAnsiTheme="minorBidi"/>
+        </w:rPr>
+        <w:t>Bendahara</w:t>
+      </w:r>
+      <w:proofErr w:type="spellEnd"/>
+      <w:r>
+        <w:rPr>
+          <w:rFonts w:asciiTheme="minorBidi" w:hAnsiTheme="minorBidi"/>
+        </w:rPr>
+        <w:t xml:space="preserve"> pada </w:t>
+      </w:r>
+      <w:proofErr w:type="spellStart"/>
+      <w:r>
+        <w:rPr>
+          <w:rFonts w:asciiTheme="minorBidi" w:hAnsiTheme="minorBidi"/>
+        </w:rPr>
+        <w:t>Satuan</w:t>
+      </w:r>
+      <w:proofErr w:type="spellEnd"/>
+      <w:r>
+        <w:rPr>
+          <w:rFonts w:asciiTheme="minorBidi" w:hAnsiTheme="minorBidi"/>
+        </w:rPr>
+        <w:t xml:space="preserve"> </w:t>
+      </w:r>
+      <w:proofErr w:type="spellStart"/>
+      <w:r>
+        <w:rPr>
+          <w:rFonts w:asciiTheme="minorBidi" w:hAnsiTheme="minorBidi"/>
+        </w:rPr>
+        <w:t>Kerja</w:t>
+      </w:r>
+      <w:proofErr w:type="spellEnd"/>
+      <w:r>
+        <w:rPr>
+          <w:rFonts w:asciiTheme="minorBidi" w:hAnsiTheme="minorBidi"/>
+        </w:rPr>
+        <w:t xml:space="preserve"> </w:t>
+      </w:r>
+      <w:proofErr w:type="spellStart"/>
+      <w:r>
+        <w:rPr>
+          <w:rFonts w:asciiTheme="minorBidi" w:hAnsiTheme="minorBidi"/>
+        </w:rPr>
+        <w:t>Pengelola</w:t>
+      </w:r>
+      <w:proofErr w:type="spellEnd"/>
+      <w:r>
+        <w:rPr>
+          <w:rFonts w:asciiTheme="minorBidi" w:hAnsiTheme="minorBidi"/>
+        </w:rPr>
+        <w:t xml:space="preserve"> </w:t>
+      </w:r>
+      <w:proofErr w:type="spellStart"/>
+      <w:r>
+        <w:rPr>
+          <w:rFonts w:asciiTheme="minorBidi" w:hAnsiTheme="minorBidi"/>
+        </w:rPr>
+        <w:t>Anggaran</w:t>
+      </w:r>
+      <w:proofErr w:type="spellEnd"/>
+      <w:r>
+        <w:rPr>
+          <w:rFonts w:asciiTheme="minorBidi" w:hAnsiTheme="minorBidi"/>
+        </w:rPr>
+        <w:t xml:space="preserve"> </w:t>
+      </w:r>
+      <w:proofErr w:type="spellStart"/>
+      <w:r>
+        <w:rPr>
+          <w:rFonts w:asciiTheme="minorBidi" w:hAnsiTheme="minorBidi"/>
+        </w:rPr>
+        <w:t>Pendapatan</w:t>
+      </w:r>
+      <w:proofErr w:type="spellEnd"/>
+      <w:r>
+        <w:rPr>
+          <w:rFonts w:asciiTheme="minorBidi" w:hAnsiTheme="minorBidi"/>
+        </w:rPr>
+        <w:t xml:space="preserve"> dan </w:t>
+      </w:r>
+      <w:proofErr w:type="spellStart"/>
+      <w:r>
+        <w:rPr>
+          <w:rFonts w:asciiTheme="minorBidi" w:hAnsiTheme="minorBidi"/>
+        </w:rPr>
+        <w:t>Belanja</w:t>
+      </w:r>
+      <w:proofErr w:type="spellEnd"/>
+      <w:r>
+        <w:rPr>
+          <w:rFonts w:asciiTheme="minorBidi" w:hAnsiTheme="minorBidi"/>
+        </w:rPr>
+        <w:t xml:space="preserve"> Negara;</w:t>
       </w:r>
     </w:p>
     <w:p>
@@ -3196,11 +4931,75 @@
           <w:rFonts w:asciiTheme="minorBidi" w:hAnsiTheme="minorBidi"/>
         </w:rPr>
       </w:pPr>
-      <w:r>
-        <w:rPr>
-          <w:rFonts w:asciiTheme="minorBidi" w:hAnsiTheme="minorBidi"/>
-        </w:rPr>
-        <w:t>Peraturan Menteri Agama RI Nomor 26 Tahun 2013 tentang Organisasi dan Tata Kerja UIN Sunan Kalijaga Yogyakarta;</w:t>
+      <w:proofErr w:type="spellStart"/>
+      <w:r>
+        <w:rPr>
+          <w:rFonts w:asciiTheme="minorBidi" w:hAnsiTheme="minorBidi"/>
+        </w:rPr>
+        <w:t>Peraturan</w:t>
+      </w:r>
+      <w:proofErr w:type="spellEnd"/>
+      <w:r>
+        <w:rPr>
+          <w:rFonts w:asciiTheme="minorBidi" w:hAnsiTheme="minorBidi"/>
+        </w:rPr>
+        <w:t xml:space="preserve"> Menteri Agama RI </w:t>
+      </w:r>
+      <w:proofErr w:type="spellStart"/>
+      <w:r>
+        <w:rPr>
+          <w:rFonts w:asciiTheme="minorBidi" w:hAnsiTheme="minorBidi"/>
+        </w:rPr>
+        <w:t>Nomor</w:t>
+      </w:r>
+      <w:proofErr w:type="spellEnd"/>
+      <w:r>
+        <w:rPr>
+          <w:rFonts w:asciiTheme="minorBidi" w:hAnsiTheme="minorBidi"/>
+        </w:rPr>
+        <w:t xml:space="preserve"> 26 </w:t>
+      </w:r>
+      <w:proofErr w:type="spellStart"/>
+      <w:r>
+        <w:rPr>
+          <w:rFonts w:asciiTheme="minorBidi" w:hAnsiTheme="minorBidi"/>
+        </w:rPr>
+        <w:t>Tahun</w:t>
+      </w:r>
+      <w:proofErr w:type="spellEnd"/>
+      <w:r>
+        <w:rPr>
+          <w:rFonts w:asciiTheme="minorBidi" w:hAnsiTheme="minorBidi"/>
+        </w:rPr>
+        <w:t xml:space="preserve"> 2013 </w:t>
+      </w:r>
+      <w:proofErr w:type="spellStart"/>
+      <w:r>
+        <w:rPr>
+          <w:rFonts w:asciiTheme="minorBidi" w:hAnsiTheme="minorBidi"/>
+        </w:rPr>
+        <w:t>tentang</w:t>
+      </w:r>
+      <w:proofErr w:type="spellEnd"/>
+      <w:r>
+        <w:rPr>
+          <w:rFonts w:asciiTheme="minorBidi" w:hAnsiTheme="minorBidi"/>
+        </w:rPr>
+        <w:t xml:space="preserve"> Organisasi dan Tata Kerja UIN Sunan </w:t>
+      </w:r>
+      <w:proofErr w:type="spellStart"/>
+      <w:r>
+        <w:rPr>
+          <w:rFonts w:asciiTheme="minorBidi" w:hAnsiTheme="minorBidi"/>
+        </w:rPr>
+        <w:t>Kalijaga</w:t>
+      </w:r>
+      <w:proofErr w:type="spellEnd"/>
+      <w:r>
+        <w:rPr>
+          <w:rFonts w:asciiTheme="minorBidi" w:hAnsiTheme="minorBidi"/>
+        </w:rPr>
+        <w:t xml:space="preserve"> Yogyakarta;</w:t>
       </w:r>
     </w:p>
     <w:p>
@@ -3218,11 +5017,103 @@
           <w:rFonts w:asciiTheme="minorBidi" w:hAnsiTheme="minorBidi"/>
         </w:rPr>
       </w:pPr>
-      <w:r>
-        <w:rPr>
-          <w:rFonts w:asciiTheme="minorBidi" w:hAnsiTheme="minorBidi"/>
-        </w:rPr>
-        <w:t>Peraturan Menteri Agama RI Nomor 22 Tahun 2014 tanggal 13 Agustus 2014 tentang Statuta UIN Sunan Kalijaga Yogyakarta;</w:t>
+      <w:proofErr w:type="spellStart"/>
+      <w:r>
+        <w:rPr>
+          <w:rFonts w:asciiTheme="minorBidi" w:hAnsiTheme="minorBidi"/>
+        </w:rPr>
+        <w:t>Peraturan</w:t>
+      </w:r>
+      <w:proofErr w:type="spellEnd"/>
+      <w:r>
+        <w:rPr>
+          <w:rFonts w:asciiTheme="minorBidi" w:hAnsiTheme="minorBidi"/>
+        </w:rPr>
+        <w:t xml:space="preserve"> Menteri Agama RI </w:t>
+      </w:r>
+      <w:proofErr w:type="spellStart"/>
+      <w:r>
+        <w:rPr>
+          <w:rFonts w:asciiTheme="minorBidi" w:hAnsiTheme="minorBidi"/>
+        </w:rPr>
+        <w:t>Nomor</w:t>
+      </w:r>
+      <w:proofErr w:type="spellEnd"/>
+      <w:r>
+        <w:rPr>
+          <w:rFonts w:asciiTheme="minorBidi" w:hAnsiTheme="minorBidi"/>
+        </w:rPr>
+        <w:t xml:space="preserve"> 22 </w:t>
+      </w:r>
+      <w:proofErr w:type="spellStart"/>
+      <w:r>
+        <w:rPr>
+          <w:rFonts w:asciiTheme="minorBidi" w:hAnsiTheme="minorBidi"/>
+        </w:rPr>
+        <w:t>Tahun</w:t>
+      </w:r>
+      <w:proofErr w:type="spellEnd"/>
+      <w:r>
+        <w:rPr>
+          <w:rFonts w:asciiTheme="minorBidi" w:hAnsiTheme="minorBidi"/>
+        </w:rPr>
+        <w:t xml:space="preserve"> 2014 </w:t>
+      </w:r>
+      <w:proofErr w:type="spellStart"/>
+      <w:r>
+        <w:rPr>
+          <w:rFonts w:asciiTheme="minorBidi" w:hAnsiTheme="minorBidi"/>
+        </w:rPr>
+        <w:t>tanggal</w:t>
+      </w:r>
+      <w:proofErr w:type="spellEnd"/>
+      <w:r>
+        <w:rPr>
+          <w:rFonts w:asciiTheme="minorBidi" w:hAnsiTheme="minorBidi"/>
+        </w:rPr>
+        <w:t xml:space="preserve"> 13 Agustus 2014 </w:t>
+      </w:r>
+      <w:proofErr w:type="spellStart"/>
+      <w:r>
+        <w:rPr>
+          <w:rFonts w:asciiTheme="minorBidi" w:hAnsiTheme="minorBidi"/>
+        </w:rPr>
+        <w:t>tentang</w:t>
+      </w:r>
+      <w:proofErr w:type="spellEnd"/>
+      <w:r>
+        <w:rPr>
+          <w:rFonts w:asciiTheme="minorBidi" w:hAnsiTheme="minorBidi"/>
+        </w:rPr>
+        <w:t xml:space="preserve"> </w:t>
+      </w:r>
+      <w:proofErr w:type="spellStart"/>
+      <w:r>
+        <w:rPr>
+          <w:rFonts w:asciiTheme="minorBidi" w:hAnsiTheme="minorBidi"/>
+        </w:rPr>
+        <w:t>Statuta</w:t>
+      </w:r>
+      <w:proofErr w:type="spellEnd"/>
+      <w:r>
+        <w:rPr>
+          <w:rFonts w:asciiTheme="minorBidi" w:hAnsiTheme="minorBidi"/>
+        </w:rPr>
+        <w:t xml:space="preserve"> UIN Sunan </w:t>
+      </w:r>
+      <w:proofErr w:type="spellStart"/>
+      <w:r>
+        <w:rPr>
+          <w:rFonts w:asciiTheme="minorBidi" w:hAnsiTheme="minorBidi"/>
+        </w:rPr>
+        <w:t>Kalijaga</w:t>
+      </w:r>
+      <w:proofErr w:type="spellEnd"/>
+      <w:r>
+        <w:rPr>
+          <w:rFonts w:asciiTheme="minorBidi" w:hAnsiTheme="minorBidi"/>
+        </w:rPr>
+        <w:t xml:space="preserve"> Yogyakarta;</w:t>
       </w:r>
     </w:p>
     <w:p>
@@ -3240,12 +5131,149 @@
           <w:rFonts w:asciiTheme="minorBidi" w:hAnsiTheme="minorBidi"/>
         </w:rPr>
       </w:pPr>
-      <w:r>
-        <w:rPr>
-          <w:rFonts w:asciiTheme="minorBidi" w:hAnsiTheme="minorBidi"/>
-          <w:bCs/>
-        </w:rPr>
-        <w:t>Peraturan Menteri Keuangan No 60/PMK.02/2021 Tahun 2021 Tanggal 08 Juni 2021 tentang Standar Biaya Masukan Tahun 2022;</w:t>
+      <w:proofErr w:type="spellStart"/>
+      <w:r>
+        <w:rPr>
+          <w:rFonts w:asciiTheme="minorBidi" w:hAnsiTheme="minorBidi"/>
+          <w:bCs/>
+        </w:rPr>
+        <w:t>Peraturan</w:t>
+      </w:r>
+      <w:proofErr w:type="spellEnd"/>
+      <w:r>
+        <w:rPr>
+          <w:rFonts w:asciiTheme="minorBidi" w:hAnsiTheme="minorBidi"/>
+          <w:bCs/>
+        </w:rPr>
+        <w:t xml:space="preserve"> Menteri </w:t>
+      </w:r>
+      <w:proofErr w:type="spellStart"/>
+      <w:r>
+        <w:rPr>
+          <w:rFonts w:asciiTheme="minorBidi" w:hAnsiTheme="minorBidi"/>
+          <w:bCs/>
+        </w:rPr>
+        <w:t>Keuangan</w:t>
+      </w:r>
+      <w:proofErr w:type="spellEnd"/>
+      <w:r>
+        <w:rPr>
+          <w:rFonts w:asciiTheme="minorBidi" w:hAnsiTheme="minorBidi"/>
+          <w:bCs/>
+        </w:rPr>
+        <w:t xml:space="preserve"> No 60/PMK.02/2021 </w:t>
+      </w:r>
+      <w:proofErr w:type="spellStart"/>
+      <w:r>
+        <w:rPr>
+          <w:rFonts w:asciiTheme="minorBidi" w:hAnsiTheme="minorBidi"/>
+          <w:bCs/>
+        </w:rPr>
+        <w:t>Tahun</w:t>
+      </w:r>
+      <w:proofErr w:type="spellEnd"/>
+      <w:r>
+        <w:rPr>
+          <w:rFonts w:asciiTheme="minorBidi" w:hAnsiTheme="minorBidi"/>
+          <w:bCs/>
+        </w:rPr>
+        <w:t xml:space="preserve"> 2021 </w:t>
+      </w:r>
+      <w:proofErr w:type="spellStart"/>
+      <w:r>
+        <w:rPr>
+          <w:rFonts w:asciiTheme="minorBidi" w:hAnsiTheme="minorBidi"/>
+          <w:bCs/>
+        </w:rPr>
+        <w:t>Tanggal</w:t>
+      </w:r>
+      <w:proofErr w:type="spellEnd"/>
+      <w:r>
+        <w:rPr>
+          <w:rFonts w:asciiTheme="minorBidi" w:hAnsiTheme="minorBidi"/>
+          <w:bCs/>
+        </w:rPr>
+        <w:t xml:space="preserve"> 08 Juni 2021 </w:t>
+      </w:r>
+      <w:proofErr w:type="spellStart"/>
+      <w:r>
+        <w:rPr>
+          <w:rFonts w:asciiTheme="minorBidi" w:hAnsiTheme="minorBidi"/>
+          <w:bCs/>
+        </w:rPr>
+        <w:t>tentang</w:t>
+      </w:r>
+      <w:proofErr w:type="spellEnd"/>
+      <w:r>
+        <w:rPr>
+          <w:rFonts w:asciiTheme="minorBidi" w:hAnsiTheme="minorBidi"/>
+          <w:bCs/>
+        </w:rPr>
+        <w:t xml:space="preserve"> </w:t>
+      </w:r>
+      <w:proofErr w:type="spellStart"/>
+      <w:r>
+        <w:rPr>
+          <w:rFonts w:asciiTheme="minorBidi" w:hAnsiTheme="minorBidi"/>
+          <w:bCs/>
+        </w:rPr>
+        <w:t>Standar</w:t>
+      </w:r>
+      <w:proofErr w:type="spellEnd"/>
+      <w:r>
+        <w:rPr>
+          <w:rFonts w:asciiTheme="minorBidi" w:hAnsiTheme="minorBidi"/>
+          <w:bCs/>
+        </w:rPr>
+        <w:t xml:space="preserve"> </w:t>
+      </w:r>
+      <w:proofErr w:type="spellStart"/>
+      <w:r>
+        <w:rPr>
+          <w:rFonts w:asciiTheme="minorBidi" w:hAnsiTheme="minorBidi"/>
+          <w:bCs/>
+        </w:rPr>
+        <w:t>Biaya</w:t>
+      </w:r>
+      <w:proofErr w:type="spellEnd"/>
+      <w:r>
+        <w:rPr>
+          <w:rFonts w:asciiTheme="minorBidi" w:hAnsiTheme="minorBidi"/>
+          <w:bCs/>
+        </w:rPr>
+        <w:t xml:space="preserve"> </w:t>
+      </w:r>
+      <w:proofErr w:type="spellStart"/>
+      <w:r>
+        <w:rPr>
+          <w:rFonts w:asciiTheme="minorBidi" w:hAnsiTheme="minorBidi"/>
+          <w:bCs/>
+        </w:rPr>
+        <w:t>Masukan</w:t>
+      </w:r>
+      <w:proofErr w:type="spellEnd"/>
+      <w:r>
+        <w:rPr>
+          <w:rFonts w:asciiTheme="minorBidi" w:hAnsiTheme="minorBidi"/>
+          <w:bCs/>
+        </w:rPr>
+        <w:t xml:space="preserve"> </w:t>
+      </w:r>
+      <w:proofErr w:type="spellStart"/>
+      <w:r>
+        <w:rPr>
+          <w:rFonts w:asciiTheme="minorBidi" w:hAnsiTheme="minorBidi"/>
+          <w:bCs/>
+        </w:rPr>
+        <w:t>Tahun</w:t>
+      </w:r>
+      <w:proofErr w:type="spellEnd"/>
+      <w:r>
+        <w:rPr>
+          <w:rFonts w:asciiTheme="minorBidi" w:hAnsiTheme="minorBidi"/>
+          <w:bCs/>
+        </w:rPr>
+        <w:t xml:space="preserve"> 2022;</w:t>
       </w:r>
     </w:p>
     <w:p>
@@ -3260,11 +5288,173 @@
           <w:rFonts w:asciiTheme="minorBidi" w:hAnsiTheme="minorBidi"/>
         </w:rPr>
       </w:pPr>
-      <w:r>
-        <w:rPr>
-          <w:rFonts w:asciiTheme="minorBidi" w:hAnsiTheme="minorBidi"/>
-        </w:rPr>
-        <w:t>Peraturan Menteri Agama RI Nomor 63 Tahun 2016 tanggal Perubahan Atas Peraturan Menteri Agama RI Nomor 45 Tahun 2014 tanggal 17 Oktober 2014 tentang Pejabat Perbendaharaan Negara pada Kementerian Agama RI.</w:t>
+      <w:proofErr w:type="spellStart"/>
+      <w:r>
+        <w:rPr>
+          <w:rFonts w:asciiTheme="minorBidi" w:hAnsiTheme="minorBidi"/>
+        </w:rPr>
+        <w:t>Peraturan</w:t>
+      </w:r>
+      <w:proofErr w:type="spellEnd"/>
+      <w:r>
+        <w:rPr>
+          <w:rFonts w:asciiTheme="minorBidi" w:hAnsiTheme="minorBidi"/>
+        </w:rPr>
+        <w:t xml:space="preserve"> Menteri Agama RI </w:t>
+      </w:r>
+      <w:proofErr w:type="spellStart"/>
+      <w:r>
+        <w:rPr>
+          <w:rFonts w:asciiTheme="minorBidi" w:hAnsiTheme="minorBidi"/>
+        </w:rPr>
+        <w:t>Nomor</w:t>
+      </w:r>
+      <w:proofErr w:type="spellEnd"/>
+      <w:r>
+        <w:rPr>
+          <w:rFonts w:asciiTheme="minorBidi" w:hAnsiTheme="minorBidi"/>
+        </w:rPr>
+        <w:t xml:space="preserve"> 63 </w:t>
+      </w:r>
+      <w:proofErr w:type="spellStart"/>
+      <w:r>
+        <w:rPr>
+          <w:rFonts w:asciiTheme="minorBidi" w:hAnsiTheme="minorBidi"/>
+        </w:rPr>
+        <w:t>Tahun</w:t>
+      </w:r>
+      <w:proofErr w:type="spellEnd"/>
+      <w:r>
+        <w:rPr>
+          <w:rFonts w:asciiTheme="minorBidi" w:hAnsiTheme="minorBidi"/>
+        </w:rPr>
+        <w:t xml:space="preserve"> 2016 </w:t>
+      </w:r>
+      <w:proofErr w:type="spellStart"/>
+      <w:r>
+        <w:rPr>
+          <w:rFonts w:asciiTheme="minorBidi" w:hAnsiTheme="minorBidi"/>
+        </w:rPr>
+        <w:t>tanggal</w:t>
+      </w:r>
+      <w:proofErr w:type="spellEnd"/>
+      <w:r>
+        <w:rPr>
+          <w:rFonts w:asciiTheme="minorBidi" w:hAnsiTheme="minorBidi"/>
+        </w:rPr>
+        <w:t xml:space="preserve"> </w:t>
+      </w:r>
+      <w:proofErr w:type="spellStart"/>
+      <w:r>
+        <w:rPr>
+          <w:rFonts w:asciiTheme="minorBidi" w:hAnsiTheme="minorBidi"/>
+        </w:rPr>
+        <w:t>Perubahan</w:t>
+      </w:r>
+      <w:proofErr w:type="spellEnd"/>
+      <w:r>
+        <w:rPr>
+          <w:rFonts w:asciiTheme="minorBidi" w:hAnsiTheme="minorBidi"/>
+        </w:rPr>
+        <w:t xml:space="preserve"> Atas </w:t>
+      </w:r>
+      <w:proofErr w:type="spellStart"/>
+      <w:r>
+        <w:rPr>
+          <w:rFonts w:asciiTheme="minorBidi" w:hAnsiTheme="minorBidi"/>
+        </w:rPr>
+        <w:t>Peraturan</w:t>
+      </w:r>
+      <w:proofErr w:type="spellEnd"/>
+      <w:r>
+        <w:rPr>
+          <w:rFonts w:asciiTheme="minorBidi" w:hAnsiTheme="minorBidi"/>
+        </w:rPr>
+        <w:t xml:space="preserve"> Menteri Agama RI </w:t>
+      </w:r>
+      <w:proofErr w:type="spellStart"/>
+      <w:r>
+        <w:rPr>
+          <w:rFonts w:asciiTheme="minorBidi" w:hAnsiTheme="minorBidi"/>
+        </w:rPr>
+        <w:t>Nomor</w:t>
+      </w:r>
+      <w:proofErr w:type="spellEnd"/>
+      <w:r>
+        <w:rPr>
+          <w:rFonts w:asciiTheme="minorBidi" w:hAnsiTheme="minorBidi"/>
+        </w:rPr>
+        <w:t xml:space="preserve"> 45 </w:t>
+      </w:r>
+      <w:proofErr w:type="spellStart"/>
+      <w:r>
+        <w:rPr>
+          <w:rFonts w:asciiTheme="minorBidi" w:hAnsiTheme="minorBidi"/>
+        </w:rPr>
+        <w:t>Tahun</w:t>
+      </w:r>
+      <w:proofErr w:type="spellEnd"/>
+      <w:r>
+        <w:rPr>
+          <w:rFonts w:asciiTheme="minorBidi" w:hAnsiTheme="minorBidi"/>
+        </w:rPr>
+        <w:t xml:space="preserve"> 2014 </w:t>
+      </w:r>
+      <w:proofErr w:type="spellStart"/>
+      <w:r>
+        <w:rPr>
+          <w:rFonts w:asciiTheme="minorBidi" w:hAnsiTheme="minorBidi"/>
+        </w:rPr>
+        <w:t>tanggal</w:t>
+      </w:r>
+      <w:proofErr w:type="spellEnd"/>
+      <w:r>
+        <w:rPr>
+          <w:rFonts w:asciiTheme="minorBidi" w:hAnsiTheme="minorBidi"/>
+        </w:rPr>
+        <w:t xml:space="preserve"> 17 Oktober 2014 </w:t>
+      </w:r>
+      <w:proofErr w:type="spellStart"/>
+      <w:r>
+        <w:rPr>
+          <w:rFonts w:asciiTheme="minorBidi" w:hAnsiTheme="minorBidi"/>
+        </w:rPr>
+        <w:t>tentang</w:t>
+      </w:r>
+      <w:proofErr w:type="spellEnd"/>
+      <w:r>
+        <w:rPr>
+          <w:rFonts w:asciiTheme="minorBidi" w:hAnsiTheme="minorBidi"/>
+        </w:rPr>
+        <w:t xml:space="preserve"> </w:t>
+      </w:r>
+      <w:proofErr w:type="spellStart"/>
+      <w:r>
+        <w:rPr>
+          <w:rFonts w:asciiTheme="minorBidi" w:hAnsiTheme="minorBidi"/>
+        </w:rPr>
+        <w:t>Pejabat</w:t>
+      </w:r>
+      <w:proofErr w:type="spellEnd"/>
+      <w:r>
+        <w:rPr>
+          <w:rFonts w:asciiTheme="minorBidi" w:hAnsiTheme="minorBidi"/>
+        </w:rPr>
+        <w:t xml:space="preserve"> </w:t>
+      </w:r>
+      <w:proofErr w:type="spellStart"/>
+      <w:r>
+        <w:rPr>
+          <w:rFonts w:asciiTheme="minorBidi" w:hAnsiTheme="minorBidi"/>
+        </w:rPr>
+        <w:t>Perbendaharaan</w:t>
+      </w:r>
+      <w:proofErr w:type="spellEnd"/>
+      <w:r>
+        <w:rPr>
+          <w:rFonts w:asciiTheme="minorBidi" w:hAnsiTheme="minorBidi"/>
+        </w:rPr>
+        <w:t xml:space="preserve"> Negara pada Kementerian Agama RI.</w:t>
       </w:r>
     </w:p>
     <w:p>
@@ -3282,11 +5472,159 @@
           <w:rFonts w:asciiTheme="minorBidi" w:hAnsiTheme="minorBidi"/>
         </w:rPr>
       </w:pPr>
-      <w:r>
-        <w:rPr>
-          <w:rFonts w:asciiTheme="minorBidi" w:hAnsiTheme="minorBidi"/>
-        </w:rPr>
-        <w:t>Peraturan Menteri Agama Republik Indonesia Nomor 32 Tahun 2021 tentang Perubahan Peraturan Menteri Agama Nomor 6 Tahun 2020 tentang Pejabat Perbendaharaan Negara pada Kementerian Agama;</w:t>
+      <w:proofErr w:type="spellStart"/>
+      <w:r>
+        <w:rPr>
+          <w:rFonts w:asciiTheme="minorBidi" w:hAnsiTheme="minorBidi"/>
+        </w:rPr>
+        <w:t>Peraturan</w:t>
+      </w:r>
+      <w:proofErr w:type="spellEnd"/>
+      <w:r>
+        <w:rPr>
+          <w:rFonts w:asciiTheme="minorBidi" w:hAnsiTheme="minorBidi"/>
+        </w:rPr>
+        <w:t xml:space="preserve"> Menteri Agama Republik Indonesia </w:t>
+      </w:r>
+      <w:proofErr w:type="spellStart"/>
+      <w:r>
+        <w:rPr>
+          <w:rFonts w:asciiTheme="minorBidi" w:hAnsiTheme="minorBidi"/>
+        </w:rPr>
+        <w:t>Nomor</w:t>
+      </w:r>
+      <w:proofErr w:type="spellEnd"/>
+      <w:r>
+        <w:rPr>
+          <w:rFonts w:asciiTheme="minorBidi" w:hAnsiTheme="minorBidi"/>
+        </w:rPr>
+        <w:t xml:space="preserve"> 32 </w:t>
+      </w:r>
+      <w:proofErr w:type="spellStart"/>
+      <w:r>
+        <w:rPr>
+          <w:rFonts w:asciiTheme="minorBidi" w:hAnsiTheme="minorBidi"/>
+        </w:rPr>
+        <w:t>Tahun</w:t>
+      </w:r>
+      <w:proofErr w:type="spellEnd"/>
+      <w:r>
+        <w:rPr>
+          <w:rFonts w:asciiTheme="minorBidi" w:hAnsiTheme="minorBidi"/>
+        </w:rPr>
+        <w:t xml:space="preserve"> 2021 </w:t>
+      </w:r>
+      <w:proofErr w:type="spellStart"/>
+      <w:r>
+        <w:rPr>
+          <w:rFonts w:asciiTheme="minorBidi" w:hAnsiTheme="minorBidi"/>
+        </w:rPr>
+        <w:t>tentang</w:t>
+      </w:r>
+      <w:proofErr w:type="spellEnd"/>
+      <w:r>
+        <w:rPr>
+          <w:rFonts w:asciiTheme="minorBidi" w:hAnsiTheme="minorBidi"/>
+        </w:rPr>
+        <w:t xml:space="preserve"> </w:t>
+      </w:r>
+      <w:proofErr w:type="spellStart"/>
+      <w:r>
+        <w:rPr>
+          <w:rFonts w:asciiTheme="minorBidi" w:hAnsiTheme="minorBidi"/>
+        </w:rPr>
+        <w:t>Perubahan</w:t>
+      </w:r>
+      <w:proofErr w:type="spellEnd"/>
+      <w:r>
+        <w:rPr>
+          <w:rFonts w:asciiTheme="minorBidi" w:hAnsiTheme="minorBidi"/>
+        </w:rPr>
+        <w:t xml:space="preserve"> </w:t>
+      </w:r>
+      <w:proofErr w:type="spellStart"/>
+      <w:r>
+        <w:rPr>
+          <w:rFonts w:asciiTheme="minorBidi" w:hAnsiTheme="minorBidi"/>
+        </w:rPr>
+        <w:t>Peraturan</w:t>
+      </w:r>
+      <w:proofErr w:type="spellEnd"/>
+      <w:r>
+        <w:rPr>
+          <w:rFonts w:asciiTheme="minorBidi" w:hAnsiTheme="minorBidi"/>
+        </w:rPr>
+        <w:t xml:space="preserve"> Menteri Agama </w:t>
+      </w:r>
+      <w:proofErr w:type="spellStart"/>
+      <w:r>
+        <w:rPr>
+          <w:rFonts w:asciiTheme="minorBidi" w:hAnsiTheme="minorBidi"/>
+        </w:rPr>
+        <w:t>Nomor</w:t>
+      </w:r>
+      <w:proofErr w:type="spellEnd"/>
+      <w:r>
+        <w:rPr>
+          <w:rFonts w:asciiTheme="minorBidi" w:hAnsiTheme="minorBidi"/>
+        </w:rPr>
+        <w:t xml:space="preserve"> 6 </w:t>
+      </w:r>
+      <w:proofErr w:type="spellStart"/>
+      <w:r>
+        <w:rPr>
+          <w:rFonts w:asciiTheme="minorBidi" w:hAnsiTheme="minorBidi"/>
+        </w:rPr>
+        <w:t>Tahun</w:t>
+      </w:r>
+      <w:proofErr w:type="spellEnd"/>
+      <w:r>
+        <w:rPr>
+          <w:rFonts w:asciiTheme="minorBidi" w:hAnsiTheme="minorBidi"/>
+        </w:rPr>
+        <w:t xml:space="preserve"> 2020 </w:t>
+      </w:r>
+      <w:proofErr w:type="spellStart"/>
+      <w:r>
+        <w:rPr>
+          <w:rFonts w:asciiTheme="minorBidi" w:hAnsiTheme="minorBidi"/>
+        </w:rPr>
+        <w:t>tentang</w:t>
+      </w:r>
+      <w:proofErr w:type="spellEnd"/>
+      <w:r>
+        <w:rPr>
+          <w:rFonts w:asciiTheme="minorBidi" w:hAnsiTheme="minorBidi"/>
+        </w:rPr>
+        <w:t xml:space="preserve"> </w:t>
+      </w:r>
+      <w:proofErr w:type="spellStart"/>
+      <w:r>
+        <w:rPr>
+          <w:rFonts w:asciiTheme="minorBidi" w:hAnsiTheme="minorBidi"/>
+        </w:rPr>
+        <w:t>Pejabat</w:t>
+      </w:r>
+      <w:proofErr w:type="spellEnd"/>
+      <w:r>
+        <w:rPr>
+          <w:rFonts w:asciiTheme="minorBidi" w:hAnsiTheme="minorBidi"/>
+        </w:rPr>
+        <w:t xml:space="preserve"> </w:t>
+      </w:r>
+      <w:proofErr w:type="spellStart"/>
+      <w:r>
+        <w:rPr>
+          <w:rFonts w:asciiTheme="minorBidi" w:hAnsiTheme="minorBidi"/>
+        </w:rPr>
+        <w:t>Perbendaharaan</w:t>
+      </w:r>
+      <w:proofErr w:type="spellEnd"/>
+      <w:r>
+        <w:rPr>
+          <w:rFonts w:asciiTheme="minorBidi" w:hAnsiTheme="minorBidi"/>
+        </w:rPr>
+        <w:t xml:space="preserve"> Negara pada Kementerian Agama;</w:t>
       </w:r>
     </w:p>
     <w:p>
@@ -3308,14 +5646,148 @@
         <w:rPr>
           <w:rFonts w:asciiTheme="minorBidi" w:hAnsiTheme="minorBidi"/>
         </w:rPr>
-        <w:t xml:space="preserve">Keputusan Menteri Keuangan Nomor 301/KMK.05/2007 tentang Penetapan Universitas Islam Negeri Sunan Kalijaga Yogyakarta pada Departemen Agama </w:t>
-      </w:r>
+        <w:t xml:space="preserve">Keputusan Menteri Keuangan </w:t>
+      </w:r>
+      <w:proofErr w:type="spellStart"/>
+      <w:r>
+        <w:rPr>
+          <w:rFonts w:asciiTheme="minorBidi" w:hAnsiTheme="minorBidi"/>
+        </w:rPr>
+        <w:t>Nomor</w:t>
+      </w:r>
+      <w:proofErr w:type="spellEnd"/>
+      <w:r>
+        <w:rPr>
+          <w:rFonts w:asciiTheme="minorBidi" w:hAnsiTheme="minorBidi"/>
+        </w:rPr>
+        <w:t xml:space="preserve"> 301/KMK.05/2007 </w:t>
+      </w:r>
+      <w:proofErr w:type="spellStart"/>
+      <w:r>
+        <w:rPr>
+          <w:rFonts w:asciiTheme="minorBidi" w:hAnsiTheme="minorBidi"/>
+        </w:rPr>
+        <w:t>tentang</w:t>
+      </w:r>
+      <w:proofErr w:type="spellEnd"/>
+      <w:r>
+        <w:rPr>
+          <w:rFonts w:asciiTheme="minorBidi" w:hAnsiTheme="minorBidi"/>
+        </w:rPr>
+        <w:t xml:space="preserve"> </w:t>
+      </w:r>
+      <w:proofErr w:type="spellStart"/>
+      <w:r>
+        <w:rPr>
+          <w:rFonts w:asciiTheme="minorBidi" w:hAnsiTheme="minorBidi"/>
+        </w:rPr>
+        <w:t>Penetapan</w:t>
+      </w:r>
+      <w:proofErr w:type="spellEnd"/>
+      <w:r>
+        <w:rPr>
+          <w:rFonts w:asciiTheme="minorBidi" w:hAnsiTheme="minorBidi"/>
+        </w:rPr>
+        <w:t xml:space="preserve"> Universitas Islam Negeri Sunan </w:t>
+      </w:r>
+      <w:proofErr w:type="spellStart"/>
+      <w:r>
+        <w:rPr>
+          <w:rFonts w:asciiTheme="minorBidi" w:hAnsiTheme="minorBidi"/>
+        </w:rPr>
+        <w:t>Kalijaga</w:t>
+      </w:r>
+      <w:proofErr w:type="spellEnd"/>
+      <w:r>
+        <w:rPr>
+          <w:rFonts w:asciiTheme="minorBidi" w:hAnsiTheme="minorBidi"/>
+        </w:rPr>
+        <w:t xml:space="preserve"> Yogyakarta pada Departemen Agama </w:t>
+      </w:r>
+      <w:proofErr w:type="spellStart"/>
       <w:r>
         <w:rPr>
           <w:rFonts w:asciiTheme="minorBidi" w:hAnsiTheme="minorBidi"/>
         </w:rPr>
         <w:lastRenderedPageBreak/>
-        <w:t>sebagai Instansi Pemerintah yang Menerapkan Pola Pengelolaan Keuangan Badan Layanan Umum;</w:t>
+        <w:t>sebagai</w:t>
+      </w:r>
+      <w:proofErr w:type="spellEnd"/>
+      <w:r>
+        <w:rPr>
+          <w:rFonts w:asciiTheme="minorBidi" w:hAnsiTheme="minorBidi"/>
+        </w:rPr>
+        <w:t xml:space="preserve"> </w:t>
+      </w:r>
+      <w:proofErr w:type="spellStart"/>
+      <w:r>
+        <w:rPr>
+          <w:rFonts w:asciiTheme="minorBidi" w:hAnsiTheme="minorBidi"/>
+        </w:rPr>
+        <w:t>Instansi</w:t>
+      </w:r>
+      <w:proofErr w:type="spellEnd"/>
+      <w:r>
+        <w:rPr>
+          <w:rFonts w:asciiTheme="minorBidi" w:hAnsiTheme="minorBidi"/>
+        </w:rPr>
+        <w:t xml:space="preserve"> </w:t>
+      </w:r>
+      <w:proofErr w:type="spellStart"/>
+      <w:r>
+        <w:rPr>
+          <w:rFonts w:asciiTheme="minorBidi" w:hAnsiTheme="minorBidi"/>
+        </w:rPr>
+        <w:t>Pemerintah</w:t>
+      </w:r>
+      <w:proofErr w:type="spellEnd"/>
+      <w:r>
+        <w:rPr>
+          <w:rFonts w:asciiTheme="minorBidi" w:hAnsiTheme="minorBidi"/>
+        </w:rPr>
+        <w:t xml:space="preserve"> yang </w:t>
+      </w:r>
+      <w:proofErr w:type="spellStart"/>
+      <w:r>
+        <w:rPr>
+          <w:rFonts w:asciiTheme="minorBidi" w:hAnsiTheme="minorBidi"/>
+        </w:rPr>
+        <w:t>Menerapkan</w:t>
+      </w:r>
+      <w:proofErr w:type="spellEnd"/>
+      <w:r>
+        <w:rPr>
+          <w:rFonts w:asciiTheme="minorBidi" w:hAnsiTheme="minorBidi"/>
+        </w:rPr>
+        <w:t xml:space="preserve"> Pola </w:t>
+      </w:r>
+      <w:proofErr w:type="spellStart"/>
+      <w:r>
+        <w:rPr>
+          <w:rFonts w:asciiTheme="minorBidi" w:hAnsiTheme="minorBidi"/>
+        </w:rPr>
+        <w:t>Pengelolaan</w:t>
+      </w:r>
+      <w:proofErr w:type="spellEnd"/>
+      <w:r>
+        <w:rPr>
+          <w:rFonts w:asciiTheme="minorBidi" w:hAnsiTheme="minorBidi"/>
+        </w:rPr>
+        <w:t xml:space="preserve"> </w:t>
+      </w:r>
+      <w:proofErr w:type="spellStart"/>
+      <w:r>
+        <w:rPr>
+          <w:rFonts w:asciiTheme="minorBidi" w:hAnsiTheme="minorBidi"/>
+        </w:rPr>
+        <w:t>Keuangan</w:t>
+      </w:r>
+      <w:proofErr w:type="spellEnd"/>
+      <w:r>
+        <w:rPr>
+          <w:rFonts w:asciiTheme="minorBidi" w:hAnsiTheme="minorBidi"/>
+        </w:rPr>
+        <w:t xml:space="preserve"> Badan Layanan Umum;</w:t>
       </w:r>
     </w:p>
     <w:p>
@@ -3337,7 +5809,273 @@
         <w:rPr>
           <w:rFonts w:asciiTheme="minorBidi" w:hAnsiTheme="minorBidi"/>
         </w:rPr>
-        <w:t>Keputusan Menteri Agama RI Nomor 1 Tahun 2012 tentang Perubahan Ketiga atas Peraturan Menteri Agama Nomor 2 Tahun 2006 tentang Mekanisme Pelaksanaan Pembayaran atas Beban Anggaran Pendapatan dan Belanja Negara di Lingkungan Depertemen Agama;</w:t>
+        <w:t xml:space="preserve">Keputusan Menteri Agama RI </w:t>
+      </w:r>
+      <w:proofErr w:type="spellStart"/>
+      <w:r>
+        <w:rPr>
+          <w:rFonts w:asciiTheme="minorBidi" w:hAnsiTheme="minorBidi"/>
+        </w:rPr>
+        <w:t>Nomor</w:t>
+      </w:r>
+      <w:proofErr w:type="spellEnd"/>
+      <w:r>
+        <w:rPr>
+          <w:rFonts w:asciiTheme="minorBidi" w:hAnsiTheme="minorBidi"/>
+        </w:rPr>
+        <w:t xml:space="preserve"> 1 </w:t>
+      </w:r>
+      <w:proofErr w:type="spellStart"/>
+      <w:r>
+        <w:rPr>
+          <w:rFonts w:asciiTheme="minorBidi" w:hAnsiTheme="minorBidi"/>
+        </w:rPr>
+        <w:t>Tahun</w:t>
+      </w:r>
+      <w:proofErr w:type="spellEnd"/>
+      <w:r>
+        <w:rPr>
+          <w:rFonts w:asciiTheme="minorBidi" w:hAnsiTheme="minorBidi"/>
+        </w:rPr>
+        <w:t xml:space="preserve"> 2012 </w:t>
+      </w:r>
+      <w:proofErr w:type="spellStart"/>
+      <w:r>
+        <w:rPr>
+          <w:rFonts w:asciiTheme="minorBidi" w:hAnsiTheme="minorBidi"/>
+        </w:rPr>
+        <w:t>tentang</w:t>
+      </w:r>
+      <w:proofErr w:type="spellEnd"/>
+      <w:r>
+        <w:rPr>
+          <w:rFonts w:asciiTheme="minorBidi" w:hAnsiTheme="minorBidi"/>
+        </w:rPr>
+        <w:t xml:space="preserve"> </w:t>
+      </w:r>
+      <w:proofErr w:type="spellStart"/>
+      <w:r>
+        <w:rPr>
+          <w:rFonts w:asciiTheme="minorBidi" w:hAnsiTheme="minorBidi"/>
+        </w:rPr>
+        <w:t>Perubahan</w:t>
+      </w:r>
+      <w:proofErr w:type="spellEnd"/>
+      <w:r>
+        <w:rPr>
+          <w:rFonts w:asciiTheme="minorBidi" w:hAnsiTheme="minorBidi"/>
+        </w:rPr>
+        <w:t xml:space="preserve"> </w:t>
+      </w:r>
+      <w:proofErr w:type="spellStart"/>
+      <w:r>
+        <w:rPr>
+          <w:rFonts w:asciiTheme="minorBidi" w:hAnsiTheme="minorBidi"/>
+        </w:rPr>
+        <w:t>Ketiga</w:t>
+      </w:r>
+      <w:proofErr w:type="spellEnd"/>
+      <w:r>
+        <w:rPr>
+          <w:rFonts w:asciiTheme="minorBidi" w:hAnsiTheme="minorBidi"/>
+        </w:rPr>
+        <w:t xml:space="preserve"> </w:t>
+      </w:r>
+      <w:proofErr w:type="spellStart"/>
+      <w:r>
+        <w:rPr>
+          <w:rFonts w:asciiTheme="minorBidi" w:hAnsiTheme="minorBidi"/>
+        </w:rPr>
+        <w:t>atas</w:t>
+      </w:r>
+      <w:proofErr w:type="spellEnd"/>
+      <w:r>
+        <w:rPr>
+          <w:rFonts w:asciiTheme="minorBidi" w:hAnsiTheme="minorBidi"/>
+        </w:rPr>
+        <w:t xml:space="preserve"> </w:t>
+      </w:r>
+      <w:proofErr w:type="spellStart"/>
+      <w:r>
+        <w:rPr>
+          <w:rFonts w:asciiTheme="minorBidi" w:hAnsiTheme="minorBidi"/>
+        </w:rPr>
+        <w:t>Peraturan</w:t>
+      </w:r>
+      <w:proofErr w:type="spellEnd"/>
+      <w:r>
+        <w:rPr>
+          <w:rFonts w:asciiTheme="minorBidi" w:hAnsiTheme="minorBidi"/>
+        </w:rPr>
+        <w:t xml:space="preserve"> Menteri Agama </w:t>
+      </w:r>
+      <w:proofErr w:type="spellStart"/>
+      <w:r>
+        <w:rPr>
+          <w:rFonts w:asciiTheme="minorBidi" w:hAnsiTheme="minorBidi"/>
+        </w:rPr>
+        <w:t>Nomor</w:t>
+      </w:r>
+      <w:proofErr w:type="spellEnd"/>
+      <w:r>
+        <w:rPr>
+          <w:rFonts w:asciiTheme="minorBidi" w:hAnsiTheme="minorBidi"/>
+        </w:rPr>
+        <w:t xml:space="preserve"> 2 </w:t>
+      </w:r>
+      <w:proofErr w:type="spellStart"/>
+      <w:r>
+        <w:rPr>
+          <w:rFonts w:asciiTheme="minorBidi" w:hAnsiTheme="minorBidi"/>
+        </w:rPr>
+        <w:t>Tahun</w:t>
+      </w:r>
+      <w:proofErr w:type="spellEnd"/>
+      <w:r>
+        <w:rPr>
+          <w:rFonts w:asciiTheme="minorBidi" w:hAnsiTheme="minorBidi"/>
+        </w:rPr>
+        <w:t xml:space="preserve"> 2006 </w:t>
+      </w:r>
+      <w:proofErr w:type="spellStart"/>
+      <w:r>
+        <w:rPr>
+          <w:rFonts w:asciiTheme="minorBidi" w:hAnsiTheme="minorBidi"/>
+        </w:rPr>
+        <w:t>tentang</w:t>
+      </w:r>
+      <w:proofErr w:type="spellEnd"/>
+      <w:r>
+        <w:rPr>
+          <w:rFonts w:asciiTheme="minorBidi" w:hAnsiTheme="minorBidi"/>
+        </w:rPr>
+        <w:t xml:space="preserve"> </w:t>
+      </w:r>
+      <w:proofErr w:type="spellStart"/>
+      <w:r>
+        <w:rPr>
+          <w:rFonts w:asciiTheme="minorBidi" w:hAnsiTheme="minorBidi"/>
+        </w:rPr>
+        <w:t>Mekanisme</w:t>
+      </w:r>
+      <w:proofErr w:type="spellEnd"/>
+      <w:r>
+        <w:rPr>
+          <w:rFonts w:asciiTheme="minorBidi" w:hAnsiTheme="minorBidi"/>
+        </w:rPr>
+        <w:t xml:space="preserve"> </w:t>
+      </w:r>
+      <w:proofErr w:type="spellStart"/>
+      <w:r>
+        <w:rPr>
+          <w:rFonts w:asciiTheme="minorBidi" w:hAnsiTheme="minorBidi"/>
+        </w:rPr>
+        <w:t>Pelaksanaan</w:t>
+      </w:r>
+      <w:proofErr w:type="spellEnd"/>
+      <w:r>
+        <w:rPr>
+          <w:rFonts w:asciiTheme="minorBidi" w:hAnsiTheme="minorBidi"/>
+        </w:rPr>
+        <w:t xml:space="preserve"> </w:t>
+      </w:r>
+      <w:proofErr w:type="spellStart"/>
+      <w:r>
+        <w:rPr>
+          <w:rFonts w:asciiTheme="minorBidi" w:hAnsiTheme="minorBidi"/>
+        </w:rPr>
+        <w:t>Pembayaran</w:t>
+      </w:r>
+      <w:proofErr w:type="spellEnd"/>
+      <w:r>
+        <w:rPr>
+          <w:rFonts w:asciiTheme="minorBidi" w:hAnsiTheme="minorBidi"/>
+        </w:rPr>
+        <w:t xml:space="preserve"> </w:t>
+      </w:r>
+      <w:proofErr w:type="spellStart"/>
+      <w:r>
+        <w:rPr>
+          <w:rFonts w:asciiTheme="minorBidi" w:hAnsiTheme="minorBidi"/>
+        </w:rPr>
+        <w:t>atas</w:t>
+      </w:r>
+      <w:proofErr w:type="spellEnd"/>
+      <w:r>
+        <w:rPr>
+          <w:rFonts w:asciiTheme="minorBidi" w:hAnsiTheme="minorBidi"/>
+        </w:rPr>
+        <w:t xml:space="preserve"> Beban </w:t>
+      </w:r>
+      <w:proofErr w:type="spellStart"/>
+      <w:r>
+        <w:rPr>
+          <w:rFonts w:asciiTheme="minorBidi" w:hAnsiTheme="minorBidi"/>
+        </w:rPr>
+        <w:t>Anggaran</w:t>
+      </w:r>
+      <w:proofErr w:type="spellEnd"/>
+      <w:r>
+        <w:rPr>
+          <w:rFonts w:asciiTheme="minorBidi" w:hAnsiTheme="minorBidi"/>
+        </w:rPr>
+        <w:t xml:space="preserve"> </w:t>
+      </w:r>
+      <w:proofErr w:type="spellStart"/>
+      <w:r>
+        <w:rPr>
+          <w:rFonts w:asciiTheme="minorBidi" w:hAnsiTheme="minorBidi"/>
+        </w:rPr>
+        <w:t>Pendapatan</w:t>
+      </w:r>
+      <w:proofErr w:type="spellEnd"/>
+      <w:r>
+        <w:rPr>
+          <w:rFonts w:asciiTheme="minorBidi" w:hAnsiTheme="minorBidi"/>
+        </w:rPr>
+        <w:t xml:space="preserve"> dan </w:t>
+      </w:r>
+      <w:proofErr w:type="spellStart"/>
+      <w:r>
+        <w:rPr>
+          <w:rFonts w:asciiTheme="minorBidi" w:hAnsiTheme="minorBidi"/>
+        </w:rPr>
+        <w:t>Belanja</w:t>
+      </w:r>
+      <w:proofErr w:type="spellEnd"/>
+      <w:r>
+        <w:rPr>
+          <w:rFonts w:asciiTheme="minorBidi" w:hAnsiTheme="minorBidi"/>
+        </w:rPr>
+        <w:t xml:space="preserve"> Negara di </w:t>
+      </w:r>
+      <w:proofErr w:type="spellStart"/>
+      <w:r>
+        <w:rPr>
+          <w:rFonts w:asciiTheme="minorBidi" w:hAnsiTheme="minorBidi"/>
+        </w:rPr>
+        <w:t>Lingkungan</w:t>
+      </w:r>
+      <w:proofErr w:type="spellEnd"/>
+      <w:r>
+        <w:rPr>
+          <w:rFonts w:asciiTheme="minorBidi" w:hAnsiTheme="minorBidi"/>
+        </w:rPr>
+        <w:t xml:space="preserve"> </w:t>
+      </w:r>
+      <w:proofErr w:type="spellStart"/>
+      <w:r>
+        <w:rPr>
+          <w:rFonts w:asciiTheme="minorBidi" w:hAnsiTheme="minorBidi"/>
+        </w:rPr>
+        <w:t>Depertemen</w:t>
+      </w:r>
+      <w:proofErr w:type="spellEnd"/>
+      <w:r>
+        <w:rPr>
+          <w:rFonts w:asciiTheme="minorBidi" w:hAnsiTheme="minorBidi"/>
+        </w:rPr>
+        <w:t xml:space="preserve"> Agama;</w:t>
       </w:r>
     </w:p>
     <w:p>
@@ -3362,7 +6100,618 @@
           <w:sz w:val="22"/>
           <w:szCs w:val="22"/>
         </w:rPr>
-        <w:t>Keputusan Menteri Agama RI Nomor 001 Tahun 2022 Tanggal 03 Januari 2022 Tentang Pengangkatan Pejabat Kuasa Pengguna Anggaran, Pejabat Pembuat Komitmen Universitas, Pejabat Pembuat Komitmen Fakultas, Pejabat Pembuat Komitmen Pascasarjana, Pejabat Penguji Tagihan dan Penandatangan Surat Perintah Membayar, dan Bendahara Pengeluaran Pada UIN Sunan Kalijaga Yogyakarta Tahun Anggaran  2022.</w:t>
+        <w:t xml:space="preserve">Keputusan Menteri Agama RI </w:t>
+      </w:r>
+      <w:proofErr w:type="spellStart"/>
+      <w:r>
+        <w:rPr>
+          <w:rFonts w:asciiTheme="minorBidi" w:hAnsiTheme="minorBidi" w:cstheme="minorBidi"/>
+          <w:bCs/>
+          <w:sz w:val="22"/>
+          <w:szCs w:val="22"/>
+        </w:rPr>
+        <w:t>Nomor</w:t>
+      </w:r>
+      <w:proofErr w:type="spellEnd"/>
+      <w:r>
+        <w:rPr>
+          <w:rFonts w:asciiTheme="minorBidi" w:hAnsiTheme="minorBidi" w:cstheme="minorBidi"/>
+          <w:bCs/>
+          <w:sz w:val="22"/>
+          <w:szCs w:val="22"/>
+        </w:rPr>
+        <w:t xml:space="preserve"> 001 </w:t>
+      </w:r>
+      <w:proofErr w:type="spellStart"/>
+      <w:r>
+        <w:rPr>
+          <w:rFonts w:asciiTheme="minorBidi" w:hAnsiTheme="minorBidi" w:cstheme="minorBidi"/>
+          <w:bCs/>
+          <w:sz w:val="22"/>
+          <w:szCs w:val="22"/>
+        </w:rPr>
+        <w:t>Tahun</w:t>
+      </w:r>
+      <w:proofErr w:type="spellEnd"/>
+      <w:r>
+        <w:rPr>
+          <w:rFonts w:asciiTheme="minorBidi" w:hAnsiTheme="minorBidi" w:cstheme="minorBidi"/>
+          <w:bCs/>
+          <w:sz w:val="22"/>
+          <w:szCs w:val="22"/>
+        </w:rPr>
+        <w:t xml:space="preserve"> 2022 </w:t>
+      </w:r>
+      <w:proofErr w:type="spellStart"/>
+      <w:r>
+        <w:rPr>
+          <w:rFonts w:asciiTheme="minorBidi" w:hAnsiTheme="minorBidi" w:cstheme="minorBidi"/>
+          <w:bCs/>
+          <w:sz w:val="22"/>
+          <w:szCs w:val="22"/>
+        </w:rPr>
+        <w:t>Tanggal</w:t>
+      </w:r>
+      <w:proofErr w:type="spellEnd"/>
+      <w:r>
+        <w:rPr>
+          <w:rFonts w:asciiTheme="minorBidi" w:hAnsiTheme="minorBidi" w:cstheme="minorBidi"/>
+          <w:bCs/>
+          <w:sz w:val="22"/>
+          <w:szCs w:val="22"/>
+        </w:rPr>
+        <w:t xml:space="preserve"> 03 Januari 2022 </w:t>
+      </w:r>
+      <w:proofErr w:type="spellStart"/>
+      <w:r>
+        <w:rPr>
+          <w:rFonts w:asciiTheme="minorBidi" w:hAnsiTheme="minorBidi" w:cstheme="minorBidi"/>
+          <w:bCs/>
+          <w:sz w:val="22"/>
+          <w:szCs w:val="22"/>
+        </w:rPr>
+        <w:t>Tentang</w:t>
+      </w:r>
+      <w:proofErr w:type="spellEnd"/>
+      <w:r>
+        <w:rPr>
+          <w:rFonts w:asciiTheme="minorBidi" w:hAnsiTheme="minorBidi" w:cstheme="minorBidi"/>
+          <w:bCs/>
+          <w:sz w:val="22"/>
+          <w:szCs w:val="22"/>
+        </w:rPr>
+        <w:t xml:space="preserve"> </w:t>
+      </w:r>
+      <w:proofErr w:type="spellStart"/>
+      <w:r>
+        <w:rPr>
+          <w:rFonts w:asciiTheme="minorBidi" w:hAnsiTheme="minorBidi" w:cstheme="minorBidi"/>
+          <w:bCs/>
+          <w:sz w:val="22"/>
+          <w:szCs w:val="22"/>
+        </w:rPr>
+        <w:t>Pengangkatan</w:t>
+      </w:r>
+      <w:proofErr w:type="spellEnd"/>
+      <w:r>
+        <w:rPr>
+          <w:rFonts w:asciiTheme="minorBidi" w:hAnsiTheme="minorBidi" w:cstheme="minorBidi"/>
+          <w:bCs/>
+          <w:sz w:val="22"/>
+          <w:szCs w:val="22"/>
+        </w:rPr>
+        <w:t xml:space="preserve"> </w:t>
+      </w:r>
+      <w:proofErr w:type="spellStart"/>
+      <w:r>
+        <w:rPr>
+          <w:rFonts w:asciiTheme="minorBidi" w:hAnsiTheme="minorBidi" w:cstheme="minorBidi"/>
+          <w:bCs/>
+          <w:sz w:val="22"/>
+          <w:szCs w:val="22"/>
+        </w:rPr>
+        <w:t>Pejabat</w:t>
+      </w:r>
+      <w:proofErr w:type="spellEnd"/>
+      <w:r>
+        <w:rPr>
+          <w:rFonts w:asciiTheme="minorBidi" w:hAnsiTheme="minorBidi" w:cstheme="minorBidi"/>
+          <w:bCs/>
+          <w:sz w:val="22"/>
+          <w:szCs w:val="22"/>
+        </w:rPr>
+        <w:t xml:space="preserve"> Kuasa </w:t>
+      </w:r>
+      <w:proofErr w:type="spellStart"/>
+      <w:r>
+        <w:rPr>
+          <w:rFonts w:asciiTheme="minorBidi" w:hAnsiTheme="minorBidi" w:cstheme="minorBidi"/>
+          <w:bCs/>
+          <w:sz w:val="22"/>
+          <w:szCs w:val="22"/>
+        </w:rPr>
+        <w:t>Pengguna</w:t>
+      </w:r>
+      <w:proofErr w:type="spellEnd"/>
+      <w:r>
+        <w:rPr>
+          <w:rFonts w:asciiTheme="minorBidi" w:hAnsiTheme="minorBidi" w:cstheme="minorBidi"/>
+          <w:bCs/>
+          <w:sz w:val="22"/>
+          <w:szCs w:val="22"/>
+        </w:rPr>
+        <w:t xml:space="preserve"> </w:t>
+      </w:r>
+      <w:proofErr w:type="spellStart"/>
+      <w:r>
+        <w:rPr>
+          <w:rFonts w:asciiTheme="minorBidi" w:hAnsiTheme="minorBidi" w:cstheme="minorBidi"/>
+          <w:bCs/>
+          <w:sz w:val="22"/>
+          <w:szCs w:val="22"/>
+        </w:rPr>
+        <w:t>Anggaran</w:t>
+      </w:r>
+      <w:proofErr w:type="spellEnd"/>
+      <w:r>
+        <w:rPr>
+          <w:rFonts w:asciiTheme="minorBidi" w:hAnsiTheme="minorBidi" w:cstheme="minorBidi"/>
+          <w:bCs/>
+          <w:sz w:val="22"/>
+          <w:szCs w:val="22"/>
+        </w:rPr>
+        <w:t xml:space="preserve">, </w:t>
+      </w:r>
+      <w:proofErr w:type="spellStart"/>
+      <w:r>
+        <w:rPr>
+          <w:rFonts w:asciiTheme="minorBidi" w:hAnsiTheme="minorBidi" w:cstheme="minorBidi"/>
+          <w:bCs/>
+          <w:sz w:val="22"/>
+          <w:szCs w:val="22"/>
+        </w:rPr>
+        <w:t>Pejabat</w:t>
+      </w:r>
+      <w:proofErr w:type="spellEnd"/>
+      <w:r>
+        <w:rPr>
+          <w:rFonts w:asciiTheme="minorBidi" w:hAnsiTheme="minorBidi" w:cstheme="minorBidi"/>
+          <w:bCs/>
+          <w:sz w:val="22"/>
+          <w:szCs w:val="22"/>
+        </w:rPr>
+        <w:t xml:space="preserve"> </w:t>
+      </w:r>
+      <w:proofErr w:type="spellStart"/>
+      <w:r>
+        <w:rPr>
+          <w:rFonts w:asciiTheme="minorBidi" w:hAnsiTheme="minorBidi" w:cstheme="minorBidi"/>
+          <w:bCs/>
+          <w:sz w:val="22"/>
+          <w:szCs w:val="22"/>
+        </w:rPr>
+        <w:t>Pembuat</w:t>
+      </w:r>
+      <w:proofErr w:type="spellEnd"/>
+      <w:r>
+        <w:rPr>
+          <w:rFonts w:asciiTheme="minorBidi" w:hAnsiTheme="minorBidi" w:cstheme="minorBidi"/>
+          <w:bCs/>
+          <w:sz w:val="22"/>
+          <w:szCs w:val="22"/>
+        </w:rPr>
+        <w:t xml:space="preserve"> </w:t>
+      </w:r>
+      <w:proofErr w:type="spellStart"/>
+      <w:r>
+        <w:rPr>
+          <w:rFonts w:asciiTheme="minorBidi" w:hAnsiTheme="minorBidi" w:cstheme="minorBidi"/>
+          <w:bCs/>
+          <w:sz w:val="22"/>
+          <w:szCs w:val="22"/>
+        </w:rPr>
+        <w:t>Komitmen</w:t>
+      </w:r>
+      <w:proofErr w:type="spellEnd"/>
+      <w:r>
+        <w:rPr>
+          <w:rFonts w:asciiTheme="minorBidi" w:hAnsiTheme="minorBidi" w:cstheme="minorBidi"/>
+          <w:bCs/>
+          <w:sz w:val="22"/>
+          <w:szCs w:val="22"/>
+        </w:rPr>
+        <w:t xml:space="preserve"> Universitas, </w:t>
+      </w:r>
+      <w:proofErr w:type="spellStart"/>
+      <w:r>
+        <w:rPr>
+          <w:rFonts w:asciiTheme="minorBidi" w:hAnsiTheme="minorBidi" w:cstheme="minorBidi"/>
+          <w:bCs/>
+          <w:sz w:val="22"/>
+          <w:szCs w:val="22"/>
+        </w:rPr>
+        <w:t>Pejabat</w:t>
+      </w:r>
+      <w:proofErr w:type="spellEnd"/>
+      <w:r>
+        <w:rPr>
+          <w:rFonts w:asciiTheme="minorBidi" w:hAnsiTheme="minorBidi" w:cstheme="minorBidi"/>
+          <w:bCs/>
+          <w:sz w:val="22"/>
+          <w:szCs w:val="22"/>
+        </w:rPr>
+        <w:t xml:space="preserve"> </w:t>
+      </w:r>
+      <w:proofErr w:type="spellStart"/>
+      <w:r>
+        <w:rPr>
+          <w:rFonts w:asciiTheme="minorBidi" w:hAnsiTheme="minorBidi" w:cstheme="minorBidi"/>
+          <w:bCs/>
+          <w:sz w:val="22"/>
+          <w:szCs w:val="22"/>
+        </w:rPr>
+        <w:t>Pembuat</w:t>
+      </w:r>
+      <w:proofErr w:type="spellEnd"/>
+      <w:r>
+        <w:rPr>
+          <w:rFonts w:asciiTheme="minorBidi" w:hAnsiTheme="minorBidi" w:cstheme="minorBidi"/>
+          <w:bCs/>
+          <w:sz w:val="22"/>
+          <w:szCs w:val="22"/>
+        </w:rPr>
+        <w:t xml:space="preserve"> </w:t>
+      </w:r>
+      <w:proofErr w:type="spellStart"/>
+      <w:r>
+        <w:rPr>
+          <w:rFonts w:asciiTheme="minorBidi" w:hAnsiTheme="minorBidi" w:cstheme="minorBidi"/>
+          <w:bCs/>
+          <w:sz w:val="22"/>
+          <w:szCs w:val="22"/>
+        </w:rPr>
+        <w:t>Komitmen</w:t>
+      </w:r>
+      <w:proofErr w:type="spellEnd"/>
+      <w:r>
+        <w:rPr>
+          <w:rFonts w:asciiTheme="minorBidi" w:hAnsiTheme="minorBidi" w:cstheme="minorBidi"/>
+          <w:bCs/>
+          <w:sz w:val="22"/>
+          <w:szCs w:val="22"/>
+        </w:rPr>
+        <w:t xml:space="preserve"> </w:t>
+      </w:r>
+      <w:proofErr w:type="spellStart"/>
+      <w:r>
+        <w:rPr>
+          <w:rFonts w:asciiTheme="minorBidi" w:hAnsiTheme="minorBidi" w:cstheme="minorBidi"/>
+          <w:bCs/>
+          <w:sz w:val="22"/>
+          <w:szCs w:val="22"/>
+        </w:rPr>
+        <w:t>Fakultas</w:t>
+      </w:r>
+      <w:proofErr w:type="spellEnd"/>
+      <w:r>
+        <w:rPr>
+          <w:rFonts w:asciiTheme="minorBidi" w:hAnsiTheme="minorBidi" w:cstheme="minorBidi"/>
+          <w:bCs/>
+          <w:sz w:val="22"/>
+          <w:szCs w:val="22"/>
+        </w:rPr>
+        <w:t xml:space="preserve">, </w:t>
+      </w:r>
+      <w:proofErr w:type="spellStart"/>
+      <w:r>
+        <w:rPr>
+          <w:rFonts w:asciiTheme="minorBidi" w:hAnsiTheme="minorBidi" w:cstheme="minorBidi"/>
+          <w:bCs/>
+          <w:sz w:val="22"/>
+          <w:szCs w:val="22"/>
+        </w:rPr>
+        <w:t>Pejabat</w:t>
+      </w:r>
+      <w:proofErr w:type="spellEnd"/>
+      <w:r>
+        <w:rPr>
+          <w:rFonts w:asciiTheme="minorBidi" w:hAnsiTheme="minorBidi" w:cstheme="minorBidi"/>
+          <w:bCs/>
+          <w:sz w:val="22"/>
+          <w:szCs w:val="22"/>
+        </w:rPr>
+        <w:t xml:space="preserve"> </w:t>
+      </w:r>
+      <w:proofErr w:type="spellStart"/>
+      <w:r>
+        <w:rPr>
+          <w:rFonts w:asciiTheme="minorBidi" w:hAnsiTheme="minorBidi" w:cstheme="minorBidi"/>
+          <w:bCs/>
+          <w:sz w:val="22"/>
+          <w:szCs w:val="22"/>
+        </w:rPr>
+        <w:t>Pembuat</w:t>
+      </w:r>
+      <w:proofErr w:type="spellEnd"/>
+      <w:r>
+        <w:rPr>
+          <w:rFonts w:asciiTheme="minorBidi" w:hAnsiTheme="minorBidi" w:cstheme="minorBidi"/>
+          <w:bCs/>
+          <w:sz w:val="22"/>
+          <w:szCs w:val="22"/>
+        </w:rPr>
+        <w:t xml:space="preserve"> </w:t>
+      </w:r>
+      <w:proofErr w:type="spellStart"/>
+      <w:r>
+        <w:rPr>
+          <w:rFonts w:asciiTheme="minorBidi" w:hAnsiTheme="minorBidi" w:cstheme="minorBidi"/>
+          <w:bCs/>
+          <w:sz w:val="22"/>
+          <w:szCs w:val="22"/>
+        </w:rPr>
+        <w:t>Komitmen</w:t>
+      </w:r>
+      <w:proofErr w:type="spellEnd"/>
+      <w:r>
+        <w:rPr>
+          <w:rFonts w:asciiTheme="minorBidi" w:hAnsiTheme="minorBidi" w:cstheme="minorBidi"/>
+          <w:bCs/>
+          <w:sz w:val="22"/>
+          <w:szCs w:val="22"/>
+        </w:rPr>
+        <w:t xml:space="preserve"> </w:t>
+      </w:r>
+      <w:proofErr w:type="spellStart"/>
+      <w:r>
+        <w:rPr>
+          <w:rFonts w:asciiTheme="minorBidi" w:hAnsiTheme="minorBidi" w:cstheme="minorBidi"/>
+          <w:bCs/>
+          <w:sz w:val="22"/>
+          <w:szCs w:val="22"/>
+        </w:rPr>
+        <w:t>Pascasarjana</w:t>
+      </w:r>
+      <w:proofErr w:type="spellEnd"/>
+      <w:r>
+        <w:rPr>
+          <w:rFonts w:asciiTheme="minorBidi" w:hAnsiTheme="minorBidi" w:cstheme="minorBidi"/>
+          <w:bCs/>
+          <w:sz w:val="22"/>
+          <w:szCs w:val="22"/>
+        </w:rPr>
+        <w:t xml:space="preserve">, </w:t>
+      </w:r>
+      <w:proofErr w:type="spellStart"/>
+      <w:r>
+        <w:rPr>
+          <w:rFonts w:asciiTheme="minorBidi" w:hAnsiTheme="minorBidi" w:cstheme="minorBidi"/>
+          <w:bCs/>
+          <w:sz w:val="22"/>
+          <w:szCs w:val="22"/>
+        </w:rPr>
+        <w:t>Pejabat</w:t>
+      </w:r>
+      <w:proofErr w:type="spellEnd"/>
+      <w:r>
+        <w:rPr>
+          <w:rFonts w:asciiTheme="minorBidi" w:hAnsiTheme="minorBidi" w:cstheme="minorBidi"/>
+          <w:bCs/>
+          <w:sz w:val="22"/>
+          <w:szCs w:val="22"/>
+        </w:rPr>
+        <w:t xml:space="preserve"> </w:t>
+      </w:r>
+      <w:proofErr w:type="spellStart"/>
+      <w:r>
+        <w:rPr>
+          <w:rFonts w:asciiTheme="minorBidi" w:hAnsiTheme="minorBidi" w:cstheme="minorBidi"/>
+          <w:bCs/>
+          <w:sz w:val="22"/>
+          <w:szCs w:val="22"/>
+        </w:rPr>
+        <w:t>Penguji</w:t>
+      </w:r>
+      <w:proofErr w:type="spellEnd"/>
+      <w:r>
+        <w:rPr>
+          <w:rFonts w:asciiTheme="minorBidi" w:hAnsiTheme="minorBidi" w:cstheme="minorBidi"/>
+          <w:bCs/>
+          <w:sz w:val="22"/>
+          <w:szCs w:val="22"/>
+        </w:rPr>
+        <w:t xml:space="preserve"> </w:t>
+      </w:r>
+      <w:proofErr w:type="spellStart"/>
+      <w:r>
+        <w:rPr>
+          <w:rFonts w:asciiTheme="minorBidi" w:hAnsiTheme="minorBidi" w:cstheme="minorBidi"/>
+          <w:bCs/>
+          <w:sz w:val="22"/>
+          <w:szCs w:val="22"/>
+        </w:rPr>
+        <w:t>Tagihan</w:t>
+      </w:r>
+      <w:proofErr w:type="spellEnd"/>
+      <w:r>
+        <w:rPr>
+          <w:rFonts w:asciiTheme="minorBidi" w:hAnsiTheme="minorBidi" w:cstheme="minorBidi"/>
+          <w:bCs/>
+          <w:sz w:val="22"/>
+          <w:szCs w:val="22"/>
+        </w:rPr>
+        <w:t xml:space="preserve"> dan </w:t>
+      </w:r>
+      <w:proofErr w:type="spellStart"/>
+      <w:r>
+        <w:rPr>
+          <w:rFonts w:asciiTheme="minorBidi" w:hAnsiTheme="minorBidi" w:cstheme="minorBidi"/>
+          <w:bCs/>
+          <w:sz w:val="22"/>
+          <w:szCs w:val="22"/>
+        </w:rPr>
+        <w:t>Penandatangan</w:t>
+      </w:r>
+      <w:proofErr w:type="spellEnd"/>
+      <w:r>
+        <w:rPr>
+          <w:rFonts w:asciiTheme="minorBidi" w:hAnsiTheme="minorBidi" w:cstheme="minorBidi"/>
+          <w:bCs/>
+          <w:sz w:val="22"/>
+          <w:szCs w:val="22"/>
+        </w:rPr>
+        <w:t xml:space="preserve"> Surat </w:t>
+      </w:r>
+      <w:proofErr w:type="spellStart"/>
+      <w:r>
+        <w:rPr>
+          <w:rFonts w:asciiTheme="minorBidi" w:hAnsiTheme="minorBidi" w:cstheme="minorBidi"/>
+          <w:bCs/>
+          <w:sz w:val="22"/>
+          <w:szCs w:val="22"/>
+        </w:rPr>
+        <w:t>Perintah</w:t>
+      </w:r>
+      <w:proofErr w:type="spellEnd"/>
+      <w:r>
+        <w:rPr>
+          <w:rFonts w:asciiTheme="minorBidi" w:hAnsiTheme="minorBidi" w:cstheme="minorBidi"/>
+          <w:bCs/>
+          <w:sz w:val="22"/>
+          <w:szCs w:val="22"/>
+        </w:rPr>
+        <w:t xml:space="preserve"> </w:t>
+      </w:r>
+      <w:proofErr w:type="spellStart"/>
+      <w:r>
+        <w:rPr>
+          <w:rFonts w:asciiTheme="minorBidi" w:hAnsiTheme="minorBidi" w:cstheme="minorBidi"/>
+          <w:bCs/>
+          <w:sz w:val="22"/>
+          <w:szCs w:val="22"/>
+        </w:rPr>
+        <w:t>Membayar</w:t>
+      </w:r>
+      <w:proofErr w:type="spellEnd"/>
+      <w:r>
+        <w:rPr>
+          <w:rFonts w:asciiTheme="minorBidi" w:hAnsiTheme="minorBidi" w:cstheme="minorBidi"/>
+          <w:bCs/>
+          <w:sz w:val="22"/>
+          <w:szCs w:val="22"/>
+        </w:rPr>
+        <w:t xml:space="preserve">, dan </w:t>
+      </w:r>
+      <w:proofErr w:type="spellStart"/>
+      <w:r>
+        <w:rPr>
+          <w:rFonts w:asciiTheme="minorBidi" w:hAnsiTheme="minorBidi" w:cstheme="minorBidi"/>
+          <w:bCs/>
+          <w:sz w:val="22"/>
+          <w:szCs w:val="22"/>
+        </w:rPr>
+        <w:t>Bendahara</w:t>
+      </w:r>
+      <w:proofErr w:type="spellEnd"/>
+      <w:r>
+        <w:rPr>
+          <w:rFonts w:asciiTheme="minorBidi" w:hAnsiTheme="minorBidi" w:cstheme="minorBidi"/>
+          <w:bCs/>
+          <w:sz w:val="22"/>
+          <w:szCs w:val="22"/>
+        </w:rPr>
+        <w:t xml:space="preserve"> </w:t>
+      </w:r>
+      <w:proofErr w:type="spellStart"/>
+      <w:r>
+        <w:rPr>
+          <w:rFonts w:asciiTheme="minorBidi" w:hAnsiTheme="minorBidi" w:cstheme="minorBidi"/>
+          <w:bCs/>
+          <w:sz w:val="22"/>
+          <w:szCs w:val="22"/>
+        </w:rPr>
+        <w:t>Pengeluaran</w:t>
+      </w:r>
+      <w:proofErr w:type="spellEnd"/>
+      <w:r>
+        <w:rPr>
+          <w:rFonts w:asciiTheme="minorBidi" w:hAnsiTheme="minorBidi" w:cstheme="minorBidi"/>
+          <w:bCs/>
+          <w:sz w:val="22"/>
+          <w:szCs w:val="22"/>
+        </w:rPr>
+        <w:t xml:space="preserve"> Pada UIN Sunan </w:t>
+      </w:r>
+      <w:proofErr w:type="spellStart"/>
+      <w:r>
+        <w:rPr>
+          <w:rFonts w:asciiTheme="minorBidi" w:hAnsiTheme="minorBidi" w:cstheme="minorBidi"/>
+          <w:bCs/>
+          <w:sz w:val="22"/>
+          <w:szCs w:val="22"/>
+        </w:rPr>
+        <w:t>Kalijaga</w:t>
+      </w:r>
+      <w:proofErr w:type="spellEnd"/>
+      <w:r>
+        <w:rPr>
+          <w:rFonts w:asciiTheme="minorBidi" w:hAnsiTheme="minorBidi" w:cstheme="minorBidi"/>
+          <w:bCs/>
+          <w:sz w:val="22"/>
+          <w:szCs w:val="22"/>
+        </w:rPr>
+        <w:t xml:space="preserve"> Yogyakarta </w:t>
+      </w:r>
+      <w:proofErr w:type="spellStart"/>
+      <w:r>
+        <w:rPr>
+          <w:rFonts w:asciiTheme="minorBidi" w:hAnsiTheme="minorBidi" w:cstheme="minorBidi"/>
+          <w:bCs/>
+          <w:sz w:val="22"/>
+          <w:szCs w:val="22"/>
+        </w:rPr>
+        <w:t>Tahun</w:t>
+      </w:r>
+      <w:proofErr w:type="spellEnd"/>
+      <w:r>
+        <w:rPr>
+          <w:rFonts w:asciiTheme="minorBidi" w:hAnsiTheme="minorBidi" w:cstheme="minorBidi"/>
+          <w:bCs/>
+          <w:sz w:val="22"/>
+          <w:szCs w:val="22"/>
+        </w:rPr>
+        <w:t xml:space="preserve"> </w:t>
+      </w:r>
+      <w:proofErr w:type="spellStart"/>
+      <w:proofErr w:type="gramStart"/>
+      <w:r>
+        <w:rPr>
+          <w:rFonts w:asciiTheme="minorBidi" w:hAnsiTheme="minorBidi" w:cstheme="minorBidi"/>
+          <w:bCs/>
+          <w:sz w:val="22"/>
+          <w:szCs w:val="22"/>
+        </w:rPr>
+        <w:t>Anggaran</w:t>
+      </w:r>
+      <w:proofErr w:type="spellEnd"/>
+      <w:r>
+        <w:rPr>
+          <w:rFonts w:asciiTheme="minorBidi" w:hAnsiTheme="minorBidi" w:cstheme="minorBidi"/>
+          <w:bCs/>
+          <w:sz w:val="22"/>
+          <w:szCs w:val="22"/>
+        </w:rPr>
+        <w:t xml:space="preserve">  2022</w:t>
+      </w:r>
+      <w:proofErr w:type="gramEnd"/>
+      <w:r>
+        <w:rPr>
+          <w:rFonts w:asciiTheme="minorBidi" w:hAnsiTheme="minorBidi" w:cstheme="minorBidi"/>
+          <w:bCs/>
+          <w:sz w:val="22"/>
+          <w:szCs w:val="22"/>
+        </w:rPr>
+        <w:t>.</w:t>
       </w:r>
     </w:p>
     <w:p>
@@ -3501,8 +6850,18 @@
           <w:b/>
           <w:bCs/>
         </w:rPr>
-        <w:t>Ruang Lingkup</w:t>
-      </w:r>
+        <w:t xml:space="preserve">Ruang </w:t>
+      </w:r>
+      <w:proofErr w:type="spellStart"/>
+      <w:r>
+        <w:rPr>
+          <w:rFonts w:asciiTheme="minorBidi" w:hAnsiTheme="minorBidi"/>
+          <w:b/>
+          <w:bCs/>
+        </w:rPr>
+        <w:t>Lingkup</w:t>
+      </w:r>
+      <w:proofErr w:type="spellEnd"/>
     </w:p>
     <w:p>
       <w:pPr>
@@ -3518,12 +6877,14 @@
         </w:rPr>
         <w:t>${</w:t>
       </w:r>
+      <w:proofErr w:type="spellStart"/>
       <w:r>
         <w:rPr>
           <w:rFonts w:asciiTheme="minorBidi" w:hAnsiTheme="minorBidi"/>
         </w:rPr>
         <w:t>activity_scope</w:t>
       </w:r>
+      <w:proofErr w:type="spellEnd"/>
       <w:r>
         <w:rPr>
           <w:rFonts w:asciiTheme="minorBidi" w:hAnsiTheme="minorBidi"/>
@@ -3574,7 +6935,25 @@
           <w:bCs/>
         </w:rPr>
         <w:lastRenderedPageBreak/>
-        <w:t>BAB II : PELAKSANAAN KEGIATAN</w:t>
+        <w:t xml:space="preserve">BAB </w:t>
+      </w:r>
+      <w:proofErr w:type="gramStart"/>
+      <w:r>
+        <w:rPr>
+          <w:rFonts w:asciiTheme="minorBidi" w:hAnsiTheme="minorBidi"/>
+          <w:b/>
+          <w:bCs/>
+        </w:rPr>
+        <w:t>II :</w:t>
+      </w:r>
+      <w:proofErr w:type="gramEnd"/>
+      <w:r>
+        <w:rPr>
+          <w:rFonts w:asciiTheme="minorBidi" w:hAnsiTheme="minorBidi"/>
+          <w:b/>
+          <w:bCs/>
+        </w:rPr>
+        <w:t xml:space="preserve"> PELAKSANAAN KEGIATAN</w:t>
       </w:r>
     </w:p>
     <w:p>
@@ -3605,22 +6984,34 @@
           <w:bCs/>
         </w:rPr>
       </w:pPr>
+      <w:proofErr w:type="spellStart"/>
       <w:r>
         <w:rPr>
           <w:rFonts w:asciiTheme="minorBidi" w:hAnsiTheme="minorBidi"/>
           <w:b/>
           <w:bCs/>
         </w:rPr>
-        <w:t xml:space="preserve">Panitia </w:t>
-      </w:r>
+        <w:t>Panitia</w:t>
+      </w:r>
+      <w:proofErr w:type="spellEnd"/>
       <w:r>
         <w:rPr>
           <w:rFonts w:asciiTheme="minorBidi" w:hAnsiTheme="minorBidi"/>
           <w:b/>
           <w:bCs/>
         </w:rPr>
+        <w:t xml:space="preserve"> </w:t>
+      </w:r>
+      <w:proofErr w:type="spellStart"/>
+      <w:r>
+        <w:rPr>
+          <w:rFonts w:asciiTheme="minorBidi" w:hAnsiTheme="minorBidi"/>
+          <w:b/>
+          <w:bCs/>
+        </w:rPr>
         <w:t>Pelaksana</w:t>
       </w:r>
+      <w:proofErr w:type="spellEnd"/>
     </w:p>
     <w:p>
       <w:pPr>
@@ -3675,13 +7066,41 @@
               </w:rPr>
             </w:pPr>
             <w:bookmarkStart w:id="0" w:name="_Hlk188599924"/>
+            <w:proofErr w:type="spellStart"/>
             <w:r>
               <w:rPr>
                 <w:rFonts w:asciiTheme="minorBidi" w:eastAsia="Times New Roman" w:hAnsiTheme="minorBidi"/>
                 <w:b/>
                 <w:bCs/>
               </w:rPr>
-              <w:t>Jabatan Dalam Tim</w:t>
+              <w:t>Jabatan</w:t>
+            </w:r>
+            <w:proofErr w:type="spellEnd"/>
+            <w:r>
+              <w:rPr>
+                <w:rFonts w:asciiTheme="minorBidi" w:eastAsia="Times New Roman" w:hAnsiTheme="minorBidi"/>
+                <w:b/>
+                <w:bCs/>
+              </w:rPr>
+              <w:t xml:space="preserve"> </w:t>
+            </w:r>
+            <w:proofErr w:type="spellStart"/>
+            <w:r>
+              <w:rPr>
+                <w:rFonts w:asciiTheme="minorBidi" w:eastAsia="Times New Roman" w:hAnsiTheme="minorBidi"/>
+                <w:b/>
+                <w:bCs/>
+              </w:rPr>
+              <w:t>Dalam</w:t>
+            </w:r>
+            <w:proofErr w:type="spellEnd"/>
+            <w:r>
+              <w:rPr>
+                <w:rFonts w:asciiTheme="minorBidi" w:eastAsia="Times New Roman" w:hAnsiTheme="minorBidi"/>
+                <w:b/>
+                <w:bCs/>
+              </w:rPr>
+              <w:t xml:space="preserve"> Tim</w:t>
             </w:r>
           </w:p>
         </w:tc>
@@ -3767,11 +7186,19 @@
               </w:rPr>
               <w:t>${</w:t>
             </w:r>
+            <w:proofErr w:type="spellStart"/>
             <w:r>
               <w:rPr>
                 <w:spacing w:val="-10"/>
               </w:rPr>
-              <w:t>commitee_position}</w:t>
+              <w:t>commitee_position</w:t>
+            </w:r>
+            <w:proofErr w:type="spellEnd"/>
+            <w:r>
+              <w:rPr>
+                <w:spacing w:val="-10"/>
+              </w:rPr>
+              <w:t>}</w:t>
             </w:r>
           </w:p>
         </w:tc>
@@ -3821,7 +7248,21 @@
               <w:rPr>
                 <w:spacing w:val="-2"/>
               </w:rPr>
-              <w:t>${commitee_name}</w:t>
+              <w:t>${</w:t>
+            </w:r>
+            <w:proofErr w:type="spellStart"/>
+            <w:r>
+              <w:rPr>
+                <w:spacing w:val="-2"/>
+              </w:rPr>
+              <w:t>commitee_name</w:t>
+            </w:r>
+            <w:proofErr w:type="spellEnd"/>
+            <w:r>
+              <w:rPr>
+                <w:spacing w:val="-2"/>
+              </w:rPr>
+              <w:t>}</w:t>
             </w:r>
             <w:r>
               <w:rPr>
@@ -3862,6 +7303,7 @@
           <w:bCs/>
         </w:rPr>
       </w:pPr>
+      <w:proofErr w:type="spellStart"/>
       <w:r>
         <w:rPr>
           <w:rFonts w:asciiTheme="minorBidi" w:hAnsiTheme="minorBidi"/>
@@ -3870,6 +7312,7 @@
         </w:rPr>
         <w:t>Narasumber</w:t>
       </w:r>
+      <w:proofErr w:type="spellEnd"/>
     </w:p>
     <w:tbl>
       <w:tblPr>
@@ -3949,12 +7392,21 @@
                 <w:b/>
               </w:rPr>
             </w:pPr>
+            <w:proofErr w:type="spellStart"/>
             <w:r>
               <w:rPr>
                 <w:rFonts w:asciiTheme="minorBidi" w:hAnsiTheme="minorBidi"/>
                 <w:b/>
               </w:rPr>
-              <w:t>Jabatan/Lembaga</w:t>
+              <w:t>Jabatan</w:t>
+            </w:r>
+            <w:proofErr w:type="spellEnd"/>
+            <w:r>
+              <w:rPr>
+                <w:rFonts w:asciiTheme="minorBidi" w:hAnsiTheme="minorBidi"/>
+                <w:b/>
+              </w:rPr>
+              <w:t>/Lembaga</w:t>
             </w:r>
           </w:p>
         </w:tc>
@@ -3980,7 +7432,23 @@
                 <w:rFonts w:ascii="Arial" w:hAnsi="Arial" w:cs="Arial"/>
                 <w:spacing w:val="-10"/>
               </w:rPr>
-              <w:t>${speaker_no}</w:t>
+              <w:t>${</w:t>
+            </w:r>
+            <w:proofErr w:type="spellStart"/>
+            <w:r>
+              <w:rPr>
+                <w:rFonts w:ascii="Arial" w:hAnsi="Arial" w:cs="Arial"/>
+                <w:spacing w:val="-10"/>
+              </w:rPr>
+              <w:t>speaker_no</w:t>
+            </w:r>
+            <w:proofErr w:type="spellEnd"/>
+            <w:r>
+              <w:rPr>
+                <w:rFonts w:ascii="Arial" w:hAnsi="Arial" w:cs="Arial"/>
+                <w:spacing w:val="-10"/>
+              </w:rPr>
+              <w:t>}</w:t>
             </w:r>
           </w:p>
         </w:tc>
@@ -4000,7 +7468,21 @@
               <w:rPr>
                 <w:rFonts w:asciiTheme="minorBidi" w:hAnsiTheme="minorBidi"/>
               </w:rPr>
-              <w:t>${speaker_name}</w:t>
+              <w:t>${</w:t>
+            </w:r>
+            <w:proofErr w:type="spellStart"/>
+            <w:r>
+              <w:rPr>
+                <w:rFonts w:asciiTheme="minorBidi" w:hAnsiTheme="minorBidi"/>
+              </w:rPr>
+              <w:t>speaker_name</w:t>
+            </w:r>
+            <w:proofErr w:type="spellEnd"/>
+            <w:r>
+              <w:rPr>
+                <w:rFonts w:asciiTheme="minorBidi" w:hAnsiTheme="minorBidi"/>
+              </w:rPr>
+              <w:t>}</w:t>
             </w:r>
             <w:r>
               <w:rPr>
@@ -4026,7 +7508,21 @@
               <w:rPr>
                 <w:rFonts w:asciiTheme="minorBidi" w:hAnsiTheme="minorBidi"/>
               </w:rPr>
-              <w:t>${speaker_institution}</w:t>
+              <w:t>${</w:t>
+            </w:r>
+            <w:proofErr w:type="spellStart"/>
+            <w:r>
+              <w:rPr>
+                <w:rFonts w:asciiTheme="minorBidi" w:hAnsiTheme="minorBidi"/>
+              </w:rPr>
+              <w:t>speaker_institution</w:t>
+            </w:r>
+            <w:proofErr w:type="spellEnd"/>
+            <w:r>
+              <w:rPr>
+                <w:rFonts w:asciiTheme="minorBidi" w:hAnsiTheme="minorBidi"/>
+              </w:rPr>
+              <w:t>}</w:t>
             </w:r>
           </w:p>
         </w:tc>
@@ -4147,6 +7643,7 @@
                 <w:b/>
               </w:rPr>
             </w:pPr>
+            <w:proofErr w:type="spellStart"/>
             <w:r>
               <w:rPr>
                 <w:rFonts w:asciiTheme="minorBidi" w:hAnsiTheme="minorBidi"/>
@@ -4154,6 +7651,7 @@
               </w:rPr>
               <w:t>Instansi</w:t>
             </w:r>
+            <w:proofErr w:type="spellEnd"/>
           </w:p>
         </w:tc>
       </w:tr>
@@ -4180,6 +7678,7 @@
               </w:rPr>
               <w:t>${</w:t>
             </w:r>
+            <w:proofErr w:type="spellStart"/>
             <w:r>
               <w:rPr>
                 <w:rFonts w:ascii="Arial" w:hAnsi="Arial" w:cs="Arial"/>
@@ -4192,7 +7691,15 @@
                 <w:rFonts w:ascii="Arial" w:hAnsi="Arial" w:cs="Arial"/>
                 <w:spacing w:val="-10"/>
               </w:rPr>
-              <w:t>_no}</w:t>
+              <w:t>_no</w:t>
+            </w:r>
+            <w:proofErr w:type="spellEnd"/>
+            <w:r>
+              <w:rPr>
+                <w:rFonts w:ascii="Arial" w:hAnsi="Arial" w:cs="Arial"/>
+                <w:spacing w:val="-10"/>
+              </w:rPr>
+              <w:t>}</w:t>
             </w:r>
           </w:p>
         </w:tc>
@@ -4214,6 +7721,7 @@
               </w:rPr>
               <w:t>${</w:t>
             </w:r>
+            <w:proofErr w:type="spellStart"/>
             <w:r>
               <w:rPr>
                 <w:rFonts w:asciiTheme="minorBidi" w:hAnsiTheme="minorBidi"/>
@@ -4224,7 +7732,14 @@
               <w:rPr>
                 <w:rFonts w:asciiTheme="minorBidi" w:hAnsiTheme="minorBidi"/>
               </w:rPr>
-              <w:t>_name}</w:t>
+              <w:t>_name</w:t>
+            </w:r>
+            <w:proofErr w:type="spellEnd"/>
+            <w:r>
+              <w:rPr>
+                <w:rFonts w:asciiTheme="minorBidi" w:hAnsiTheme="minorBidi"/>
+              </w:rPr>
+              <w:t>}</w:t>
             </w:r>
             <w:r>
               <w:rPr>
@@ -4252,6 +7767,7 @@
               </w:rPr>
               <w:t>${</w:t>
             </w:r>
+            <w:proofErr w:type="spellStart"/>
             <w:r>
               <w:rPr>
                 <w:rFonts w:asciiTheme="minorBidi" w:hAnsiTheme="minorBidi"/>
@@ -4262,7 +7778,14 @@
               <w:rPr>
                 <w:rFonts w:asciiTheme="minorBidi" w:hAnsiTheme="minorBidi"/>
               </w:rPr>
-              <w:t>_institution}</w:t>
+              <w:t>_institution</w:t>
+            </w:r>
+            <w:proofErr w:type="spellEnd"/>
+            <w:r>
+              <w:rPr>
+                <w:rFonts w:asciiTheme="minorBidi" w:hAnsiTheme="minorBidi"/>
+              </w:rPr>
+              <w:t>}</w:t>
             </w:r>
           </w:p>
         </w:tc>
@@ -4299,6 +7822,7 @@
           <w:bCs/>
         </w:rPr>
       </w:pPr>
+      <w:proofErr w:type="spellStart"/>
       <w:r>
         <w:rPr>
           <w:rFonts w:asciiTheme="minorBidi" w:hAnsiTheme="minorBidi"/>
@@ -4315,6 +7839,7 @@
         </w:rPr>
         <w:t>eserta</w:t>
       </w:r>
+      <w:proofErr w:type="spellEnd"/>
     </w:p>
     <w:tbl>
       <w:tblPr>
@@ -4414,6 +7939,7 @@
                 <w:color w:val="000000"/>
               </w:rPr>
             </w:pPr>
+            <w:proofErr w:type="spellStart"/>
             <w:r>
               <w:rPr>
                 <w:rFonts w:asciiTheme="minorBidi" w:hAnsiTheme="minorBidi"/>
@@ -4422,6 +7948,7 @@
               </w:rPr>
               <w:t>Jabatan</w:t>
             </w:r>
+            <w:proofErr w:type="spellEnd"/>
           </w:p>
         </w:tc>
       </w:tr>
@@ -4450,7 +7977,21 @@
               <w:rPr>
                 <w:spacing w:val="-10"/>
               </w:rPr>
-              <w:t>${participant_no}</w:t>
+              <w:t>${</w:t>
+            </w:r>
+            <w:proofErr w:type="spellStart"/>
+            <w:r>
+              <w:rPr>
+                <w:spacing w:val="-10"/>
+              </w:rPr>
+              <w:t>participant_no</w:t>
+            </w:r>
+            <w:proofErr w:type="spellEnd"/>
+            <w:r>
+              <w:rPr>
+                <w:spacing w:val="-10"/>
+              </w:rPr>
+              <w:t>}</w:t>
             </w:r>
           </w:p>
         </w:tc>
@@ -4473,7 +8014,23 @@
                 <w:rFonts w:asciiTheme="minorBidi" w:hAnsiTheme="minorBidi"/>
                 <w:color w:val="000000"/>
               </w:rPr>
-              <w:t>${participant_name}</w:t>
+              <w:t>${</w:t>
+            </w:r>
+            <w:proofErr w:type="spellStart"/>
+            <w:r>
+              <w:rPr>
+                <w:rFonts w:asciiTheme="minorBidi" w:hAnsiTheme="minorBidi"/>
+                <w:color w:val="000000"/>
+              </w:rPr>
+              <w:t>participant_name</w:t>
+            </w:r>
+            <w:proofErr w:type="spellEnd"/>
+            <w:r>
+              <w:rPr>
+                <w:rFonts w:asciiTheme="minorBidi" w:hAnsiTheme="minorBidi"/>
+                <w:color w:val="000000"/>
+              </w:rPr>
+              <w:t>}</w:t>
             </w:r>
           </w:p>
         </w:tc>
@@ -4495,7 +8052,23 @@
                 <w:rFonts w:asciiTheme="minorBidi" w:hAnsiTheme="minorBidi"/>
                 <w:color w:val="000000"/>
               </w:rPr>
-              <w:t>${participant_institution}</w:t>
+              <w:t>${</w:t>
+            </w:r>
+            <w:proofErr w:type="spellStart"/>
+            <w:r>
+              <w:rPr>
+                <w:rFonts w:asciiTheme="minorBidi" w:hAnsiTheme="minorBidi"/>
+                <w:color w:val="000000"/>
+              </w:rPr>
+              <w:t>participant_institution</w:t>
+            </w:r>
+            <w:proofErr w:type="spellEnd"/>
+            <w:r>
+              <w:rPr>
+                <w:rFonts w:asciiTheme="minorBidi" w:hAnsiTheme="minorBidi"/>
+                <w:color w:val="000000"/>
+              </w:rPr>
+              <w:t>}</w:t>
             </w:r>
           </w:p>
         </w:tc>
@@ -4545,8 +8118,18 @@
           <w:b/>
           <w:bCs/>
         </w:rPr>
-        <w:t>Waktu dan Tempat</w:t>
-      </w:r>
+        <w:t xml:space="preserve">Waktu dan </w:t>
+      </w:r>
+      <w:proofErr w:type="spellStart"/>
+      <w:r>
+        <w:rPr>
+          <w:rFonts w:asciiTheme="minorBidi" w:hAnsiTheme="minorBidi"/>
+          <w:b/>
+          <w:bCs/>
+        </w:rPr>
+        <w:t>Tempat</w:t>
+      </w:r>
+      <w:proofErr w:type="spellEnd"/>
     </w:p>
     <w:p>
       <w:pPr>
@@ -4575,7 +8158,21 @@
         <w:rPr>
           <w:rFonts w:asciiTheme="minorBidi" w:hAnsiTheme="minorBidi"/>
         </w:rPr>
-        <w:t xml:space="preserve">{activity_name} </w:t>
+        <w:t>{</w:t>
+      </w:r>
+      <w:proofErr w:type="spellStart"/>
+      <w:r>
+        <w:rPr>
+          <w:rFonts w:asciiTheme="minorBidi" w:hAnsiTheme="minorBidi"/>
+        </w:rPr>
+        <w:t>activity_name</w:t>
+      </w:r>
+      <w:proofErr w:type="spellEnd"/>
+      <w:r>
+        <w:rPr>
+          <w:rFonts w:asciiTheme="minorBidi" w:hAnsiTheme="minorBidi"/>
+        </w:rPr>
+        <w:t xml:space="preserve">} </w:t>
       </w:r>
       <w:r>
         <w:rPr>
@@ -4588,7 +8185,77 @@
         <w:rPr>
           <w:rFonts w:asciiTheme="minorBidi" w:hAnsiTheme="minorBidi"/>
         </w:rPr>
-        <w:t xml:space="preserve"> dilaksanakan pada waktu dan tempat sebagai berikut:</w:t>
+        <w:t xml:space="preserve"> </w:t>
+      </w:r>
+      <w:proofErr w:type="spellStart"/>
+      <w:r>
+        <w:rPr>
+          <w:rFonts w:asciiTheme="minorBidi" w:hAnsiTheme="minorBidi"/>
+        </w:rPr>
+        <w:t>dilaksanakan</w:t>
+      </w:r>
+      <w:proofErr w:type="spellEnd"/>
+      <w:r>
+        <w:rPr>
+          <w:rFonts w:asciiTheme="minorBidi" w:hAnsiTheme="minorBidi"/>
+        </w:rPr>
+        <w:t xml:space="preserve"> pada </w:t>
+      </w:r>
+      <w:proofErr w:type="spellStart"/>
+      <w:r>
+        <w:rPr>
+          <w:rFonts w:asciiTheme="minorBidi" w:hAnsiTheme="minorBidi"/>
+        </w:rPr>
+        <w:t>waktu</w:t>
+      </w:r>
+      <w:proofErr w:type="spellEnd"/>
+      <w:r>
+        <w:rPr>
+          <w:rFonts w:asciiTheme="minorBidi" w:hAnsiTheme="minorBidi"/>
+        </w:rPr>
+        <w:t xml:space="preserve"> dan </w:t>
+      </w:r>
+      <w:proofErr w:type="spellStart"/>
+      <w:r>
+        <w:rPr>
+          <w:rFonts w:asciiTheme="minorBidi" w:hAnsiTheme="minorBidi"/>
+        </w:rPr>
+        <w:t>tempat</w:t>
+      </w:r>
+      <w:proofErr w:type="spellEnd"/>
+      <w:r>
+        <w:rPr>
+          <w:rFonts w:asciiTheme="minorBidi" w:hAnsiTheme="minorBidi"/>
+        </w:rPr>
+        <w:t xml:space="preserve"> </w:t>
+      </w:r>
+      <w:proofErr w:type="spellStart"/>
+      <w:r>
+        <w:rPr>
+          <w:rFonts w:asciiTheme="minorBidi" w:hAnsiTheme="minorBidi"/>
+        </w:rPr>
+        <w:t>sebagai</w:t>
+      </w:r>
+      <w:proofErr w:type="spellEnd"/>
+      <w:r>
+        <w:rPr>
+          <w:rFonts w:asciiTheme="minorBidi" w:hAnsiTheme="minorBidi"/>
+        </w:rPr>
+        <w:t xml:space="preserve"> </w:t>
+      </w:r>
+      <w:proofErr w:type="spellStart"/>
+      <w:r>
+        <w:rPr>
+          <w:rFonts w:asciiTheme="minorBidi" w:hAnsiTheme="minorBidi"/>
+        </w:rPr>
+        <w:t>berikut</w:t>
+      </w:r>
+      <w:proofErr w:type="spellEnd"/>
+      <w:r>
+        <w:rPr>
+          <w:rFonts w:asciiTheme="minorBidi" w:hAnsiTheme="minorBidi"/>
+        </w:rPr>
+        <w:t>:</w:t>
       </w:r>
     </w:p>
     <w:p>
@@ -4627,7 +8294,21 @@
         <w:rPr>
           <w:rFonts w:asciiTheme="minorBidi" w:hAnsiTheme="minorBidi"/>
         </w:rPr>
-        <w:t>${activity_dates}</w:t>
+        <w:t>${</w:t>
+      </w:r>
+      <w:proofErr w:type="spellStart"/>
+      <w:r>
+        <w:rPr>
+          <w:rFonts w:asciiTheme="minorBidi" w:hAnsiTheme="minorBidi"/>
+        </w:rPr>
+        <w:t>activity_dates</w:t>
+      </w:r>
+      <w:proofErr w:type="spellEnd"/>
+      <w:r>
+        <w:rPr>
+          <w:rFonts w:asciiTheme="minorBidi" w:hAnsiTheme="minorBidi"/>
+        </w:rPr>
+        <w:t>}</w:t>
       </w:r>
     </w:p>
     <w:p>
@@ -4643,12 +8324,14 @@
           <w:rFonts w:asciiTheme="minorBidi" w:hAnsiTheme="minorBidi"/>
         </w:rPr>
       </w:pPr>
+      <w:proofErr w:type="spellStart"/>
       <w:r>
         <w:rPr>
           <w:rFonts w:asciiTheme="minorBidi" w:hAnsiTheme="minorBidi"/>
         </w:rPr>
         <w:t>Tempat</w:t>
       </w:r>
+      <w:proofErr w:type="spellEnd"/>
       <w:r>
         <w:rPr>
           <w:rFonts w:asciiTheme="minorBidi" w:hAnsiTheme="minorBidi"/>
@@ -4667,7 +8350,21 @@
         <w:rPr>
           <w:rFonts w:asciiTheme="minorBidi" w:hAnsiTheme="minorBidi"/>
         </w:rPr>
-        <w:t>${activity_location}</w:t>
+        <w:t>${</w:t>
+      </w:r>
+      <w:proofErr w:type="spellStart"/>
+      <w:r>
+        <w:rPr>
+          <w:rFonts w:asciiTheme="minorBidi" w:hAnsiTheme="minorBidi"/>
+        </w:rPr>
+        <w:t>activity_location</w:t>
+      </w:r>
+      <w:proofErr w:type="spellEnd"/>
+      <w:r>
+        <w:rPr>
+          <w:rFonts w:asciiTheme="minorBidi" w:hAnsiTheme="minorBidi"/>
+        </w:rPr>
+        <w:t>}</w:t>
       </w:r>
       <w:r>
         <w:rPr>
@@ -4726,7 +8423,21 @@
         <w:rPr>
           <w:rFonts w:asciiTheme="minorBidi" w:hAnsiTheme="minorBidi"/>
         </w:rPr>
-        <w:t>${speaker_material}</w:t>
+        <w:t>${</w:t>
+      </w:r>
+      <w:proofErr w:type="spellStart"/>
+      <w:r>
+        <w:rPr>
+          <w:rFonts w:asciiTheme="minorBidi" w:hAnsiTheme="minorBidi"/>
+        </w:rPr>
+        <w:t>speaker_material</w:t>
+      </w:r>
+      <w:proofErr w:type="spellEnd"/>
+      <w:r>
+        <w:rPr>
+          <w:rFonts w:asciiTheme="minorBidi" w:hAnsiTheme="minorBidi"/>
+        </w:rPr>
+        <w:t>}</w:t>
       </w:r>
     </w:p>
     <w:p>
@@ -4756,6 +8467,7 @@
           <w:bCs/>
         </w:rPr>
       </w:pPr>
+      <w:proofErr w:type="spellStart"/>
       <w:r>
         <w:rPr>
           <w:rFonts w:asciiTheme="minorBidi" w:hAnsiTheme="minorBidi"/>
@@ -4764,6 +8476,7 @@
         </w:rPr>
         <w:t>Biaya</w:t>
       </w:r>
+      <w:proofErr w:type="spellEnd"/>
     </w:p>
     <w:p>
       <w:pPr>
@@ -4773,11 +8486,19 @@
           <w:rFonts w:asciiTheme="minorBidi" w:hAnsiTheme="minorBidi"/>
         </w:rPr>
       </w:pPr>
-      <w:r>
-        <w:rPr>
-          <w:rFonts w:asciiTheme="minorBidi" w:hAnsiTheme="minorBidi"/>
-        </w:rPr>
-        <w:t>Rencana:</w:t>
+      <w:proofErr w:type="spellStart"/>
+      <w:r>
+        <w:rPr>
+          <w:rFonts w:asciiTheme="minorBidi" w:hAnsiTheme="minorBidi"/>
+        </w:rPr>
+        <w:t>Rencana</w:t>
+      </w:r>
+      <w:proofErr w:type="spellEnd"/>
+      <w:r>
+        <w:rPr>
+          <w:rFonts w:asciiTheme="minorBidi" w:hAnsiTheme="minorBidi"/>
+        </w:rPr>
+        <w:t>:</w:t>
       </w:r>
     </w:p>
     <w:tbl>
@@ -5215,6 +8936,7 @@
           <w:bCs/>
         </w:rPr>
       </w:pPr>
+      <w:proofErr w:type="spellStart"/>
       <w:r>
         <w:rPr>
           <w:rFonts w:asciiTheme="minorBidi" w:hAnsiTheme="minorBidi"/>
@@ -5223,6 +8945,7 @@
         </w:rPr>
         <w:t>Realisasi</w:t>
       </w:r>
+      <w:proofErr w:type="spellEnd"/>
     </w:p>
     <w:tbl>
       <w:tblPr>
@@ -5725,7 +9448,25 @@
           <w:bCs/>
         </w:rPr>
         <w:lastRenderedPageBreak/>
-        <w:t>BAB III ; HASIL YANG DICAPAI</w:t>
+        <w:t xml:space="preserve">BAB </w:t>
+      </w:r>
+      <w:proofErr w:type="gramStart"/>
+      <w:r>
+        <w:rPr>
+          <w:rFonts w:asciiTheme="minorBidi" w:hAnsiTheme="minorBidi"/>
+          <w:b/>
+          <w:bCs/>
+        </w:rPr>
+        <w:t>III ;</w:t>
+      </w:r>
+      <w:proofErr w:type="gramEnd"/>
+      <w:r>
+        <w:rPr>
+          <w:rFonts w:asciiTheme="minorBidi" w:hAnsiTheme="minorBidi"/>
+          <w:b/>
+          <w:bCs/>
+        </w:rPr>
+        <w:t xml:space="preserve"> HASIL YANG DICAPAI</w:t>
       </w:r>
     </w:p>
     <w:p>
@@ -5756,14 +9497,34 @@
           <w:bCs/>
         </w:rPr>
       </w:pPr>
+      <w:proofErr w:type="spellStart"/>
       <w:r>
         <w:rPr>
           <w:rFonts w:asciiTheme="minorBidi" w:hAnsiTheme="minorBidi"/>
           <w:b/>
           <w:bCs/>
         </w:rPr>
-        <w:t>Uraian Kegiatan</w:t>
-      </w:r>
+        <w:t>Uraian</w:t>
+      </w:r>
+      <w:proofErr w:type="spellEnd"/>
+      <w:r>
+        <w:rPr>
+          <w:rFonts w:asciiTheme="minorBidi" w:hAnsiTheme="minorBidi"/>
+          <w:b/>
+          <w:bCs/>
+        </w:rPr>
+        <w:t xml:space="preserve"> </w:t>
+      </w:r>
+      <w:proofErr w:type="spellStart"/>
+      <w:r>
+        <w:rPr>
+          <w:rFonts w:asciiTheme="minorBidi" w:hAnsiTheme="minorBidi"/>
+          <w:b/>
+          <w:bCs/>
+        </w:rPr>
+        <w:t>Kegiatan</w:t>
+      </w:r>
+      <w:proofErr w:type="spellEnd"/>
     </w:p>
     <w:p>
       <w:pPr>
@@ -5898,7 +9659,25 @@
           <w:bCs/>
         </w:rPr>
         <w:lastRenderedPageBreak/>
-        <w:t>BAB IV : PENUTUP</w:t>
+        <w:t xml:space="preserve">BAB </w:t>
+      </w:r>
+      <w:proofErr w:type="gramStart"/>
+      <w:r>
+        <w:rPr>
+          <w:rFonts w:asciiTheme="minorBidi" w:hAnsiTheme="minorBidi"/>
+          <w:b/>
+          <w:bCs/>
+        </w:rPr>
+        <w:t>IV :</w:t>
+      </w:r>
+      <w:proofErr w:type="gramEnd"/>
+      <w:r>
+        <w:rPr>
+          <w:rFonts w:asciiTheme="minorBidi" w:hAnsiTheme="minorBidi"/>
+          <w:b/>
+          <w:bCs/>
+        </w:rPr>
+        <w:t xml:space="preserve"> PENUTUP</w:t>
       </w:r>
     </w:p>
     <w:p>
@@ -5929,6 +9708,7 @@
           <w:bCs/>
         </w:rPr>
       </w:pPr>
+      <w:proofErr w:type="spellStart"/>
       <w:r>
         <w:rPr>
           <w:rFonts w:asciiTheme="minorBidi" w:hAnsiTheme="minorBidi"/>
@@ -5937,6 +9717,7 @@
         </w:rPr>
         <w:t>Simpulan</w:t>
       </w:r>
+      <w:proofErr w:type="spellEnd"/>
     </w:p>
     <w:p>
       <w:pPr>
@@ -6060,11 +9841,19 @@
               </w:rPr>
               <w:t>${</w:t>
             </w:r>
+            <w:proofErr w:type="spellStart"/>
             <w:r>
               <w:rPr>
                 <w:sz w:val="20"/>
               </w:rPr>
-              <w:t>signed_barcode}</w:t>
+              <w:t>signed_barcode</w:t>
+            </w:r>
+            <w:proofErr w:type="spellEnd"/>
+            <w:r>
+              <w:rPr>
+                <w:sz w:val="20"/>
+              </w:rPr>
+              <w:t>}</w:t>
             </w:r>
           </w:p>
         </w:tc>
@@ -6086,7 +9875,48 @@
                 <w:rFonts w:ascii="Arial MT" w:hAnsi="Arial MT"/>
                 <w:sz w:val="18"/>
               </w:rPr>
-              <w:t>${signed_location},${signed_date}</w:t>
+              <w:t>${</w:t>
+            </w:r>
+            <w:proofErr w:type="spellStart"/>
+            <w:r>
+              <w:rPr>
+                <w:rFonts w:ascii="Arial MT" w:hAnsi="Arial MT"/>
+                <w:sz w:val="18"/>
+              </w:rPr>
+              <w:t>signed_location</w:t>
+            </w:r>
+            <w:proofErr w:type="spellEnd"/>
+            <w:proofErr w:type="gramStart"/>
+            <w:r>
+              <w:rPr>
+                <w:rFonts w:ascii="Arial MT" w:hAnsi="Arial MT"/>
+                <w:sz w:val="18"/>
+              </w:rPr>
+              <w:t>},$</w:t>
+            </w:r>
+            <w:proofErr w:type="gramEnd"/>
+            <w:r>
+              <w:rPr>
+                <w:rFonts w:ascii="Arial MT" w:hAnsi="Arial MT"/>
+                <w:sz w:val="18"/>
+              </w:rPr>
+              <w:t>{</w:t>
+            </w:r>
+            <w:proofErr w:type="spellStart"/>
+            <w:r>
+              <w:rPr>
+                <w:rFonts w:ascii="Arial MT" w:hAnsi="Arial MT"/>
+                <w:sz w:val="18"/>
+              </w:rPr>
+              <w:t>signed_date</w:t>
+            </w:r>
+            <w:proofErr w:type="spellEnd"/>
+            <w:r>
+              <w:rPr>
+                <w:rFonts w:ascii="Arial MT" w:hAnsi="Arial MT"/>
+                <w:sz w:val="18"/>
+              </w:rPr>
+              <w:t>}</w:t>
             </w:r>
           </w:p>
         </w:tc>
@@ -6127,7 +9957,25 @@
                 <w:sz w:val="18"/>
                 <w:szCs w:val="18"/>
               </w:rPr>
-              <w:t>${signer_position}</w:t>
+              <w:t>${</w:t>
+            </w:r>
+            <w:proofErr w:type="spellStart"/>
+            <w:r>
+              <w:rPr>
+                <w:rFonts w:ascii="Arial MT" w:hAnsi="Arial MT"/>
+                <w:sz w:val="18"/>
+                <w:szCs w:val="18"/>
+              </w:rPr>
+              <w:t>signer_position</w:t>
+            </w:r>
+            <w:proofErr w:type="spellEnd"/>
+            <w:r>
+              <w:rPr>
+                <w:rFonts w:ascii="Arial MT" w:hAnsi="Arial MT"/>
+                <w:sz w:val="18"/>
+                <w:szCs w:val="18"/>
+              </w:rPr>
+              <w:t>}</w:t>
             </w:r>
           </w:p>
         </w:tc>
@@ -6166,7 +10014,23 @@
                 <w:rFonts w:ascii="Arial MT" w:hAnsi="Arial MT"/>
                 <w:sz w:val="18"/>
               </w:rPr>
-              <w:t>${signer_name}</w:t>
+              <w:t>${</w:t>
+            </w:r>
+            <w:proofErr w:type="spellStart"/>
+            <w:r>
+              <w:rPr>
+                <w:rFonts w:ascii="Arial MT" w:hAnsi="Arial MT"/>
+                <w:sz w:val="18"/>
+              </w:rPr>
+              <w:t>signer_name</w:t>
+            </w:r>
+            <w:proofErr w:type="spellEnd"/>
+            <w:r>
+              <w:rPr>
+                <w:rFonts w:ascii="Arial MT" w:hAnsi="Arial MT"/>
+                <w:sz w:val="18"/>
+              </w:rPr>
+              <w:t>}</w:t>
             </w:r>
           </w:p>
         </w:tc>
@@ -6204,7 +10068,23 @@
                 <w:spacing w:val="-2"/>
                 <w:sz w:val="18"/>
               </w:rPr>
-              <w:t>${signed_status}</w:t>
+              <w:t>${</w:t>
+            </w:r>
+            <w:proofErr w:type="spellStart"/>
+            <w:r>
+              <w:rPr>
+                <w:spacing w:val="-2"/>
+                <w:sz w:val="18"/>
+              </w:rPr>
+              <w:t>signed_status</w:t>
+            </w:r>
+            <w:proofErr w:type="spellEnd"/>
+            <w:r>
+              <w:rPr>
+                <w:spacing w:val="-2"/>
+                <w:sz w:val="18"/>
+              </w:rPr>
+              <w:t>}</w:t>
             </w:r>
           </w:p>
         </w:tc>

</xml_diff>